<commit_message>
modificaciones a la documentación. Se agrega: alianza, objetivos y matriz de hab.
</commit_message>
<xml_diff>
--- a/doc/Interprete Smart Home.docx
+++ b/doc/Interprete Smart Home.docx
@@ -443,6 +443,883 @@
           <w:noProof/>
         </w:rPr>
       </w:pPr>
+      <w:r>
+        <w:rPr>
+          <w:noProof/>
+        </w:rPr>
+        <w:lastRenderedPageBreak/>
+        <w:t>Alianza.</w:t>
+      </w:r>
+    </w:p>
+    <w:p>
+      <w:pPr>
+        <w:jc w:val="both"/>
+        <w:rPr>
+          <w:noProof/>
+        </w:rPr>
+      </w:pPr>
+      <w:r>
+        <w:rPr>
+          <w:noProof/>
+        </w:rPr>
+        <w:t>Somos los “Semanticos”, un grupo de estudiante</w:t>
+      </w:r>
+      <w:r>
+        <w:rPr>
+          <w:noProof/>
+        </w:rPr>
+        <w:t>s</w:t>
+      </w:r>
+      <w:r>
+        <w:rPr>
+          <w:noProof/>
+        </w:rPr>
+        <w:t xml:space="preserve"> de la carrera Ingeniera en Sistemas de Información perteneciente a la Universidad Tecnologica Nacional, en su </w:t>
+      </w:r>
+      <w:r>
+        <w:rPr>
+          <w:noProof/>
+        </w:rPr>
+        <w:t>r</w:t>
+      </w:r>
+      <w:r>
+        <w:rPr>
+          <w:noProof/>
+        </w:rPr>
+        <w:t>egional Resistencia. Nuestro objetivo es, no solamente aprobar la materia</w:t>
+      </w:r>
+      <w:r>
+        <w:rPr>
+          <w:noProof/>
+        </w:rPr>
+        <w:t xml:space="preserve"> (como objetivo grupal)</w:t>
+      </w:r>
+      <w:r>
+        <w:rPr>
+          <w:noProof/>
+        </w:rPr>
+        <w:t xml:space="preserve">, si no también entender la lógica y el funcionamiento detrás de un analizador Léxico-Sintactico. Como ingenieros, nos destaca el saber hasta el más </w:t>
+      </w:r>
+      <w:r>
+        <w:rPr>
+          <w:noProof/>
+        </w:rPr>
+        <w:t>minimo</w:t>
+      </w:r>
+      <w:r>
+        <w:rPr>
+          <w:noProof/>
+        </w:rPr>
+        <w:t xml:space="preserve"> detalle detrás de las herramientas que utilizamos a diario, </w:t>
+      </w:r>
+      <w:r>
+        <w:rPr>
+          <w:noProof/>
+        </w:rPr>
+        <w:t>así como</w:t>
+      </w:r>
+      <w:r>
+        <w:rPr>
+          <w:noProof/>
+        </w:rPr>
+        <w:t xml:space="preserve"> también la lógica y reglas por la cuales se rigen.</w:t>
+      </w:r>
+      <w:r>
+        <w:rPr>
+          <w:noProof/>
+        </w:rPr>
+        <w:t xml:space="preserve"> </w:t>
+      </w:r>
+      <w:r>
+        <w:rPr>
+          <w:noProof/>
+        </w:rPr>
+        <w:t xml:space="preserve">Vamos a trabajar por fuera de la facultad, ya que </w:t>
+      </w:r>
+      <w:r>
+        <w:rPr>
+          <w:noProof/>
+        </w:rPr>
+        <w:t>los integrantes de nuestro equipo tenemos distintas actividades que nos dificultan la presencialidad y coordinar un horario de trabajo</w:t>
+      </w:r>
+      <w:r>
+        <w:rPr>
+          <w:noProof/>
+        </w:rPr>
+        <w:t xml:space="preserve">. Nos apoyamos de Git Hub para la colaboración de codigo, un grupo de WhatsApp donde compartimos novedades y avances del proyecto, así como la plataforma </w:t>
+      </w:r>
+      <w:r>
+        <w:rPr>
+          <w:noProof/>
+        </w:rPr>
+        <w:t>D</w:t>
+      </w:r>
+      <w:r>
+        <w:rPr>
+          <w:noProof/>
+        </w:rPr>
+        <w:t>iscord para reunirnos.</w:t>
+      </w:r>
+      <w:r>
+        <w:rPr>
+          <w:noProof/>
+        </w:rPr>
+        <w:t xml:space="preserve"> </w:t>
+      </w:r>
+      <w:r>
+        <w:rPr>
+          <w:noProof/>
+        </w:rPr>
+        <w:t xml:space="preserve">Nos comprotemos a </w:t>
+      </w:r>
+      <w:r>
+        <w:rPr>
+          <w:noProof/>
+        </w:rPr>
+        <w:t>realizar las entregas en tiempo y forma</w:t>
+      </w:r>
+      <w:r>
+        <w:rPr>
+          <w:noProof/>
+        </w:rPr>
+        <w:t>, teniendo la mejor calidad y cumpliendo los estandares deseados tanto por</w:t>
+      </w:r>
+      <w:r>
+        <w:rPr>
+          <w:noProof/>
+        </w:rPr>
+        <w:t xml:space="preserve"> </w:t>
+      </w:r>
+      <w:r>
+        <w:rPr>
+          <w:noProof/>
+        </w:rPr>
+        <w:t>la catedra como para nosotros mismos.</w:t>
+      </w:r>
+    </w:p>
+    <w:p>
+      <w:pPr>
+        <w:jc w:val="both"/>
+        <w:rPr>
+          <w:noProof/>
+        </w:rPr>
+      </w:pPr>
+      <w:r>
+        <w:rPr>
+          <w:noProof/>
+        </w:rPr>
+        <w:t>Matriz de habilidades</w:t>
+      </w:r>
+      <w:r>
+        <w:rPr>
+          <w:noProof/>
+        </w:rPr>
+        <w:t>.</w:t>
+      </w:r>
+    </w:p>
+    <w:p>
+      <w:pPr>
+        <w:jc w:val="both"/>
+        <w:rPr>
+          <w:noProof/>
+        </w:rPr>
+      </w:pPr>
+    </w:p>
+    <w:tbl>
+      <w:tblPr>
+        <w:tblStyle w:val="Tablaconcuadrcula"/>
+        <w:tblW w:w="9300" w:type="dxa"/>
+        <w:tblLook w:val="04A0" w:firstRow="1" w:lastRow="0" w:firstColumn="1" w:lastColumn="0" w:noHBand="0" w:noVBand="1"/>
+      </w:tblPr>
+      <w:tblGrid>
+        <w:gridCol w:w="1469"/>
+        <w:gridCol w:w="833"/>
+        <w:gridCol w:w="1659"/>
+        <w:gridCol w:w="1888"/>
+        <w:gridCol w:w="1409"/>
+        <w:gridCol w:w="990"/>
+        <w:gridCol w:w="1468"/>
+      </w:tblGrid>
+      <w:tr>
+        <w:trPr>
+          <w:trHeight w:val="1199"/>
+        </w:trPr>
+        <w:tc>
+          <w:tcPr>
+            <w:tcW w:w="1405" w:type="dxa"/>
+          </w:tcPr>
+          <w:p>
+            <w:pPr>
+              <w:jc w:val="both"/>
+              <w:rPr>
+                <w:noProof/>
+              </w:rPr>
+            </w:pPr>
+            <w:r>
+              <w:rPr>
+                <w:noProof/>
+              </w:rPr>
+              <w:t>Integrante</w:t>
+            </w:r>
+          </w:p>
+        </w:tc>
+        <w:tc>
+          <w:tcPr>
+            <w:tcW w:w="811" w:type="dxa"/>
+          </w:tcPr>
+          <w:p>
+            <w:pPr>
+              <w:jc w:val="both"/>
+              <w:rPr>
+                <w:noProof/>
+              </w:rPr>
+            </w:pPr>
+            <w:r>
+              <w:rPr>
+                <w:noProof/>
+              </w:rPr>
+              <w:t>Ingles</w:t>
+            </w:r>
+          </w:p>
+        </w:tc>
+        <w:tc>
+          <w:tcPr>
+            <w:tcW w:w="1583" w:type="dxa"/>
+          </w:tcPr>
+          <w:p>
+            <w:pPr>
+              <w:jc w:val="both"/>
+              <w:rPr>
+                <w:noProof/>
+              </w:rPr>
+            </w:pPr>
+            <w:r>
+              <w:rPr>
+                <w:noProof/>
+              </w:rPr>
+              <w:t>Programacion</w:t>
+            </w:r>
+          </w:p>
+        </w:tc>
+        <w:tc>
+          <w:tcPr>
+            <w:tcW w:w="1797" w:type="dxa"/>
+          </w:tcPr>
+          <w:p>
+            <w:pPr>
+              <w:jc w:val="both"/>
+              <w:rPr>
+                <w:noProof/>
+              </w:rPr>
+            </w:pPr>
+            <w:r>
+              <w:rPr>
+                <w:noProof/>
+              </w:rPr>
+              <w:t>Documentacion</w:t>
+            </w:r>
+          </w:p>
+        </w:tc>
+        <w:tc>
+          <w:tcPr>
+            <w:tcW w:w="1350" w:type="dxa"/>
+          </w:tcPr>
+          <w:p>
+            <w:pPr>
+              <w:jc w:val="both"/>
+              <w:rPr>
+                <w:noProof/>
+              </w:rPr>
+            </w:pPr>
+            <w:r>
+              <w:rPr>
+                <w:noProof/>
+              </w:rPr>
+              <w:t>Creatividad</w:t>
+            </w:r>
+          </w:p>
+        </w:tc>
+        <w:tc>
+          <w:tcPr>
+            <w:tcW w:w="949" w:type="dxa"/>
+          </w:tcPr>
+          <w:p>
+            <w:pPr>
+              <w:jc w:val="both"/>
+              <w:rPr>
+                <w:noProof/>
+              </w:rPr>
+            </w:pPr>
+            <w:r>
+              <w:rPr>
+                <w:noProof/>
+              </w:rPr>
+              <w:t>Edición</w:t>
+            </w:r>
+            <w:r>
+              <w:rPr>
+                <w:noProof/>
+              </w:rPr>
+              <w:t xml:space="preserve"> de video</w:t>
+            </w:r>
+            <w:r>
+              <w:rPr>
+                <w:noProof/>
+              </w:rPr>
+              <w:t>.</w:t>
+            </w:r>
+          </w:p>
+        </w:tc>
+        <w:tc>
+          <w:tcPr>
+            <w:tcW w:w="1405" w:type="dxa"/>
+          </w:tcPr>
+          <w:p>
+            <w:pPr>
+              <w:jc w:val="both"/>
+              <w:rPr>
+                <w:noProof/>
+              </w:rPr>
+            </w:pPr>
+            <w:r>
+              <w:rPr>
+                <w:noProof/>
+              </w:rPr>
+              <w:t>Busqueda</w:t>
+            </w:r>
+            <w:r>
+              <w:rPr>
+                <w:noProof/>
+              </w:rPr>
+              <w:t xml:space="preserve"> </w:t>
+            </w:r>
+            <w:r>
+              <w:rPr>
+                <w:noProof/>
+              </w:rPr>
+              <w:t>de información</w:t>
+            </w:r>
+          </w:p>
+        </w:tc>
+      </w:tr>
+      <w:tr>
+        <w:trPr>
+          <w:trHeight w:val="292"/>
+        </w:trPr>
+        <w:tc>
+          <w:tcPr>
+            <w:tcW w:w="1405" w:type="dxa"/>
+          </w:tcPr>
+          <w:p>
+            <w:pPr>
+              <w:jc w:val="both"/>
+              <w:rPr>
+                <w:noProof/>
+              </w:rPr>
+            </w:pPr>
+            <w:r>
+              <w:rPr>
+                <w:noProof/>
+              </w:rPr>
+              <w:t>Francisco</w:t>
+            </w:r>
+          </w:p>
+        </w:tc>
+        <w:tc>
+          <w:tcPr>
+            <w:tcW w:w="811" w:type="dxa"/>
+          </w:tcPr>
+          <w:p>
+            <w:pPr>
+              <w:jc w:val="both"/>
+              <w:rPr>
+                <w:noProof/>
+              </w:rPr>
+            </w:pPr>
+          </w:p>
+        </w:tc>
+        <w:tc>
+          <w:tcPr>
+            <w:tcW w:w="1583" w:type="dxa"/>
+          </w:tcPr>
+          <w:p>
+            <w:pPr>
+              <w:jc w:val="both"/>
+              <w:rPr>
+                <w:noProof/>
+              </w:rPr>
+            </w:pPr>
+          </w:p>
+        </w:tc>
+        <w:tc>
+          <w:tcPr>
+            <w:tcW w:w="1797" w:type="dxa"/>
+          </w:tcPr>
+          <w:p>
+            <w:pPr>
+              <w:jc w:val="both"/>
+              <w:rPr>
+                <w:noProof/>
+              </w:rPr>
+            </w:pPr>
+          </w:p>
+        </w:tc>
+        <w:tc>
+          <w:tcPr>
+            <w:tcW w:w="1350" w:type="dxa"/>
+          </w:tcPr>
+          <w:p>
+            <w:pPr>
+              <w:jc w:val="both"/>
+              <w:rPr>
+                <w:noProof/>
+              </w:rPr>
+            </w:pPr>
+          </w:p>
+        </w:tc>
+        <w:tc>
+          <w:tcPr>
+            <w:tcW w:w="949" w:type="dxa"/>
+          </w:tcPr>
+          <w:p>
+            <w:pPr>
+              <w:jc w:val="both"/>
+              <w:rPr>
+                <w:noProof/>
+              </w:rPr>
+            </w:pPr>
+          </w:p>
+        </w:tc>
+        <w:tc>
+          <w:tcPr>
+            <w:tcW w:w="1405" w:type="dxa"/>
+          </w:tcPr>
+          <w:p>
+            <w:pPr>
+              <w:jc w:val="both"/>
+              <w:rPr>
+                <w:noProof/>
+              </w:rPr>
+            </w:pPr>
+          </w:p>
+        </w:tc>
+      </w:tr>
+      <w:tr>
+        <w:trPr>
+          <w:trHeight w:val="292"/>
+        </w:trPr>
+        <w:tc>
+          <w:tcPr>
+            <w:tcW w:w="1405" w:type="dxa"/>
+          </w:tcPr>
+          <w:p>
+            <w:pPr>
+              <w:jc w:val="both"/>
+              <w:rPr>
+                <w:noProof/>
+              </w:rPr>
+            </w:pPr>
+            <w:r>
+              <w:rPr>
+                <w:noProof/>
+              </w:rPr>
+              <w:t>Nahuel</w:t>
+            </w:r>
+          </w:p>
+        </w:tc>
+        <w:tc>
+          <w:tcPr>
+            <w:tcW w:w="811" w:type="dxa"/>
+          </w:tcPr>
+          <w:p>
+            <w:pPr>
+              <w:jc w:val="both"/>
+              <w:rPr>
+                <w:noProof/>
+              </w:rPr>
+            </w:pPr>
+          </w:p>
+        </w:tc>
+        <w:tc>
+          <w:tcPr>
+            <w:tcW w:w="1583" w:type="dxa"/>
+          </w:tcPr>
+          <w:p>
+            <w:pPr>
+              <w:jc w:val="both"/>
+              <w:rPr>
+                <w:noProof/>
+              </w:rPr>
+            </w:pPr>
+          </w:p>
+        </w:tc>
+        <w:tc>
+          <w:tcPr>
+            <w:tcW w:w="1797" w:type="dxa"/>
+          </w:tcPr>
+          <w:p>
+            <w:pPr>
+              <w:jc w:val="both"/>
+              <w:rPr>
+                <w:noProof/>
+              </w:rPr>
+            </w:pPr>
+          </w:p>
+        </w:tc>
+        <w:tc>
+          <w:tcPr>
+            <w:tcW w:w="1350" w:type="dxa"/>
+          </w:tcPr>
+          <w:p>
+            <w:pPr>
+              <w:jc w:val="both"/>
+              <w:rPr>
+                <w:noProof/>
+              </w:rPr>
+            </w:pPr>
+          </w:p>
+        </w:tc>
+        <w:tc>
+          <w:tcPr>
+            <w:tcW w:w="949" w:type="dxa"/>
+          </w:tcPr>
+          <w:p>
+            <w:pPr>
+              <w:jc w:val="both"/>
+              <w:rPr>
+                <w:noProof/>
+              </w:rPr>
+            </w:pPr>
+          </w:p>
+        </w:tc>
+        <w:tc>
+          <w:tcPr>
+            <w:tcW w:w="1405" w:type="dxa"/>
+          </w:tcPr>
+          <w:p>
+            <w:pPr>
+              <w:jc w:val="both"/>
+              <w:rPr>
+                <w:noProof/>
+              </w:rPr>
+            </w:pPr>
+          </w:p>
+        </w:tc>
+      </w:tr>
+      <w:tr>
+        <w:trPr>
+          <w:trHeight w:val="292"/>
+        </w:trPr>
+        <w:tc>
+          <w:tcPr>
+            <w:tcW w:w="1405" w:type="dxa"/>
+          </w:tcPr>
+          <w:p>
+            <w:pPr>
+              <w:jc w:val="both"/>
+              <w:rPr>
+                <w:noProof/>
+              </w:rPr>
+            </w:pPr>
+            <w:r>
+              <w:rPr>
+                <w:noProof/>
+              </w:rPr>
+              <w:t>Nicolas</w:t>
+            </w:r>
+          </w:p>
+        </w:tc>
+        <w:tc>
+          <w:tcPr>
+            <w:tcW w:w="811" w:type="dxa"/>
+          </w:tcPr>
+          <w:p>
+            <w:pPr>
+              <w:jc w:val="both"/>
+              <w:rPr>
+                <w:noProof/>
+              </w:rPr>
+            </w:pPr>
+          </w:p>
+        </w:tc>
+        <w:tc>
+          <w:tcPr>
+            <w:tcW w:w="1583" w:type="dxa"/>
+          </w:tcPr>
+          <w:p>
+            <w:pPr>
+              <w:jc w:val="both"/>
+              <w:rPr>
+                <w:noProof/>
+              </w:rPr>
+            </w:pPr>
+          </w:p>
+        </w:tc>
+        <w:tc>
+          <w:tcPr>
+            <w:tcW w:w="1797" w:type="dxa"/>
+          </w:tcPr>
+          <w:p>
+            <w:pPr>
+              <w:jc w:val="both"/>
+              <w:rPr>
+                <w:noProof/>
+              </w:rPr>
+            </w:pPr>
+          </w:p>
+        </w:tc>
+        <w:tc>
+          <w:tcPr>
+            <w:tcW w:w="1350" w:type="dxa"/>
+          </w:tcPr>
+          <w:p>
+            <w:pPr>
+              <w:jc w:val="both"/>
+              <w:rPr>
+                <w:noProof/>
+              </w:rPr>
+            </w:pPr>
+          </w:p>
+        </w:tc>
+        <w:tc>
+          <w:tcPr>
+            <w:tcW w:w="949" w:type="dxa"/>
+          </w:tcPr>
+          <w:p>
+            <w:pPr>
+              <w:jc w:val="both"/>
+              <w:rPr>
+                <w:noProof/>
+              </w:rPr>
+            </w:pPr>
+          </w:p>
+        </w:tc>
+        <w:tc>
+          <w:tcPr>
+            <w:tcW w:w="1405" w:type="dxa"/>
+          </w:tcPr>
+          <w:p>
+            <w:pPr>
+              <w:jc w:val="both"/>
+              <w:rPr>
+                <w:noProof/>
+              </w:rPr>
+            </w:pPr>
+          </w:p>
+        </w:tc>
+      </w:tr>
+      <w:tr>
+        <w:trPr>
+          <w:trHeight w:val="599"/>
+        </w:trPr>
+        <w:tc>
+          <w:tcPr>
+            <w:tcW w:w="1405" w:type="dxa"/>
+          </w:tcPr>
+          <w:p>
+            <w:pPr>
+              <w:jc w:val="both"/>
+              <w:rPr>
+                <w:noProof/>
+              </w:rPr>
+            </w:pPr>
+            <w:r>
+              <w:rPr>
+                <w:noProof/>
+              </w:rPr>
+              <w:t>Maximiliano</w:t>
+            </w:r>
+          </w:p>
+        </w:tc>
+        <w:tc>
+          <w:tcPr>
+            <w:tcW w:w="811" w:type="dxa"/>
+          </w:tcPr>
+          <w:p>
+            <w:pPr>
+              <w:jc w:val="both"/>
+              <w:rPr>
+                <w:noProof/>
+              </w:rPr>
+            </w:pPr>
+          </w:p>
+        </w:tc>
+        <w:tc>
+          <w:tcPr>
+            <w:tcW w:w="1583" w:type="dxa"/>
+          </w:tcPr>
+          <w:p>
+            <w:pPr>
+              <w:jc w:val="both"/>
+              <w:rPr>
+                <w:noProof/>
+              </w:rPr>
+            </w:pPr>
+          </w:p>
+        </w:tc>
+        <w:tc>
+          <w:tcPr>
+            <w:tcW w:w="1797" w:type="dxa"/>
+          </w:tcPr>
+          <w:p>
+            <w:pPr>
+              <w:jc w:val="both"/>
+              <w:rPr>
+                <w:noProof/>
+              </w:rPr>
+            </w:pPr>
+          </w:p>
+        </w:tc>
+        <w:tc>
+          <w:tcPr>
+            <w:tcW w:w="1350" w:type="dxa"/>
+          </w:tcPr>
+          <w:p>
+            <w:pPr>
+              <w:jc w:val="both"/>
+              <w:rPr>
+                <w:noProof/>
+              </w:rPr>
+            </w:pPr>
+          </w:p>
+        </w:tc>
+        <w:tc>
+          <w:tcPr>
+            <w:tcW w:w="949" w:type="dxa"/>
+          </w:tcPr>
+          <w:p>
+            <w:pPr>
+              <w:jc w:val="both"/>
+              <w:rPr>
+                <w:noProof/>
+              </w:rPr>
+            </w:pPr>
+          </w:p>
+        </w:tc>
+        <w:tc>
+          <w:tcPr>
+            <w:tcW w:w="1405" w:type="dxa"/>
+          </w:tcPr>
+          <w:p>
+            <w:pPr>
+              <w:jc w:val="both"/>
+              <w:rPr>
+                <w:noProof/>
+              </w:rPr>
+            </w:pPr>
+          </w:p>
+        </w:tc>
+      </w:tr>
+      <w:tr>
+        <w:trPr>
+          <w:trHeight w:val="292"/>
+        </w:trPr>
+        <w:tc>
+          <w:tcPr>
+            <w:tcW w:w="1405" w:type="dxa"/>
+          </w:tcPr>
+          <w:p>
+            <w:pPr>
+              <w:jc w:val="both"/>
+              <w:rPr>
+                <w:noProof/>
+              </w:rPr>
+            </w:pPr>
+            <w:r>
+              <w:rPr>
+                <w:noProof/>
+              </w:rPr>
+              <w:t>Oscar</w:t>
+            </w:r>
+          </w:p>
+        </w:tc>
+        <w:tc>
+          <w:tcPr>
+            <w:tcW w:w="811" w:type="dxa"/>
+          </w:tcPr>
+          <w:p>
+            <w:pPr>
+              <w:jc w:val="both"/>
+              <w:rPr>
+                <w:noProof/>
+              </w:rPr>
+            </w:pPr>
+          </w:p>
+        </w:tc>
+        <w:tc>
+          <w:tcPr>
+            <w:tcW w:w="1583" w:type="dxa"/>
+          </w:tcPr>
+          <w:p>
+            <w:pPr>
+              <w:jc w:val="both"/>
+              <w:rPr>
+                <w:noProof/>
+              </w:rPr>
+            </w:pPr>
+          </w:p>
+        </w:tc>
+        <w:tc>
+          <w:tcPr>
+            <w:tcW w:w="1797" w:type="dxa"/>
+          </w:tcPr>
+          <w:p>
+            <w:pPr>
+              <w:jc w:val="both"/>
+              <w:rPr>
+                <w:noProof/>
+              </w:rPr>
+            </w:pPr>
+          </w:p>
+        </w:tc>
+        <w:tc>
+          <w:tcPr>
+            <w:tcW w:w="1350" w:type="dxa"/>
+          </w:tcPr>
+          <w:p>
+            <w:pPr>
+              <w:jc w:val="both"/>
+              <w:rPr>
+                <w:noProof/>
+              </w:rPr>
+            </w:pPr>
+          </w:p>
+        </w:tc>
+        <w:tc>
+          <w:tcPr>
+            <w:tcW w:w="949" w:type="dxa"/>
+          </w:tcPr>
+          <w:p>
+            <w:pPr>
+              <w:jc w:val="both"/>
+              <w:rPr>
+                <w:noProof/>
+              </w:rPr>
+            </w:pPr>
+          </w:p>
+        </w:tc>
+        <w:tc>
+          <w:tcPr>
+            <w:tcW w:w="1405" w:type="dxa"/>
+          </w:tcPr>
+          <w:p>
+            <w:pPr>
+              <w:jc w:val="both"/>
+              <w:rPr>
+                <w:noProof/>
+              </w:rPr>
+            </w:pPr>
+          </w:p>
+        </w:tc>
+      </w:tr>
+    </w:tbl>
+    <w:p>
+      <w:pPr>
+        <w:jc w:val="both"/>
+        <w:rPr>
+          <w:noProof/>
+        </w:rPr>
+      </w:pPr>
     </w:p>
     <w:p>
       <w:pPr>
@@ -541,15 +1418,15 @@
             <w:noProof/>
           </w:rPr>
           <w:drawing>
-            <wp:anchor distT="0" distB="0" distL="114300" distR="114300" simplePos="0" relativeHeight="251658240" behindDoc="0" locked="0" layoutInCell="1" allowOverlap="1" wp14:anchorId="227EFAAC" wp14:editId="25973B0C">
+            <wp:anchor distT="0" distB="0" distL="114300" distR="114300" simplePos="0" relativeHeight="251658240" behindDoc="0" locked="0" layoutInCell="1" allowOverlap="1" wp14:anchorId="227EFAAC" wp14:editId="22709218">
               <wp:simplePos x="0" y="0"/>
               <wp:positionH relativeFrom="column">
-                <wp:posOffset>-1068595</wp:posOffset>
+                <wp:posOffset>-1042035</wp:posOffset>
               </wp:positionH>
               <wp:positionV relativeFrom="page">
-                <wp:align>top</wp:align>
+                <wp:posOffset>-85725</wp:posOffset>
               </wp:positionV>
-              <wp:extent cx="2941608" cy="865345"/>
+              <wp:extent cx="2939993" cy="904875"/>
               <wp:effectExtent l="0" t="0" r="0" b="0"/>
               <wp:wrapNone/>
               <wp:docPr id="2119380785" name="Imagen 3"/>
@@ -578,7 +1455,7 @@
                     <pic:spPr>
                       <a:xfrm>
                         <a:off x="0" y="0"/>
-                        <a:ext cx="3011656" cy="885951"/>
+                        <a:ext cx="2939993" cy="904875"/>
                       </a:xfrm>
                       <a:prstGeom prst="rect">
                         <a:avLst/>
@@ -1821,6 +2698,25 @@
     <w:uiPriority w:val="99"/>
     <w:rsid w:val="00221896"/>
   </w:style>
+  <w:style w:type="table" w:styleId="Tablaconcuadrcula">
+    <w:name w:val="Table Grid"/>
+    <w:basedOn w:val="Tablanormal"/>
+    <w:uiPriority w:val="39"/>
+    <w:rsid w:val="008E32EE"/>
+    <w:pPr>
+      <w:spacing w:after="0" w:line="240" w:lineRule="auto"/>
+    </w:pPr>
+    <w:tblPr>
+      <w:tblBorders>
+        <w:top w:val="single" w:sz="4" w:space="0" w:color="auto"/>
+        <w:left w:val="single" w:sz="4" w:space="0" w:color="auto"/>
+        <w:bottom w:val="single" w:sz="4" w:space="0" w:color="auto"/>
+        <w:right w:val="single" w:sz="4" w:space="0" w:color="auto"/>
+        <w:insideH w:val="single" w:sz="4" w:space="0" w:color="auto"/>
+        <w:insideV w:val="single" w:sz="4" w:space="0" w:color="auto"/>
+      </w:tblBorders>
+    </w:tblPr>
+  </w:style>
 </w:styles>
 </file>
 

</xml_diff>

<commit_message>
Se agrega NT, T y gramática a la documentación.
</commit_message>
<xml_diff>
--- a/doc/Interprete Smart Home.docx
+++ b/doc/Interprete Smart Home.docx
@@ -1320,6 +1320,1864 @@
           <w:noProof/>
         </w:rPr>
       </w:pPr>
+    </w:p>
+    <w:p>
+      <w:pPr>
+        <w:pStyle w:val="Ttulo2"/>
+        <w:rPr>
+          <w:lang w:val="es-ES"/>
+        </w:rPr>
+      </w:pPr>
+      <w:r>
+        <w:rPr>
+          <w:lang w:val="es-ES"/>
+        </w:rPr>
+        <w:t>Palabras Reservadas:</w:t>
+      </w:r>
+    </w:p>
+    <w:p>
+      <w:pPr>
+        <w:pStyle w:val="Prrafodelista"/>
+        <w:numPr>
+          <w:ilvl w:val="0"/>
+          <w:numId w:val="3"/>
+        </w:numPr>
+      </w:pPr>
+      <w:r>
+        <w:t xml:space="preserve"> WHEN : Inicia un bloque disparado por evento. </w:t>
+      </w:r>
+    </w:p>
+    <w:p>
+      <w:pPr>
+        <w:pStyle w:val="Prrafodelista"/>
+        <w:numPr>
+          <w:ilvl w:val="0"/>
+          <w:numId w:val="3"/>
+        </w:numPr>
+      </w:pPr>
+      <w:r>
+        <w:t xml:space="preserve"> IF / THEN / ELSE : Estructuras condicionales. </w:t>
+      </w:r>
+    </w:p>
+    <w:p>
+      <w:pPr>
+        <w:pStyle w:val="Prrafodelista"/>
+        <w:numPr>
+          <w:ilvl w:val="0"/>
+          <w:numId w:val="3"/>
+        </w:numPr>
+      </w:pPr>
+      <w:r>
+        <w:t xml:space="preserve"> DO : Delimitador de inicio de acción. </w:t>
+      </w:r>
+    </w:p>
+    <w:p>
+      <w:pPr>
+        <w:pStyle w:val="Prrafodelista"/>
+        <w:numPr>
+          <w:ilvl w:val="0"/>
+          <w:numId w:val="3"/>
+        </w:numPr>
+      </w:pPr>
+      <w:r>
+        <w:t xml:space="preserve"> END : Finalización o cierre de bloque de acción </w:t>
+      </w:r>
+    </w:p>
+    <w:p>
+      <w:pPr>
+        <w:pStyle w:val="Prrafodelista"/>
+        <w:numPr>
+          <w:ilvl w:val="0"/>
+          <w:numId w:val="3"/>
+        </w:numPr>
+        <w:rPr>
+          <w:lang w:val="es-ES"/>
+        </w:rPr>
+      </w:pPr>
+      <w:r>
+        <w:t xml:space="preserve"> EVERY : Define una tarea programada por tiempo. </w:t>
+      </w:r>
+    </w:p>
+    <w:p>
+      <w:pPr>
+        <w:pStyle w:val="Ttulo2"/>
+        <w:rPr>
+          <w:lang w:val="es-ES"/>
+        </w:rPr>
+      </w:pPr>
+      <w:r>
+        <w:rPr>
+          <w:lang w:val="es-ES"/>
+        </w:rPr>
+        <w:t>Identificadores de Sensores, Dispositivos y Atributos</w:t>
+      </w:r>
+      <w:r>
+        <w:rPr>
+          <w:lang w:val="es-ES"/>
+        </w:rPr>
+        <w:t>:</w:t>
+      </w:r>
+    </w:p>
+    <w:p>
+      <w:pPr>
+        <w:pStyle w:val="Ttulo4"/>
+      </w:pPr>
+      <w:r>
+        <w:rPr>
+          <w:b/>
+          <w:bCs/>
+        </w:rPr>
+        <w:t>Sensores</w:t>
+      </w:r>
+      <w:r>
+        <w:t xml:space="preserve"> (Dispositivos de Entrada) </w:t>
+      </w:r>
+    </w:p>
+    <w:p>
+      <w:r>
+        <w:rPr>
+          <w:b/>
+          <w:bCs/>
+        </w:rPr>
+        <w:t xml:space="preserve">sensor_temp </w:t>
+      </w:r>
+      <w:r>
+        <w:t xml:space="preserve">Temperatura </w:t>
+      </w:r>
+      <w:r>
+        <w:rPr>
+          <w:b/>
+          <w:bCs/>
+        </w:rPr>
+        <w:t>°C -10.0 a 50.0</w:t>
+      </w:r>
+      <w:r>
+        <w:t xml:space="preserve"> Temperatura dentro de la casa. </w:t>
+      </w:r>
+    </w:p>
+    <w:p>
+      <w:r>
+        <w:rPr>
+          <w:b/>
+          <w:bCs/>
+        </w:rPr>
+        <w:lastRenderedPageBreak/>
+        <w:t xml:space="preserve">sensor_humedad </w:t>
+      </w:r>
+      <w:r>
+        <w:t xml:space="preserve">Humedad </w:t>
+      </w:r>
+      <w:r>
+        <w:rPr>
+          <w:b/>
+          <w:bCs/>
+        </w:rPr>
+        <w:t>% 0% a 100%</w:t>
+      </w:r>
+      <w:r>
+        <w:t xml:space="preserve"> Nivel de humedad ambiental. </w:t>
+      </w:r>
+    </w:p>
+    <w:p>
+      <w:r>
+        <w:rPr>
+          <w:b/>
+          <w:bCs/>
+        </w:rPr>
+        <w:t xml:space="preserve">sensor_luz </w:t>
+      </w:r>
+      <w:r>
+        <w:t xml:space="preserve">Iluminancia lux </w:t>
+      </w:r>
+      <w:r>
+        <w:rPr>
+          <w:b/>
+          <w:bCs/>
+        </w:rPr>
+        <w:t>0 a 1000</w:t>
+      </w:r>
+      <w:r>
+        <w:t xml:space="preserve"> Nivel de luz. </w:t>
+      </w:r>
+    </w:p>
+    <w:p>
+      <w:r>
+        <w:rPr>
+          <w:b/>
+          <w:bCs/>
+        </w:rPr>
+        <w:t xml:space="preserve">sensor_movimiento </w:t>
+      </w:r>
+      <w:r>
+        <w:t xml:space="preserve">Presencia </w:t>
+      </w:r>
+      <w:r>
+        <w:rPr>
+          <w:b/>
+          <w:bCs/>
+        </w:rPr>
+        <w:t>BOOL TRUE/FALSE</w:t>
+      </w:r>
+      <w:r>
+        <w:t xml:space="preserve"> Detecta si hay alguien en la sala. </w:t>
+      </w:r>
+    </w:p>
+    <w:p>
+      <w:r>
+        <w:rPr>
+          <w:b/>
+          <w:bCs/>
+        </w:rPr>
+        <w:t xml:space="preserve">sensor_humo </w:t>
+      </w:r>
+      <w:r>
+        <w:t xml:space="preserve">Seguridad </w:t>
+      </w:r>
+      <w:r>
+        <w:rPr>
+          <w:b/>
+          <w:bCs/>
+        </w:rPr>
+        <w:t>BOOL TRUE/FALSE</w:t>
+      </w:r>
+      <w:r>
+        <w:t xml:space="preserve"> Detector de incendios</w:t>
+      </w:r>
+    </w:p>
+    <w:p>
+      <w:pPr>
+        <w:pStyle w:val="Ttulo4"/>
+      </w:pPr>
+      <w:r>
+        <w:rPr>
+          <w:b/>
+          <w:bCs/>
+        </w:rPr>
+        <w:t xml:space="preserve">Actuadores </w:t>
+      </w:r>
+      <w:r>
+        <w:t xml:space="preserve">(Dispositivos de Salida) </w:t>
+      </w:r>
+    </w:p>
+    <w:p>
+      <w:r>
+        <w:t>Dispositivos:</w:t>
+      </w:r>
+    </w:p>
+    <w:p>
+      <w:pPr>
+        <w:pStyle w:val="Prrafodelista"/>
+        <w:numPr>
+          <w:ilvl w:val="0"/>
+          <w:numId w:val="3"/>
+        </w:numPr>
+      </w:pPr>
+      <w:r>
+        <w:t>FOCO</w:t>
+      </w:r>
+    </w:p>
+    <w:p>
+      <w:pPr>
+        <w:pStyle w:val="Prrafodelista"/>
+        <w:numPr>
+          <w:ilvl w:val="0"/>
+          <w:numId w:val="3"/>
+        </w:numPr>
+      </w:pPr>
+      <w:r>
+        <w:t>AIRE</w:t>
+      </w:r>
+    </w:p>
+    <w:p>
+      <w:pPr>
+        <w:pStyle w:val="Prrafodelista"/>
+        <w:numPr>
+          <w:ilvl w:val="0"/>
+          <w:numId w:val="3"/>
+        </w:numPr>
+      </w:pPr>
+      <w:r>
+        <w:t>PERSIANA</w:t>
+      </w:r>
+    </w:p>
+    <w:p>
+      <w:pPr>
+        <w:pStyle w:val="Prrafodelista"/>
+        <w:numPr>
+          <w:ilvl w:val="0"/>
+          <w:numId w:val="3"/>
+        </w:numPr>
+      </w:pPr>
+      <w:r>
+        <w:t>CERRADURA</w:t>
+      </w:r>
+    </w:p>
+    <w:p>
+      <w:pPr>
+        <w:pStyle w:val="Prrafodelista"/>
+        <w:numPr>
+          <w:ilvl w:val="0"/>
+          <w:numId w:val="3"/>
+        </w:numPr>
+      </w:pPr>
+      <w:r>
+        <w:t>RELOJS</w:t>
+      </w:r>
+    </w:p>
+    <w:p>
+      <w:pPr>
+        <w:pStyle w:val="Prrafodelista"/>
+        <w:numPr>
+          <w:ilvl w:val="0"/>
+          <w:numId w:val="3"/>
+        </w:numPr>
+      </w:pPr>
+      <w:r>
+        <w:t>ALARMA</w:t>
+      </w:r>
+    </w:p>
+    <w:p>
+      <w:pPr>
+        <w:pStyle w:val="Prrafodelista"/>
+        <w:numPr>
+          <w:ilvl w:val="0"/>
+          <w:numId w:val="3"/>
+        </w:numPr>
+      </w:pPr>
+      <w:r>
+        <w:t>ALTAVOZ</w:t>
+      </w:r>
+    </w:p>
+    <w:tbl>
+      <w:tblPr>
+        <w:tblStyle w:val="Tablaconcuadrcula"/>
+        <w:tblW w:w="9821" w:type="dxa"/>
+        <w:tblInd w:w="-491" w:type="dxa"/>
+        <w:tblLook w:val="04A0" w:firstRow="1" w:lastRow="0" w:firstColumn="1" w:lastColumn="0" w:noHBand="0" w:noVBand="1"/>
+      </w:tblPr>
+      <w:tblGrid>
+        <w:gridCol w:w="1744"/>
+        <w:gridCol w:w="1665"/>
+        <w:gridCol w:w="1632"/>
+        <w:gridCol w:w="2457"/>
+        <w:gridCol w:w="2323"/>
+      </w:tblGrid>
+      <w:tr>
+        <w:trPr>
+          <w:trHeight w:val="985"/>
+        </w:trPr>
+        <w:tc>
+          <w:tcPr>
+            <w:tcW w:w="1744" w:type="dxa"/>
+          </w:tcPr>
+          <w:p>
+            <w:pPr>
+              <w:rPr>
+                <w:highlight w:val="yellow"/>
+              </w:rPr>
+            </w:pPr>
+            <w:r>
+              <w:rPr>
+                <w:b/>
+                <w:bCs/>
+                <w:highlight w:val="yellow"/>
+              </w:rPr>
+              <w:t>Dispositivo</w:t>
+            </w:r>
+          </w:p>
+        </w:tc>
+        <w:tc>
+          <w:tcPr>
+            <w:tcW w:w="1665" w:type="dxa"/>
+          </w:tcPr>
+          <w:p>
+            <w:pPr>
+              <w:rPr>
+                <w:highlight w:val="yellow"/>
+              </w:rPr>
+            </w:pPr>
+            <w:r>
+              <w:rPr>
+                <w:highlight w:val="yellow"/>
+              </w:rPr>
+              <w:t>Atributo</w:t>
+            </w:r>
+          </w:p>
+        </w:tc>
+        <w:tc>
+          <w:tcPr>
+            <w:tcW w:w="1632" w:type="dxa"/>
+          </w:tcPr>
+          <w:p>
+            <w:pPr>
+              <w:rPr>
+                <w:highlight w:val="yellow"/>
+              </w:rPr>
+            </w:pPr>
+            <w:r>
+              <w:rPr>
+                <w:highlight w:val="yellow"/>
+              </w:rPr>
+              <w:t>Tipo de Dato</w:t>
+            </w:r>
+          </w:p>
+        </w:tc>
+        <w:tc>
+          <w:tcPr>
+            <w:tcW w:w="2457" w:type="dxa"/>
+          </w:tcPr>
+          <w:p>
+            <w:pPr>
+              <w:rPr>
+                <w:highlight w:val="yellow"/>
+              </w:rPr>
+            </w:pPr>
+            <w:r>
+              <w:rPr>
+                <w:highlight w:val="yellow"/>
+              </w:rPr>
+              <w:t>Rango / Valores</w:t>
+            </w:r>
+          </w:p>
+        </w:tc>
+        <w:tc>
+          <w:tcPr>
+            <w:tcW w:w="2323" w:type="dxa"/>
+          </w:tcPr>
+          <w:p>
+            <w:pPr>
+              <w:rPr>
+                <w:highlight w:val="yellow"/>
+              </w:rPr>
+            </w:pPr>
+            <w:r>
+              <w:rPr>
+                <w:highlight w:val="yellow"/>
+              </w:rPr>
+              <w:t>Permisos</w:t>
+            </w:r>
+          </w:p>
+        </w:tc>
+      </w:tr>
+      <w:tr>
+        <w:trPr>
+          <w:trHeight w:val="476"/>
+        </w:trPr>
+        <w:tc>
+          <w:tcPr>
+            <w:tcW w:w="1744" w:type="dxa"/>
+          </w:tcPr>
+          <w:p>
+            <w:r>
+              <w:rPr>
+                <w:b/>
+                <w:bCs/>
+              </w:rPr>
+              <w:t>foco_</w:t>
+            </w:r>
+          </w:p>
+        </w:tc>
+        <w:tc>
+          <w:tcPr>
+            <w:tcW w:w="1665" w:type="dxa"/>
+          </w:tcPr>
+          <w:p>
+            <w:r>
+              <w:t>.estado</w:t>
+            </w:r>
+          </w:p>
+        </w:tc>
+        <w:tc>
+          <w:tcPr>
+            <w:tcW w:w="1632" w:type="dxa"/>
+          </w:tcPr>
+          <w:p>
+            <w:r>
+              <w:t>BOOL</w:t>
+            </w:r>
+          </w:p>
+        </w:tc>
+        <w:tc>
+          <w:tcPr>
+            <w:tcW w:w="2457" w:type="dxa"/>
+          </w:tcPr>
+          <w:p>
+            <w:r>
+              <w:t>ON, OFF</w:t>
+            </w:r>
+          </w:p>
+        </w:tc>
+        <w:tc>
+          <w:tcPr>
+            <w:tcW w:w="2323" w:type="dxa"/>
+          </w:tcPr>
+          <w:p>
+            <w:r>
+              <w:t>Lectura/Escritura</w:t>
+            </w:r>
+          </w:p>
+        </w:tc>
+      </w:tr>
+      <w:tr>
+        <w:trPr>
+          <w:trHeight w:val="476"/>
+        </w:trPr>
+        <w:tc>
+          <w:tcPr>
+            <w:tcW w:w="1744" w:type="dxa"/>
+          </w:tcPr>
+          <w:p/>
+        </w:tc>
+        <w:tc>
+          <w:tcPr>
+            <w:tcW w:w="1665" w:type="dxa"/>
+          </w:tcPr>
+          <w:p>
+            <w:r>
+              <w:t>.brillo</w:t>
+            </w:r>
+          </w:p>
+        </w:tc>
+        <w:tc>
+          <w:tcPr>
+            <w:tcW w:w="1632" w:type="dxa"/>
+          </w:tcPr>
+          <w:p>
+            <w:r>
+              <w:t>PERCENT</w:t>
+            </w:r>
+          </w:p>
+        </w:tc>
+        <w:tc>
+          <w:tcPr>
+            <w:tcW w:w="2457" w:type="dxa"/>
+          </w:tcPr>
+          <w:p>
+            <w:r>
+              <w:t>0% a 100%</w:t>
+            </w:r>
+          </w:p>
+        </w:tc>
+        <w:tc>
+          <w:tcPr>
+            <w:tcW w:w="2323" w:type="dxa"/>
+          </w:tcPr>
+          <w:p>
+            <w:r>
+              <w:t>Lectura/Escritura</w:t>
+            </w:r>
+          </w:p>
+        </w:tc>
+      </w:tr>
+      <w:tr>
+        <w:trPr>
+          <w:trHeight w:val="476"/>
+        </w:trPr>
+        <w:tc>
+          <w:tcPr>
+            <w:tcW w:w="1744" w:type="dxa"/>
+          </w:tcPr>
+          <w:p/>
+        </w:tc>
+        <w:tc>
+          <w:tcPr>
+            <w:tcW w:w="1665" w:type="dxa"/>
+          </w:tcPr>
+          <w:p>
+            <w:r>
+              <w:t>.color</w:t>
+            </w:r>
+          </w:p>
+        </w:tc>
+        <w:tc>
+          <w:tcPr>
+            <w:tcW w:w="1632" w:type="dxa"/>
+          </w:tcPr>
+          <w:p>
+            <w:r>
+              <w:t>NOMBRE</w:t>
+            </w:r>
+          </w:p>
+        </w:tc>
+        <w:tc>
+          <w:tcPr>
+            <w:tcW w:w="2457" w:type="dxa"/>
+          </w:tcPr>
+          <w:p>
+            <w:proofErr w:type="spellStart"/>
+            <w:r>
+              <w:t>blanco,rojo,azul</w:t>
+            </w:r>
+            <w:proofErr w:type="spellEnd"/>
+          </w:p>
+        </w:tc>
+        <w:tc>
+          <w:tcPr>
+            <w:tcW w:w="2323" w:type="dxa"/>
+          </w:tcPr>
+          <w:p>
+            <w:r>
+              <w:t>Lectura/Escritura</w:t>
+            </w:r>
+          </w:p>
+        </w:tc>
+      </w:tr>
+      <w:tr>
+        <w:trPr>
+          <w:trHeight w:val="504"/>
+        </w:trPr>
+        <w:tc>
+          <w:tcPr>
+            <w:tcW w:w="1744" w:type="dxa"/>
+          </w:tcPr>
+          <w:p>
+            <w:r>
+              <w:rPr>
+                <w:b/>
+                <w:bCs/>
+              </w:rPr>
+              <w:t>aire_</w:t>
+            </w:r>
+          </w:p>
+        </w:tc>
+        <w:tc>
+          <w:tcPr>
+            <w:tcW w:w="1665" w:type="dxa"/>
+          </w:tcPr>
+          <w:p>
+            <w:r>
+              <w:t>.estado</w:t>
+            </w:r>
+          </w:p>
+        </w:tc>
+        <w:tc>
+          <w:tcPr>
+            <w:tcW w:w="1632" w:type="dxa"/>
+          </w:tcPr>
+          <w:p>
+            <w:r>
+              <w:t>BOOL</w:t>
+            </w:r>
+          </w:p>
+        </w:tc>
+        <w:tc>
+          <w:tcPr>
+            <w:tcW w:w="2457" w:type="dxa"/>
+          </w:tcPr>
+          <w:p>
+            <w:r>
+              <w:t>ON, OFF</w:t>
+            </w:r>
+          </w:p>
+        </w:tc>
+        <w:tc>
+          <w:tcPr>
+            <w:tcW w:w="2323" w:type="dxa"/>
+          </w:tcPr>
+          <w:p>
+            <w:r>
+              <w:t>Lectura/Escritura</w:t>
+            </w:r>
+          </w:p>
+        </w:tc>
+      </w:tr>
+      <w:tr>
+        <w:trPr>
+          <w:trHeight w:val="476"/>
+        </w:trPr>
+        <w:tc>
+          <w:tcPr>
+            <w:tcW w:w="1744" w:type="dxa"/>
+          </w:tcPr>
+          <w:p/>
+        </w:tc>
+        <w:tc>
+          <w:tcPr>
+            <w:tcW w:w="1665" w:type="dxa"/>
+          </w:tcPr>
+          <w:p>
+            <w:r>
+              <w:t>.modo</w:t>
+            </w:r>
+          </w:p>
+        </w:tc>
+        <w:tc>
+          <w:tcPr>
+            <w:tcW w:w="1632" w:type="dxa"/>
+          </w:tcPr>
+          <w:p>
+            <w:r>
+              <w:t xml:space="preserve">DISCRETO </w:t>
+            </w:r>
+          </w:p>
+        </w:tc>
+        <w:tc>
+          <w:tcPr>
+            <w:tcW w:w="2457" w:type="dxa"/>
+          </w:tcPr>
+          <w:p>
+            <w:r>
+              <w:t>FRIO,CALOR,VENT</w:t>
+            </w:r>
+          </w:p>
+        </w:tc>
+        <w:tc>
+          <w:tcPr>
+            <w:tcW w:w="2323" w:type="dxa"/>
+          </w:tcPr>
+          <w:p>
+            <w:r>
+              <w:t>Lectura/Escritura</w:t>
+            </w:r>
+          </w:p>
+        </w:tc>
+      </w:tr>
+      <w:tr>
+        <w:trPr>
+          <w:trHeight w:val="476"/>
+        </w:trPr>
+        <w:tc>
+          <w:tcPr>
+            <w:tcW w:w="1744" w:type="dxa"/>
+          </w:tcPr>
+          <w:p/>
+        </w:tc>
+        <w:tc>
+          <w:tcPr>
+            <w:tcW w:w="1665" w:type="dxa"/>
+          </w:tcPr>
+          <w:p>
+            <w:r>
+              <w:t>.</w:t>
+            </w:r>
+            <w:proofErr w:type="spellStart"/>
+            <w:r>
+              <w:t>temp_obj</w:t>
+            </w:r>
+            <w:proofErr w:type="spellEnd"/>
+          </w:p>
+        </w:tc>
+        <w:tc>
+          <w:tcPr>
+            <w:tcW w:w="1632" w:type="dxa"/>
+          </w:tcPr>
+          <w:p>
+            <w:r>
+              <w:t>TEMP</w:t>
+            </w:r>
+          </w:p>
+        </w:tc>
+        <w:tc>
+          <w:tcPr>
+            <w:tcW w:w="2457" w:type="dxa"/>
+          </w:tcPr>
+          <w:p>
+            <w:r>
+              <w:t>16°C a 30°C</w:t>
+            </w:r>
+          </w:p>
+        </w:tc>
+        <w:tc>
+          <w:tcPr>
+            <w:tcW w:w="2323" w:type="dxa"/>
+          </w:tcPr>
+          <w:p>
+            <w:r>
+              <w:t>Lectura/Escritura</w:t>
+            </w:r>
+          </w:p>
+        </w:tc>
+      </w:tr>
+      <w:tr>
+        <w:trPr>
+          <w:trHeight w:val="476"/>
+        </w:trPr>
+        <w:tc>
+          <w:tcPr>
+            <w:tcW w:w="1744" w:type="dxa"/>
+          </w:tcPr>
+          <w:p/>
+        </w:tc>
+        <w:tc>
+          <w:tcPr>
+            <w:tcW w:w="1665" w:type="dxa"/>
+          </w:tcPr>
+          <w:p>
+            <w:r>
+              <w:t>.</w:t>
+            </w:r>
+            <w:proofErr w:type="spellStart"/>
+            <w:r>
+              <w:t>temp_act</w:t>
+            </w:r>
+            <w:proofErr w:type="spellEnd"/>
+          </w:p>
+        </w:tc>
+        <w:tc>
+          <w:tcPr>
+            <w:tcW w:w="1632" w:type="dxa"/>
+          </w:tcPr>
+          <w:p>
+            <w:r>
+              <w:t>TEMP</w:t>
+            </w:r>
+          </w:p>
+        </w:tc>
+        <w:tc>
+          <w:tcPr>
+            <w:tcW w:w="2457" w:type="dxa"/>
+          </w:tcPr>
+          <w:p>
+            <w:r>
+              <w:t>-10°C a 50°C</w:t>
+            </w:r>
+          </w:p>
+        </w:tc>
+        <w:tc>
+          <w:tcPr>
+            <w:tcW w:w="2323" w:type="dxa"/>
+          </w:tcPr>
+          <w:p>
+            <w:r>
+              <w:t>Solo Lectura</w:t>
+            </w:r>
+          </w:p>
+        </w:tc>
+      </w:tr>
+      <w:tr>
+        <w:trPr>
+          <w:trHeight w:val="476"/>
+        </w:trPr>
+        <w:tc>
+          <w:tcPr>
+            <w:tcW w:w="1744" w:type="dxa"/>
+          </w:tcPr>
+          <w:p>
+            <w:r>
+              <w:rPr>
+                <w:b/>
+                <w:bCs/>
+              </w:rPr>
+              <w:t>persiana_</w:t>
+            </w:r>
+          </w:p>
+        </w:tc>
+        <w:tc>
+          <w:tcPr>
+            <w:tcW w:w="1665" w:type="dxa"/>
+          </w:tcPr>
+          <w:p>
+            <w:r>
+              <w:t>.posición</w:t>
+            </w:r>
+          </w:p>
+        </w:tc>
+        <w:tc>
+          <w:tcPr>
+            <w:tcW w:w="1632" w:type="dxa"/>
+          </w:tcPr>
+          <w:p>
+            <w:r>
+              <w:t>PERCENT</w:t>
+            </w:r>
+          </w:p>
+        </w:tc>
+        <w:tc>
+          <w:tcPr>
+            <w:tcW w:w="2457" w:type="dxa"/>
+          </w:tcPr>
+          <w:p>
+            <w:r>
+              <w:t>0% a 100%</w:t>
+            </w:r>
+          </w:p>
+        </w:tc>
+        <w:tc>
+          <w:tcPr>
+            <w:tcW w:w="2323" w:type="dxa"/>
+          </w:tcPr>
+          <w:p>
+            <w:r>
+              <w:t>Lectura/Escritura</w:t>
+            </w:r>
+          </w:p>
+        </w:tc>
+      </w:tr>
+      <w:tr>
+        <w:trPr>
+          <w:trHeight w:val="504"/>
+        </w:trPr>
+        <w:tc>
+          <w:tcPr>
+            <w:tcW w:w="1744" w:type="dxa"/>
+          </w:tcPr>
+          <w:p>
+            <w:r>
+              <w:rPr>
+                <w:b/>
+                <w:bCs/>
+              </w:rPr>
+              <w:t>cerradura_</w:t>
+            </w:r>
+          </w:p>
+        </w:tc>
+        <w:tc>
+          <w:tcPr>
+            <w:tcW w:w="1665" w:type="dxa"/>
+          </w:tcPr>
+          <w:p>
+            <w:r>
+              <w:t>.estado</w:t>
+            </w:r>
+          </w:p>
+        </w:tc>
+        <w:tc>
+          <w:tcPr>
+            <w:tcW w:w="1632" w:type="dxa"/>
+          </w:tcPr>
+          <w:p>
+            <w:r>
+              <w:t>BOOL</w:t>
+            </w:r>
+          </w:p>
+        </w:tc>
+        <w:tc>
+          <w:tcPr>
+            <w:tcW w:w="2457" w:type="dxa"/>
+          </w:tcPr>
+          <w:p>
+            <w:r>
+              <w:t>ON, OFF</w:t>
+            </w:r>
+          </w:p>
+        </w:tc>
+        <w:tc>
+          <w:tcPr>
+            <w:tcW w:w="2323" w:type="dxa"/>
+          </w:tcPr>
+          <w:p>
+            <w:r>
+              <w:t>Lectura/Escritura</w:t>
+            </w:r>
+          </w:p>
+        </w:tc>
+      </w:tr>
+      <w:tr>
+        <w:trPr>
+          <w:trHeight w:val="476"/>
+        </w:trPr>
+        <w:tc>
+          <w:tcPr>
+            <w:tcW w:w="1744" w:type="dxa"/>
+          </w:tcPr>
+          <w:p>
+            <w:r>
+              <w:rPr>
+                <w:b/>
+                <w:bCs/>
+              </w:rPr>
+              <w:t>reloj_</w:t>
+            </w:r>
+          </w:p>
+        </w:tc>
+        <w:tc>
+          <w:tcPr>
+            <w:tcW w:w="1665" w:type="dxa"/>
+          </w:tcPr>
+          <w:p>
+            <w:r>
+              <w:t>.hora</w:t>
+            </w:r>
+          </w:p>
+        </w:tc>
+        <w:tc>
+          <w:tcPr>
+            <w:tcW w:w="1632" w:type="dxa"/>
+          </w:tcPr>
+          <w:p>
+            <w:r>
+              <w:t>TIME</w:t>
+            </w:r>
+          </w:p>
+        </w:tc>
+        <w:tc>
+          <w:tcPr>
+            <w:tcW w:w="2457" w:type="dxa"/>
+          </w:tcPr>
+          <w:p>
+            <w:r>
+              <w:t>00:00 a 23:59</w:t>
+            </w:r>
+          </w:p>
+        </w:tc>
+        <w:tc>
+          <w:tcPr>
+            <w:tcW w:w="2323" w:type="dxa"/>
+          </w:tcPr>
+          <w:p>
+            <w:r>
+              <w:t>Solo Lectura</w:t>
+            </w:r>
+          </w:p>
+        </w:tc>
+      </w:tr>
+      <w:tr>
+        <w:trPr>
+          <w:trHeight w:val="960"/>
+        </w:trPr>
+        <w:tc>
+          <w:tcPr>
+            <w:tcW w:w="1744" w:type="dxa"/>
+          </w:tcPr>
+          <w:p/>
+        </w:tc>
+        <w:tc>
+          <w:tcPr>
+            <w:tcW w:w="1665" w:type="dxa"/>
+          </w:tcPr>
+          <w:p>
+            <w:r>
+              <w:t>.fecha</w:t>
+            </w:r>
+          </w:p>
+        </w:tc>
+        <w:tc>
+          <w:tcPr>
+            <w:tcW w:w="1632" w:type="dxa"/>
+          </w:tcPr>
+          <w:p>
+            <w:r>
+              <w:t>DATE</w:t>
+            </w:r>
+          </w:p>
+        </w:tc>
+        <w:tc>
+          <w:tcPr>
+            <w:tcW w:w="2457" w:type="dxa"/>
+          </w:tcPr>
+          <w:p>
+            <w:r>
+              <w:t>01/01/2000 a 31/12/2099</w:t>
+            </w:r>
+          </w:p>
+        </w:tc>
+        <w:tc>
+          <w:tcPr>
+            <w:tcW w:w="2323" w:type="dxa"/>
+          </w:tcPr>
+          <w:p>
+            <w:r>
+              <w:t>Solo Lectura</w:t>
+            </w:r>
+          </w:p>
+        </w:tc>
+      </w:tr>
+      <w:tr>
+        <w:trPr>
+          <w:trHeight w:val="504"/>
+        </w:trPr>
+        <w:tc>
+          <w:tcPr>
+            <w:tcW w:w="1744" w:type="dxa"/>
+          </w:tcPr>
+          <w:p>
+            <w:r>
+              <w:rPr>
+                <w:b/>
+                <w:bCs/>
+              </w:rPr>
+              <w:t xml:space="preserve">altavoz_ </w:t>
+            </w:r>
+          </w:p>
+        </w:tc>
+        <w:tc>
+          <w:tcPr>
+            <w:tcW w:w="1665" w:type="dxa"/>
+          </w:tcPr>
+          <w:p>
+            <w:r>
+              <w:t>.volumen</w:t>
+            </w:r>
+          </w:p>
+        </w:tc>
+        <w:tc>
+          <w:tcPr>
+            <w:tcW w:w="1632" w:type="dxa"/>
+          </w:tcPr>
+          <w:p>
+            <w:r>
+              <w:t>PERCENT</w:t>
+            </w:r>
+          </w:p>
+        </w:tc>
+        <w:tc>
+          <w:tcPr>
+            <w:tcW w:w="2457" w:type="dxa"/>
+          </w:tcPr>
+          <w:p>
+            <w:r>
+              <w:t>0% a 100%</w:t>
+            </w:r>
+          </w:p>
+        </w:tc>
+        <w:tc>
+          <w:tcPr>
+            <w:tcW w:w="2323" w:type="dxa"/>
+          </w:tcPr>
+          <w:p>
+            <w:r>
+              <w:t>Lectura/Escritura</w:t>
+            </w:r>
+          </w:p>
+        </w:tc>
+      </w:tr>
+      <w:tr>
+        <w:trPr>
+          <w:trHeight w:val="476"/>
+        </w:trPr>
+        <w:tc>
+          <w:tcPr>
+            <w:tcW w:w="1744" w:type="dxa"/>
+          </w:tcPr>
+          <w:p/>
+        </w:tc>
+        <w:tc>
+          <w:tcPr>
+            <w:tcW w:w="1665" w:type="dxa"/>
+          </w:tcPr>
+          <w:p>
+            <w:r>
+              <w:t>.mute</w:t>
+            </w:r>
+          </w:p>
+        </w:tc>
+        <w:tc>
+          <w:tcPr>
+            <w:tcW w:w="1632" w:type="dxa"/>
+          </w:tcPr>
+          <w:p>
+            <w:r>
+              <w:t>BOOL</w:t>
+            </w:r>
+          </w:p>
+        </w:tc>
+        <w:tc>
+          <w:tcPr>
+            <w:tcW w:w="2457" w:type="dxa"/>
+          </w:tcPr>
+          <w:p>
+            <w:r>
+              <w:t>ON, OFF</w:t>
+            </w:r>
+          </w:p>
+        </w:tc>
+        <w:tc>
+          <w:tcPr>
+            <w:tcW w:w="2323" w:type="dxa"/>
+          </w:tcPr>
+          <w:p>
+            <w:r>
+              <w:t>Lectura/Escritura</w:t>
+            </w:r>
+          </w:p>
+        </w:tc>
+      </w:tr>
+      <w:tr>
+        <w:trPr>
+          <w:trHeight w:val="476"/>
+        </w:trPr>
+        <w:tc>
+          <w:tcPr>
+            <w:tcW w:w="1744" w:type="dxa"/>
+          </w:tcPr>
+          <w:p/>
+        </w:tc>
+        <w:tc>
+          <w:tcPr>
+            <w:tcW w:w="1665" w:type="dxa"/>
+          </w:tcPr>
+          <w:p>
+            <w:r>
+              <w:t>.mensaje</w:t>
+            </w:r>
+          </w:p>
+        </w:tc>
+        <w:tc>
+          <w:tcPr>
+            <w:tcW w:w="1632" w:type="dxa"/>
+          </w:tcPr>
+          <w:p>
+            <w:r>
+              <w:t>texto</w:t>
+            </w:r>
+          </w:p>
+        </w:tc>
+        <w:tc>
+          <w:tcPr>
+            <w:tcW w:w="2457" w:type="dxa"/>
+          </w:tcPr>
+          <w:p/>
+        </w:tc>
+        <w:tc>
+          <w:tcPr>
+            <w:tcW w:w="2323" w:type="dxa"/>
+          </w:tcPr>
+          <w:p>
+            <w:r>
+              <w:t>Lectura/Escritura</w:t>
+            </w:r>
+          </w:p>
+        </w:tc>
+      </w:tr>
+      <w:tr>
+        <w:trPr>
+          <w:trHeight w:val="476"/>
+        </w:trPr>
+        <w:tc>
+          <w:tcPr>
+            <w:tcW w:w="1744" w:type="dxa"/>
+          </w:tcPr>
+          <w:p/>
+        </w:tc>
+        <w:tc>
+          <w:tcPr>
+            <w:tcW w:w="1665" w:type="dxa"/>
+          </w:tcPr>
+          <w:p>
+            <w:r>
+              <w:t>.</w:t>
+            </w:r>
+            <w:proofErr w:type="spellStart"/>
+            <w:r>
+              <w:t>email_notif</w:t>
+            </w:r>
+            <w:proofErr w:type="spellEnd"/>
+          </w:p>
+        </w:tc>
+        <w:tc>
+          <w:tcPr>
+            <w:tcW w:w="1632" w:type="dxa"/>
+          </w:tcPr>
+          <w:p>
+            <w:r>
+              <w:t>email</w:t>
+            </w:r>
+          </w:p>
+        </w:tc>
+        <w:tc>
+          <w:tcPr>
+            <w:tcW w:w="2457" w:type="dxa"/>
+          </w:tcPr>
+          <w:p/>
+        </w:tc>
+        <w:tc>
+          <w:tcPr>
+            <w:tcW w:w="2323" w:type="dxa"/>
+          </w:tcPr>
+          <w:p>
+            <w:r>
+              <w:t>Lectura/Escritura</w:t>
+            </w:r>
+          </w:p>
+        </w:tc>
+      </w:tr>
+      <w:tr>
+        <w:trPr>
+          <w:trHeight w:val="476"/>
+        </w:trPr>
+        <w:tc>
+          <w:tcPr>
+            <w:tcW w:w="1744" w:type="dxa"/>
+          </w:tcPr>
+          <w:p>
+            <w:r>
+              <w:rPr>
+                <w:b/>
+                <w:bCs/>
+              </w:rPr>
+              <w:t>alarma_</w:t>
+            </w:r>
+          </w:p>
+        </w:tc>
+        <w:tc>
+          <w:tcPr>
+            <w:tcW w:w="1665" w:type="dxa"/>
+          </w:tcPr>
+          <w:p>
+            <w:r>
+              <w:t>.estado</w:t>
+            </w:r>
+          </w:p>
+        </w:tc>
+        <w:tc>
+          <w:tcPr>
+            <w:tcW w:w="1632" w:type="dxa"/>
+          </w:tcPr>
+          <w:p>
+            <w:r>
+              <w:t>BOOL</w:t>
+            </w:r>
+          </w:p>
+        </w:tc>
+        <w:tc>
+          <w:tcPr>
+            <w:tcW w:w="2457" w:type="dxa"/>
+          </w:tcPr>
+          <w:p>
+            <w:r>
+              <w:t>ON, OFF</w:t>
+            </w:r>
+          </w:p>
+        </w:tc>
+        <w:tc>
+          <w:tcPr>
+            <w:tcW w:w="2323" w:type="dxa"/>
+          </w:tcPr>
+          <w:p>
+            <w:r>
+              <w:t>Lectura/Escritura</w:t>
+            </w:r>
+          </w:p>
+        </w:tc>
+      </w:tr>
+      <w:tr>
+        <w:trPr>
+          <w:trHeight w:val="476"/>
+        </w:trPr>
+        <w:tc>
+          <w:tcPr>
+            <w:tcW w:w="1744" w:type="dxa"/>
+          </w:tcPr>
+          <w:p>
+            <w:pPr>
+              <w:rPr>
+                <w:b/>
+                <w:bCs/>
+              </w:rPr>
+            </w:pPr>
+          </w:p>
+        </w:tc>
+        <w:tc>
+          <w:tcPr>
+            <w:tcW w:w="1665" w:type="dxa"/>
+          </w:tcPr>
+          <w:p>
+            <w:r>
+              <w:t>.activada</w:t>
+            </w:r>
+          </w:p>
+        </w:tc>
+        <w:tc>
+          <w:tcPr>
+            <w:tcW w:w="1632" w:type="dxa"/>
+          </w:tcPr>
+          <w:p>
+            <w:r>
+              <w:t xml:space="preserve">BOOL </w:t>
+            </w:r>
+          </w:p>
+        </w:tc>
+        <w:tc>
+          <w:tcPr>
+            <w:tcW w:w="2457" w:type="dxa"/>
+          </w:tcPr>
+          <w:p>
+            <w:r>
+              <w:t>ON, OFF</w:t>
+            </w:r>
+          </w:p>
+        </w:tc>
+        <w:tc>
+          <w:tcPr>
+            <w:tcW w:w="2323" w:type="dxa"/>
+          </w:tcPr>
+          <w:p>
+            <w:r>
+              <w:t>Lectura/Escritura</w:t>
+            </w:r>
+          </w:p>
+        </w:tc>
+      </w:tr>
+    </w:tbl>
+    <w:p/>
+    <w:p>
+      <w:pPr>
+        <w:pStyle w:val="Ttulo4"/>
+        <w:rPr>
+          <w:b/>
+          <w:bCs/>
+        </w:rPr>
+      </w:pPr>
+      <w:r>
+        <w:rPr>
+          <w:b/>
+          <w:bCs/>
+        </w:rPr>
+        <w:t>Operadores y Delimitadores:</w:t>
+      </w:r>
+    </w:p>
+    <w:p>
+      <w:pPr>
+        <w:pStyle w:val="Prrafodelista"/>
+        <w:numPr>
+          <w:ilvl w:val="0"/>
+          <w:numId w:val="3"/>
+        </w:numPr>
+      </w:pPr>
+      <w:r>
+        <w:rPr>
+          <w:b/>
+          <w:bCs/>
+        </w:rPr>
+        <w:t>Comparación</w:t>
+      </w:r>
+      <w:r>
+        <w:t>: ==, !=, &gt;, &lt;, &gt;=, &lt;=</w:t>
+      </w:r>
+    </w:p>
+    <w:p>
+      <w:pPr>
+        <w:pStyle w:val="Prrafodelista"/>
+        <w:numPr>
+          <w:ilvl w:val="0"/>
+          <w:numId w:val="3"/>
+        </w:numPr>
+      </w:pPr>
+      <w:proofErr w:type="spellStart"/>
+      <w:r>
+        <w:rPr>
+          <w:b/>
+          <w:bCs/>
+        </w:rPr>
+        <w:t>Logicos</w:t>
+      </w:r>
+      <w:proofErr w:type="spellEnd"/>
+      <w:r>
+        <w:t>:</w:t>
+      </w:r>
+      <w:r>
+        <w:t xml:space="preserve"> AND, OR, NOT</w:t>
+      </w:r>
+    </w:p>
+    <w:p>
+      <w:pPr>
+        <w:pStyle w:val="Prrafodelista"/>
+        <w:numPr>
+          <w:ilvl w:val="0"/>
+          <w:numId w:val="3"/>
+        </w:numPr>
+      </w:pPr>
+      <w:r>
+        <w:rPr>
+          <w:b/>
+          <w:bCs/>
+        </w:rPr>
+        <w:t>Asignación</w:t>
+      </w:r>
+      <w:r>
+        <w:t>:</w:t>
+      </w:r>
+      <w:r>
+        <w:t xml:space="preserve"> =</w:t>
+      </w:r>
+    </w:p>
+    <w:p>
+      <w:pPr>
+        <w:pStyle w:val="Prrafodelista"/>
+        <w:numPr>
+          <w:ilvl w:val="0"/>
+          <w:numId w:val="3"/>
+        </w:numPr>
+      </w:pPr>
+      <w:r>
+        <w:rPr>
+          <w:b/>
+          <w:bCs/>
+        </w:rPr>
+        <w:t>Puntuación</w:t>
+      </w:r>
+      <w:r>
+        <w:t>:</w:t>
+      </w:r>
+      <w:r>
+        <w:t xml:space="preserve"> “.” Para los atributos</w:t>
+      </w:r>
+    </w:p>
+    <w:p>
+      <w:r>
+        <w:t xml:space="preserve">● Los bloques de control deben respetar su formato </w:t>
+      </w:r>
+    </w:p>
+    <w:p>
+      <w:pPr>
+        <w:ind w:firstLine="708"/>
+      </w:pPr>
+      <w:r>
+        <w:t xml:space="preserve">○ WHEN &lt;condición&gt; DO &lt;acción&gt; END </w:t>
+      </w:r>
+    </w:p>
+    <w:p>
+      <w:pPr>
+        <w:ind w:left="708"/>
+      </w:pPr>
+      <w:r>
+        <w:t xml:space="preserve">○ EVERY &lt;tiempo&gt; DO &lt;acción&gt; END </w:t>
+      </w:r>
+    </w:p>
+    <w:p>
+      <w:pPr>
+        <w:ind w:left="708"/>
+      </w:pPr>
+      <w:r>
+        <w:t xml:space="preserve">○ &lt;acción&gt; puede ser una asignación o un condicional. </w:t>
+      </w:r>
+    </w:p>
+    <w:p>
+      <w:r>
+        <w:t xml:space="preserve">● Condicional ○ IF &lt;condición&gt; THEN &lt;acción&gt; ELSE &lt;acción&gt; </w:t>
+      </w:r>
+    </w:p>
+    <w:p>
+      <w:pPr>
+        <w:ind w:left="708"/>
+      </w:pPr>
+      <w:r>
+        <w:t xml:space="preserve">○ &lt;condición&gt; debe dar un resultado TRUE o FALSE, puede ser un booleano, una comparación, una negación (NOT) o varias condiciones agregadas con AND u OR. </w:t>
+      </w:r>
+    </w:p>
+    <w:p>
+      <w:pPr>
+        <w:ind w:left="708"/>
+      </w:pPr>
+      <w:r>
+        <w:t xml:space="preserve">○ &lt;acción&gt; puede ser una asignación o un condicional. </w:t>
+      </w:r>
+    </w:p>
+    <w:p>
+      <w:r>
+        <w:t>● Asignación</w:t>
+      </w:r>
+      <w:r>
+        <w:t>:</w:t>
+      </w:r>
+      <w:r>
+        <w:t xml:space="preserve">  dispositivo.atributo = valor </w:t>
+      </w:r>
+    </w:p>
+    <w:p>
+      <w:pPr>
+        <w:jc w:val="both"/>
+      </w:pPr>
+      <w:r>
+        <w:t>NT = {A, ACCIONES, BLOQUE_PRINCIPAL, BLOQUE_WHERE, BLOQUE_IF, BLOQUE_IF_ELSE, BLOQUE_EVERY, OPERADOR_LOGICO, OPERADOR_RELACIONAL,</w:t>
+      </w:r>
+      <w:r>
+        <w:rPr>
+          <w:rFonts w:ascii="Arial" w:hAnsi="Arial" w:cs="Arial"/>
+          <w:color w:val="36393F"/>
+        </w:rPr>
+        <w:t xml:space="preserve"> </w:t>
+      </w:r>
+      <w:r>
+        <w:t>EXPRESIONES</w:t>
+      </w:r>
+      <w:r>
+        <w:t xml:space="preserve">, NUMEROS, CADENAS, </w:t>
+      </w:r>
+      <w:r>
+        <w:t>ABRIR_PAR, CERRAR_PAR</w:t>
+      </w:r>
+      <w:r>
+        <w:t xml:space="preserve">, </w:t>
+      </w:r>
+      <w:r>
+        <w:t>COMILLAS</w:t>
+      </w:r>
+      <w:r>
+        <w:t>,</w:t>
+      </w:r>
+      <w:r>
+        <w:rPr>
+          <w:rFonts w:ascii="Arial" w:hAnsi="Arial" w:cs="Arial"/>
+          <w:color w:val="36393F"/>
+        </w:rPr>
+        <w:t xml:space="preserve"> </w:t>
+      </w:r>
+      <w:r>
+        <w:t>ASIGNACION</w:t>
+      </w:r>
+      <w:r>
+        <w:t>}</w:t>
+      </w:r>
+    </w:p>
+    <w:p>
+      <w:pPr>
+        <w:jc w:val="both"/>
+      </w:pPr>
+      <w:r>
+        <w:t xml:space="preserve">T = {BEGIN, WHEN, IF, THEN, ELSE, EVERY, DO, END, </w:t>
+      </w:r>
+      <w:r>
+        <w:t>sensor_temp</w:t>
+      </w:r>
+      <w:r>
+        <w:t xml:space="preserve">, </w:t>
+      </w:r>
+      <w:r>
+        <w:t>sensor_</w:t>
+      </w:r>
+      <w:r>
+        <w:t xml:space="preserve">humedad, </w:t>
+      </w:r>
+      <w:r>
+        <w:t>sensor_</w:t>
+      </w:r>
+      <w:r>
+        <w:t xml:space="preserve">humo, </w:t>
+      </w:r>
+      <w:r>
+        <w:t>sensor_</w:t>
+      </w:r>
+      <w:r>
+        <w:t xml:space="preserve">luz, </w:t>
+      </w:r>
+      <w:r>
+        <w:t>sensor_</w:t>
+      </w:r>
+      <w:r>
+        <w:t>movimiento</w:t>
+      </w:r>
+      <w:r>
+        <w:t xml:space="preserve">, </w:t>
+      </w:r>
+      <w:r>
+        <w:t>foco, aire, persiana, cerradura, reloj, altavoz, foco</w:t>
+      </w:r>
+      <w:r>
+        <w:t xml:space="preserve">, estado, brillo, color, modo, </w:t>
+      </w:r>
+      <w:proofErr w:type="spellStart"/>
+      <w:r>
+        <w:t>temp_obj</w:t>
+      </w:r>
+      <w:proofErr w:type="spellEnd"/>
+      <w:r>
+        <w:t xml:space="preserve">, </w:t>
+      </w:r>
+      <w:proofErr w:type="spellStart"/>
+      <w:r>
+        <w:t>temp_act</w:t>
+      </w:r>
+      <w:proofErr w:type="spellEnd"/>
+      <w:r>
+        <w:t xml:space="preserve">, posición, hora, fecha, volumen, mute, mensaje, </w:t>
+      </w:r>
+      <w:proofErr w:type="spellStart"/>
+      <w:r>
+        <w:t>emailnotif</w:t>
+      </w:r>
+      <w:proofErr w:type="spellEnd"/>
+      <w:r>
+        <w:t xml:space="preserve">, activada, ==, !=, &gt;, &lt;, &gt;=, &lt;=, AND, OR, NOT, =, °, %, TRUE, FALSE, @, _, ., </w:t>
+      </w:r>
+      <w:r>
+        <w:t>[“0..9”]U[“</w:t>
+      </w:r>
+      <w:proofErr w:type="spellStart"/>
+      <w:r>
+        <w:t>a..z</w:t>
+      </w:r>
+      <w:proofErr w:type="spellEnd"/>
+      <w:r>
+        <w:t>”]U[“A..Z”]</w:t>
+      </w:r>
+      <w:r>
+        <w:t>}</w:t>
+      </w:r>
+    </w:p>
+    <w:p>
+      <w:pPr>
+        <w:jc w:val="both"/>
+      </w:pPr>
+      <w:r>
+        <w:t>Gramática</w:t>
+      </w:r>
+    </w:p>
+    <w:p>
+      <w:pPr>
+        <w:jc w:val="both"/>
+      </w:pPr>
+      <w:r>
+        <w:t>Σ → A</w:t>
+      </w:r>
+    </w:p>
+    <w:p>
+      <w:pPr>
+        <w:jc w:val="both"/>
+      </w:pPr>
+      <w:r>
+        <w:t xml:space="preserve">A → </w:t>
+      </w:r>
+      <w:r>
+        <w:t>BLOQUE_PRINCIPAL</w:t>
+      </w:r>
+    </w:p>
+    <w:p>
+      <w:pPr>
+        <w:jc w:val="both"/>
+      </w:pPr>
+      <w:r>
+        <w:lastRenderedPageBreak/>
+        <w:t xml:space="preserve">BLOQUE_PRINCIPAL </w:t>
+      </w:r>
+      <w:r>
+        <w:t>→</w:t>
+      </w:r>
+      <w:r>
+        <w:t xml:space="preserve"> BEGIN ACCIONES END</w:t>
+      </w:r>
+    </w:p>
+    <w:p>
+      <w:pPr>
+        <w:jc w:val="both"/>
+      </w:pPr>
+      <w:r>
+        <w:t xml:space="preserve">ACCIONES </w:t>
+      </w:r>
+      <w:r>
+        <w:t>→</w:t>
+      </w:r>
+      <w:r>
+        <w:t xml:space="preserve"> BLOQUE_WHEN</w:t>
+      </w:r>
+    </w:p>
+    <w:p>
+      <w:pPr>
+        <w:jc w:val="both"/>
+      </w:pPr>
+      <w:r>
+        <w:t xml:space="preserve">ACCIONES </w:t>
+      </w:r>
+      <w:r>
+        <w:t>→</w:t>
+      </w:r>
+      <w:r>
+        <w:t xml:space="preserve"> BLOQUE_IF</w:t>
+      </w:r>
+    </w:p>
+    <w:p>
+      <w:pPr>
+        <w:jc w:val="both"/>
+      </w:pPr>
+      <w:r>
+        <w:t xml:space="preserve">ACCIONES </w:t>
+      </w:r>
+      <w:r>
+        <w:t>→</w:t>
+      </w:r>
+      <w:r>
+        <w:t xml:space="preserve"> BLOQUE_IF_ELSE</w:t>
+      </w:r>
+    </w:p>
+    <w:p>
+      <w:pPr>
+        <w:jc w:val="both"/>
+      </w:pPr>
+      <w:r>
+        <w:t xml:space="preserve">ACCIONES </w:t>
+      </w:r>
+      <w:r>
+        <w:t>→</w:t>
+      </w:r>
+      <w:r>
+        <w:t xml:space="preserve"> BLOQUE_EVERY</w:t>
+      </w:r>
+    </w:p>
+    <w:p>
+      <w:pPr>
+        <w:jc w:val="both"/>
+      </w:pPr>
+      <w:r>
+        <w:t xml:space="preserve">BLOQUE_WHEN </w:t>
+      </w:r>
+      <w:r>
+        <w:t>→</w:t>
+      </w:r>
+      <w:r>
+        <w:t xml:space="preserve"> WHEN </w:t>
+      </w:r>
+      <w:r>
+        <w:t>EXPRESIONES</w:t>
+      </w:r>
+      <w:r>
+        <w:t xml:space="preserve"> DO ACCIONES END</w:t>
+      </w:r>
+    </w:p>
+    <w:p>
+      <w:pPr>
+        <w:jc w:val="both"/>
+      </w:pPr>
+      <w:r>
+        <w:t>BLOQUE_</w:t>
+      </w:r>
+      <w:r>
+        <w:t xml:space="preserve"> </w:t>
+      </w:r>
+      <w:r>
+        <w:t>IF</w:t>
+      </w:r>
+      <w:r>
+        <w:t xml:space="preserve"> →</w:t>
+      </w:r>
+      <w:r>
+        <w:t xml:space="preserve"> IF</w:t>
+      </w:r>
+      <w:r>
+        <w:t xml:space="preserve"> EXPRESIONES</w:t>
+      </w:r>
+      <w:r>
+        <w:t xml:space="preserve"> THEN ACCIONES END</w:t>
+      </w:r>
+    </w:p>
+    <w:p>
+      <w:pPr>
+        <w:jc w:val="both"/>
+      </w:pPr>
+      <w:r>
+        <w:t xml:space="preserve">BLOQUE_IF_ELSE </w:t>
+      </w:r>
+      <w:r>
+        <w:t>→</w:t>
+      </w:r>
+      <w:r>
+        <w:t xml:space="preserve"> IF</w:t>
+      </w:r>
+      <w:r>
+        <w:t xml:space="preserve"> EXPRESIONES</w:t>
+      </w:r>
+      <w:r>
+        <w:t xml:space="preserve"> THEN ACCIONES ELSE ACCIONES END</w:t>
+      </w:r>
+    </w:p>
+    <w:p>
+      <w:pPr>
+        <w:jc w:val="both"/>
+      </w:pPr>
+      <w:r>
+        <w:t>BLOQUE_EVERY</w:t>
+      </w:r>
+      <w:r>
+        <w:t xml:space="preserve"> →</w:t>
+      </w:r>
+      <w:r>
+        <w:t xml:space="preserve"> EVERY</w:t>
+      </w:r>
+      <w:r>
+        <w:t xml:space="preserve"> EXPRESIONES</w:t>
+      </w:r>
+      <w:r>
+        <w:t xml:space="preserve"> DO ACCIONES END</w:t>
+      </w:r>
     </w:p>
     <w:p>
       <w:pPr>
@@ -1728,11 +3586,126 @@
       </w:rPr>
     </w:lvl>
   </w:abstractNum>
+  <w:abstractNum w:abstractNumId="2" w15:restartNumberingAfterBreak="0">
+    <w:nsid w:val="6A3C42C9"/>
+    <w:multiLevelType w:val="hybridMultilevel"/>
+    <w:tmpl w:val="6032CEFA"/>
+    <w:lvl w:ilvl="0" w:tplc="24AADE36">
+      <w:numFmt w:val="bullet"/>
+      <w:lvlText w:val=""/>
+      <w:lvlJc w:val="left"/>
+      <w:pPr>
+        <w:ind w:left="720" w:hanging="360"/>
+      </w:pPr>
+      <w:rPr>
+        <w:rFonts w:ascii="Symbol" w:eastAsiaTheme="minorHAnsi" w:hAnsi="Symbol" w:cstheme="minorBidi" w:hint="default"/>
+      </w:rPr>
+    </w:lvl>
+    <w:lvl w:ilvl="1" w:tplc="2C0A0003" w:tentative="1">
+      <w:start w:val="1"/>
+      <w:numFmt w:val="bullet"/>
+      <w:lvlText w:val="o"/>
+      <w:lvlJc w:val="left"/>
+      <w:pPr>
+        <w:ind w:left="1440" w:hanging="360"/>
+      </w:pPr>
+      <w:rPr>
+        <w:rFonts w:ascii="Courier New" w:hAnsi="Courier New" w:cs="Courier New" w:hint="default"/>
+      </w:rPr>
+    </w:lvl>
+    <w:lvl w:ilvl="2" w:tplc="2C0A0005" w:tentative="1">
+      <w:start w:val="1"/>
+      <w:numFmt w:val="bullet"/>
+      <w:lvlText w:val=""/>
+      <w:lvlJc w:val="left"/>
+      <w:pPr>
+        <w:ind w:left="2160" w:hanging="360"/>
+      </w:pPr>
+      <w:rPr>
+        <w:rFonts w:ascii="Wingdings" w:hAnsi="Wingdings" w:hint="default"/>
+      </w:rPr>
+    </w:lvl>
+    <w:lvl w:ilvl="3" w:tplc="2C0A0001" w:tentative="1">
+      <w:start w:val="1"/>
+      <w:numFmt w:val="bullet"/>
+      <w:lvlText w:val=""/>
+      <w:lvlJc w:val="left"/>
+      <w:pPr>
+        <w:ind w:left="2880" w:hanging="360"/>
+      </w:pPr>
+      <w:rPr>
+        <w:rFonts w:ascii="Symbol" w:hAnsi="Symbol" w:hint="default"/>
+      </w:rPr>
+    </w:lvl>
+    <w:lvl w:ilvl="4" w:tplc="2C0A0003" w:tentative="1">
+      <w:start w:val="1"/>
+      <w:numFmt w:val="bullet"/>
+      <w:lvlText w:val="o"/>
+      <w:lvlJc w:val="left"/>
+      <w:pPr>
+        <w:ind w:left="3600" w:hanging="360"/>
+      </w:pPr>
+      <w:rPr>
+        <w:rFonts w:ascii="Courier New" w:hAnsi="Courier New" w:cs="Courier New" w:hint="default"/>
+      </w:rPr>
+    </w:lvl>
+    <w:lvl w:ilvl="5" w:tplc="2C0A0005" w:tentative="1">
+      <w:start w:val="1"/>
+      <w:numFmt w:val="bullet"/>
+      <w:lvlText w:val=""/>
+      <w:lvlJc w:val="left"/>
+      <w:pPr>
+        <w:ind w:left="4320" w:hanging="360"/>
+      </w:pPr>
+      <w:rPr>
+        <w:rFonts w:ascii="Wingdings" w:hAnsi="Wingdings" w:hint="default"/>
+      </w:rPr>
+    </w:lvl>
+    <w:lvl w:ilvl="6" w:tplc="2C0A0001" w:tentative="1">
+      <w:start w:val="1"/>
+      <w:numFmt w:val="bullet"/>
+      <w:lvlText w:val=""/>
+      <w:lvlJc w:val="left"/>
+      <w:pPr>
+        <w:ind w:left="5040" w:hanging="360"/>
+      </w:pPr>
+      <w:rPr>
+        <w:rFonts w:ascii="Symbol" w:hAnsi="Symbol" w:hint="default"/>
+      </w:rPr>
+    </w:lvl>
+    <w:lvl w:ilvl="7" w:tplc="2C0A0003" w:tentative="1">
+      <w:start w:val="1"/>
+      <w:numFmt w:val="bullet"/>
+      <w:lvlText w:val="o"/>
+      <w:lvlJc w:val="left"/>
+      <w:pPr>
+        <w:ind w:left="5760" w:hanging="360"/>
+      </w:pPr>
+      <w:rPr>
+        <w:rFonts w:ascii="Courier New" w:hAnsi="Courier New" w:cs="Courier New" w:hint="default"/>
+      </w:rPr>
+    </w:lvl>
+    <w:lvl w:ilvl="8" w:tplc="2C0A0005" w:tentative="1">
+      <w:start w:val="1"/>
+      <w:numFmt w:val="bullet"/>
+      <w:lvlText w:val=""/>
+      <w:lvlJc w:val="left"/>
+      <w:pPr>
+        <w:ind w:left="6480" w:hanging="360"/>
+      </w:pPr>
+      <w:rPr>
+        <w:rFonts w:ascii="Wingdings" w:hAnsi="Wingdings" w:hint="default"/>
+      </w:rPr>
+    </w:lvl>
+  </w:abstractNum>
   <w:num w:numId="1" w16cid:durableId="842820478">
     <w:abstractNumId w:val="1"/>
   </w:num>
   <w:num w:numId="2" w16cid:durableId="1546675229">
     <w:abstractNumId w:val="0"/>
+  </w:num>
+  <w:num w:numId="3" w16cid:durableId="98641739">
+    <w:abstractNumId w:val="2"/>
   </w:num>
 </w:numbering>
 </file>
@@ -2165,7 +4138,6 @@
     <w:next w:val="Normal"/>
     <w:link w:val="Ttulo2Car"/>
     <w:uiPriority w:val="9"/>
-    <w:semiHidden/>
     <w:unhideWhenUsed/>
     <w:qFormat/>
     <w:rsid w:val="00871F0E"/>
@@ -2211,7 +4183,6 @@
     <w:next w:val="Normal"/>
     <w:link w:val="Ttulo4Car"/>
     <w:uiPriority w:val="9"/>
-    <w:semiHidden/>
     <w:unhideWhenUsed/>
     <w:qFormat/>
     <w:rsid w:val="00871F0E"/>
@@ -2382,7 +4353,6 @@
     <w:basedOn w:val="Fuentedeprrafopredeter"/>
     <w:link w:val="Ttulo2"/>
     <w:uiPriority w:val="9"/>
-    <w:semiHidden/>
     <w:rsid w:val="00871F0E"/>
     <w:rPr>
       <w:rFonts w:asciiTheme="majorHAnsi" w:eastAsiaTheme="majorEastAsia" w:hAnsiTheme="majorHAnsi" w:cstheme="majorBidi"/>
@@ -2410,7 +4380,6 @@
     <w:basedOn w:val="Fuentedeprrafopredeter"/>
     <w:link w:val="Ttulo4"/>
     <w:uiPriority w:val="9"/>
-    <w:semiHidden/>
     <w:rsid w:val="00871F0E"/>
     <w:rPr>
       <w:rFonts w:eastAsiaTheme="majorEastAsia" w:cstheme="majorBidi"/>

</xml_diff>

<commit_message>
correcciones a la documentacion y gramática
</commit_message>
<xml_diff>
--- a/doc/Interprete Smart Home.docx
+++ b/doc/Interprete Smart Home.docx
@@ -617,18 +617,10 @@
         <w:t>.</w:t>
       </w:r>
     </w:p>
-    <w:p>
-      <w:pPr>
-        <w:jc w:val="both"/>
-        <w:rPr>
-          <w:noProof/>
-        </w:rPr>
-      </w:pPr>
-    </w:p>
     <w:tbl>
       <w:tblPr>
         <w:tblStyle w:val="Tablaconcuadrcula"/>
-        <w:tblW w:w="9300" w:type="dxa"/>
+        <w:tblW w:w="9716" w:type="dxa"/>
         <w:tblLook w:val="04A0" w:firstRow="1" w:lastRow="0" w:firstColumn="1" w:lastColumn="0" w:noHBand="0" w:noVBand="1"/>
       </w:tblPr>
       <w:tblGrid>
@@ -646,7 +638,7 @@
         </w:trPr>
         <w:tc>
           <w:tcPr>
-            <w:tcW w:w="1405" w:type="dxa"/>
+            <w:tcW w:w="1469" w:type="dxa"/>
           </w:tcPr>
           <w:p>
             <w:pPr>
@@ -665,7 +657,7 @@
         </w:tc>
         <w:tc>
           <w:tcPr>
-            <w:tcW w:w="811" w:type="dxa"/>
+            <w:tcW w:w="833" w:type="dxa"/>
           </w:tcPr>
           <w:p>
             <w:pPr>
@@ -684,7 +676,7 @@
         </w:tc>
         <w:tc>
           <w:tcPr>
-            <w:tcW w:w="1583" w:type="dxa"/>
+            <w:tcW w:w="1659" w:type="dxa"/>
           </w:tcPr>
           <w:p>
             <w:pPr>
@@ -703,7 +695,7 @@
         </w:tc>
         <w:tc>
           <w:tcPr>
-            <w:tcW w:w="1797" w:type="dxa"/>
+            <w:tcW w:w="1888" w:type="dxa"/>
           </w:tcPr>
           <w:p>
             <w:pPr>
@@ -722,7 +714,7 @@
         </w:tc>
         <w:tc>
           <w:tcPr>
-            <w:tcW w:w="1350" w:type="dxa"/>
+            <w:tcW w:w="1409" w:type="dxa"/>
           </w:tcPr>
           <w:p>
             <w:pPr>
@@ -741,7 +733,7 @@
         </w:tc>
         <w:tc>
           <w:tcPr>
-            <w:tcW w:w="949" w:type="dxa"/>
+            <w:tcW w:w="990" w:type="dxa"/>
           </w:tcPr>
           <w:p>
             <w:pPr>
@@ -772,7 +764,7 @@
         </w:tc>
         <w:tc>
           <w:tcPr>
-            <w:tcW w:w="1405" w:type="dxa"/>
+            <w:tcW w:w="1468" w:type="dxa"/>
           </w:tcPr>
           <w:p>
             <w:pPr>
@@ -808,7 +800,7 @@
         </w:trPr>
         <w:tc>
           <w:tcPr>
-            <w:tcW w:w="1405" w:type="dxa"/>
+            <w:tcW w:w="1469" w:type="dxa"/>
           </w:tcPr>
           <w:p>
             <w:pPr>
@@ -827,7 +819,7 @@
         </w:tc>
         <w:tc>
           <w:tcPr>
-            <w:tcW w:w="811" w:type="dxa"/>
+            <w:tcW w:w="833" w:type="dxa"/>
           </w:tcPr>
           <w:p>
             <w:pPr>
@@ -840,7 +832,7 @@
         </w:tc>
         <w:tc>
           <w:tcPr>
-            <w:tcW w:w="1583" w:type="dxa"/>
+            <w:tcW w:w="1659" w:type="dxa"/>
           </w:tcPr>
           <w:p>
             <w:pPr>
@@ -853,7 +845,7 @@
         </w:tc>
         <w:tc>
           <w:tcPr>
-            <w:tcW w:w="1797" w:type="dxa"/>
+            <w:tcW w:w="1888" w:type="dxa"/>
           </w:tcPr>
           <w:p>
             <w:pPr>
@@ -866,7 +858,7 @@
         </w:tc>
         <w:tc>
           <w:tcPr>
-            <w:tcW w:w="1350" w:type="dxa"/>
+            <w:tcW w:w="1409" w:type="dxa"/>
           </w:tcPr>
           <w:p>
             <w:pPr>
@@ -879,7 +871,7 @@
         </w:tc>
         <w:tc>
           <w:tcPr>
-            <w:tcW w:w="949" w:type="dxa"/>
+            <w:tcW w:w="990" w:type="dxa"/>
           </w:tcPr>
           <w:p>
             <w:pPr>
@@ -892,7 +884,7 @@
         </w:tc>
         <w:tc>
           <w:tcPr>
-            <w:tcW w:w="1405" w:type="dxa"/>
+            <w:tcW w:w="1468" w:type="dxa"/>
           </w:tcPr>
           <w:p>
             <w:pPr>
@@ -910,7 +902,7 @@
         </w:trPr>
         <w:tc>
           <w:tcPr>
-            <w:tcW w:w="1405" w:type="dxa"/>
+            <w:tcW w:w="1469" w:type="dxa"/>
           </w:tcPr>
           <w:p>
             <w:pPr>
@@ -929,80 +921,119 @@
         </w:tc>
         <w:tc>
           <w:tcPr>
-            <w:tcW w:w="811" w:type="dxa"/>
+            <w:tcW w:w="833" w:type="dxa"/>
           </w:tcPr>
           <w:p>
             <w:pPr>
-              <w:jc w:val="both"/>
+              <w:jc w:val="center"/>
               <w:rPr>
                 <w:noProof/>
               </w:rPr>
             </w:pPr>
-          </w:p>
-        </w:tc>
-        <w:tc>
-          <w:tcPr>
-            <w:tcW w:w="1583" w:type="dxa"/>
+            <w:r>
+              <w:rPr>
+                <w:rFonts w:ascii="Segoe UI Symbol" w:hAnsi="Segoe UI Symbol" w:cs="Segoe UI Symbol"/>
+                <w:noProof/>
+              </w:rPr>
+              <w:t>★</w:t>
+            </w:r>
+          </w:p>
+        </w:tc>
+        <w:tc>
+          <w:tcPr>
+            <w:tcW w:w="1659" w:type="dxa"/>
           </w:tcPr>
           <w:p>
             <w:pPr>
-              <w:jc w:val="both"/>
+              <w:jc w:val="center"/>
               <w:rPr>
                 <w:noProof/>
               </w:rPr>
             </w:pPr>
-          </w:p>
-        </w:tc>
-        <w:tc>
-          <w:tcPr>
-            <w:tcW w:w="1797" w:type="dxa"/>
+            <w:r>
+              <w:rPr>
+                <w:noProof/>
+              </w:rPr>
+              <w:t>●</w:t>
+            </w:r>
+          </w:p>
+        </w:tc>
+        <w:tc>
+          <w:tcPr>
+            <w:tcW w:w="1888" w:type="dxa"/>
           </w:tcPr>
           <w:p>
             <w:pPr>
-              <w:jc w:val="both"/>
+              <w:jc w:val="center"/>
               <w:rPr>
                 <w:noProof/>
               </w:rPr>
             </w:pPr>
-          </w:p>
-        </w:tc>
-        <w:tc>
-          <w:tcPr>
-            <w:tcW w:w="1350" w:type="dxa"/>
+            <w:r>
+              <w:rPr>
+                <w:noProof/>
+              </w:rPr>
+              <w:t>●</w:t>
+            </w:r>
+          </w:p>
+        </w:tc>
+        <w:tc>
+          <w:tcPr>
+            <w:tcW w:w="1409" w:type="dxa"/>
           </w:tcPr>
           <w:p>
             <w:pPr>
-              <w:jc w:val="both"/>
+              <w:jc w:val="center"/>
               <w:rPr>
                 <w:noProof/>
               </w:rPr>
             </w:pPr>
-          </w:p>
-        </w:tc>
-        <w:tc>
-          <w:tcPr>
-            <w:tcW w:w="949" w:type="dxa"/>
+            <w:r>
+              <w:rPr>
+                <w:noProof/>
+              </w:rPr>
+              <w:t>●</w:t>
+            </w:r>
+          </w:p>
+        </w:tc>
+        <w:tc>
+          <w:tcPr>
+            <w:tcW w:w="990" w:type="dxa"/>
           </w:tcPr>
           <w:p>
             <w:pPr>
-              <w:jc w:val="both"/>
+              <w:jc w:val="center"/>
               <w:rPr>
                 <w:noProof/>
               </w:rPr>
             </w:pPr>
-          </w:p>
-        </w:tc>
-        <w:tc>
-          <w:tcPr>
-            <w:tcW w:w="1405" w:type="dxa"/>
+            <w:r>
+              <w:rPr>
+                <w:rFonts w:ascii="Segoe UI Symbol" w:hAnsi="Segoe UI Symbol" w:cs="Segoe UI Symbol"/>
+                <w:noProof/>
+              </w:rPr>
+              <w:t>★</w:t>
+            </w:r>
+          </w:p>
+        </w:tc>
+        <w:tc>
+          <w:tcPr>
+            <w:tcW w:w="1468" w:type="dxa"/>
           </w:tcPr>
           <w:p>
             <w:pPr>
-              <w:jc w:val="both"/>
+              <w:jc w:val="center"/>
               <w:rPr>
                 <w:noProof/>
               </w:rPr>
             </w:pPr>
+            <w:r>
+              <w:rPr>
+                <w:rFonts w:ascii="Segoe UI Symbol" w:hAnsi="Segoe UI Symbol" w:cs="Segoe UI Symbol"/>
+                <w:noProof/>
+              </w:rPr>
+              <w:t>★</w:t>
+            </w:r>
           </w:p>
         </w:tc>
       </w:tr>
@@ -1012,7 +1043,7 @@
         </w:trPr>
         <w:tc>
           <w:tcPr>
-            <w:tcW w:w="1405" w:type="dxa"/>
+            <w:tcW w:w="1469" w:type="dxa"/>
           </w:tcPr>
           <w:p>
             <w:pPr>
@@ -1031,80 +1062,120 @@
         </w:tc>
         <w:tc>
           <w:tcPr>
-            <w:tcW w:w="811" w:type="dxa"/>
+            <w:tcW w:w="833" w:type="dxa"/>
           </w:tcPr>
           <w:p>
             <w:pPr>
-              <w:jc w:val="both"/>
+              <w:jc w:val="center"/>
               <w:rPr>
                 <w:noProof/>
               </w:rPr>
             </w:pPr>
-          </w:p>
-        </w:tc>
-        <w:tc>
-          <w:tcPr>
-            <w:tcW w:w="1583" w:type="dxa"/>
+            <w:r>
+              <w:rPr>
+                <w:rFonts w:ascii="Segoe UI Symbol" w:hAnsi="Segoe UI Symbol" w:cs="Segoe UI Symbol"/>
+                <w:noProof/>
+              </w:rPr>
+              <w:t>★</w:t>
+            </w:r>
+          </w:p>
+        </w:tc>
+        <w:tc>
+          <w:tcPr>
+            <w:tcW w:w="1659" w:type="dxa"/>
           </w:tcPr>
           <w:p>
             <w:pPr>
-              <w:jc w:val="both"/>
+              <w:jc w:val="center"/>
               <w:rPr>
                 <w:noProof/>
               </w:rPr>
             </w:pPr>
-          </w:p>
-        </w:tc>
-        <w:tc>
-          <w:tcPr>
-            <w:tcW w:w="1797" w:type="dxa"/>
+            <w:r>
+              <w:rPr>
+                <w:noProof/>
+              </w:rPr>
+              <w:t>●</w:t>
+            </w:r>
+          </w:p>
+        </w:tc>
+        <w:tc>
+          <w:tcPr>
+            <w:tcW w:w="1888" w:type="dxa"/>
           </w:tcPr>
           <w:p>
             <w:pPr>
-              <w:jc w:val="both"/>
+              <w:jc w:val="center"/>
               <w:rPr>
                 <w:noProof/>
               </w:rPr>
             </w:pPr>
-          </w:p>
-        </w:tc>
-        <w:tc>
-          <w:tcPr>
-            <w:tcW w:w="1350" w:type="dxa"/>
+            <w:r>
+              <w:rPr>
+                <w:rFonts w:ascii="Segoe UI Symbol" w:hAnsi="Segoe UI Symbol" w:cs="Segoe UI Symbol"/>
+                <w:noProof/>
+              </w:rPr>
+              <w:t>★</w:t>
+            </w:r>
+          </w:p>
+        </w:tc>
+        <w:tc>
+          <w:tcPr>
+            <w:tcW w:w="1409" w:type="dxa"/>
           </w:tcPr>
           <w:p>
             <w:pPr>
-              <w:jc w:val="both"/>
+              <w:jc w:val="center"/>
               <w:rPr>
                 <w:noProof/>
               </w:rPr>
             </w:pPr>
-          </w:p>
-        </w:tc>
-        <w:tc>
-          <w:tcPr>
-            <w:tcW w:w="949" w:type="dxa"/>
+            <w:r>
+              <w:rPr>
+                <w:noProof/>
+              </w:rPr>
+              <w:t>●</w:t>
+            </w:r>
+          </w:p>
+        </w:tc>
+        <w:tc>
+          <w:tcPr>
+            <w:tcW w:w="990" w:type="dxa"/>
           </w:tcPr>
           <w:p>
             <w:pPr>
-              <w:jc w:val="both"/>
+              <w:jc w:val="center"/>
               <w:rPr>
                 <w:noProof/>
               </w:rPr>
             </w:pPr>
-          </w:p>
-        </w:tc>
-        <w:tc>
-          <w:tcPr>
-            <w:tcW w:w="1405" w:type="dxa"/>
+            <w:r>
+              <w:rPr>
+                <w:rFonts w:ascii="Segoe UI Symbol" w:hAnsi="Segoe UI Symbol" w:cs="Segoe UI Symbol"/>
+                <w:noProof/>
+              </w:rPr>
+              <w:t>★</w:t>
+            </w:r>
+          </w:p>
+        </w:tc>
+        <w:tc>
+          <w:tcPr>
+            <w:tcW w:w="1468" w:type="dxa"/>
           </w:tcPr>
           <w:p>
             <w:pPr>
-              <w:jc w:val="both"/>
+              <w:jc w:val="center"/>
               <w:rPr>
                 <w:noProof/>
               </w:rPr>
             </w:pPr>
+            <w:r>
+              <w:rPr>
+                <w:rFonts w:ascii="Segoe UI Symbol" w:hAnsi="Segoe UI Symbol" w:cs="Segoe UI Symbol"/>
+                <w:noProof/>
+              </w:rPr>
+              <w:t>★</w:t>
+            </w:r>
           </w:p>
         </w:tc>
       </w:tr>
@@ -1114,7 +1185,7 @@
         </w:trPr>
         <w:tc>
           <w:tcPr>
-            <w:tcW w:w="1405" w:type="dxa"/>
+            <w:tcW w:w="1469" w:type="dxa"/>
           </w:tcPr>
           <w:p>
             <w:pPr>
@@ -1133,11 +1204,11 @@
         </w:tc>
         <w:tc>
           <w:tcPr>
-            <w:tcW w:w="811" w:type="dxa"/>
+            <w:tcW w:w="833" w:type="dxa"/>
           </w:tcPr>
           <w:p>
             <w:pPr>
-              <w:jc w:val="both"/>
+              <w:jc w:val="center"/>
               <w:rPr>
                 <w:noProof/>
               </w:rPr>
@@ -1146,11 +1217,11 @@
         </w:tc>
         <w:tc>
           <w:tcPr>
-            <w:tcW w:w="1583" w:type="dxa"/>
+            <w:tcW w:w="1659" w:type="dxa"/>
           </w:tcPr>
           <w:p>
             <w:pPr>
-              <w:jc w:val="both"/>
+              <w:jc w:val="center"/>
               <w:rPr>
                 <w:noProof/>
               </w:rPr>
@@ -1159,11 +1230,11 @@
         </w:tc>
         <w:tc>
           <w:tcPr>
-            <w:tcW w:w="1797" w:type="dxa"/>
+            <w:tcW w:w="1888" w:type="dxa"/>
           </w:tcPr>
           <w:p>
             <w:pPr>
-              <w:jc w:val="both"/>
+              <w:jc w:val="center"/>
               <w:rPr>
                 <w:noProof/>
               </w:rPr>
@@ -1172,11 +1243,11 @@
         </w:tc>
         <w:tc>
           <w:tcPr>
-            <w:tcW w:w="1350" w:type="dxa"/>
+            <w:tcW w:w="1409" w:type="dxa"/>
           </w:tcPr>
           <w:p>
             <w:pPr>
-              <w:jc w:val="both"/>
+              <w:jc w:val="center"/>
               <w:rPr>
                 <w:noProof/>
               </w:rPr>
@@ -1185,11 +1256,11 @@
         </w:tc>
         <w:tc>
           <w:tcPr>
-            <w:tcW w:w="949" w:type="dxa"/>
+            <w:tcW w:w="990" w:type="dxa"/>
           </w:tcPr>
           <w:p>
             <w:pPr>
-              <w:jc w:val="both"/>
+              <w:jc w:val="center"/>
               <w:rPr>
                 <w:noProof/>
               </w:rPr>
@@ -1198,11 +1269,11 @@
         </w:tc>
         <w:tc>
           <w:tcPr>
-            <w:tcW w:w="1405" w:type="dxa"/>
+            <w:tcW w:w="1468" w:type="dxa"/>
           </w:tcPr>
           <w:p>
             <w:pPr>
-              <w:jc w:val="both"/>
+              <w:jc w:val="center"/>
               <w:rPr>
                 <w:noProof/>
               </w:rPr>
@@ -1216,7 +1287,7 @@
         </w:trPr>
         <w:tc>
           <w:tcPr>
-            <w:tcW w:w="1405" w:type="dxa"/>
+            <w:tcW w:w="1469" w:type="dxa"/>
           </w:tcPr>
           <w:p>
             <w:pPr>
@@ -1235,80 +1306,120 @@
         </w:tc>
         <w:tc>
           <w:tcPr>
-            <w:tcW w:w="811" w:type="dxa"/>
+            <w:tcW w:w="833" w:type="dxa"/>
           </w:tcPr>
           <w:p>
             <w:pPr>
-              <w:jc w:val="both"/>
+              <w:jc w:val="center"/>
               <w:rPr>
                 <w:noProof/>
               </w:rPr>
             </w:pPr>
-          </w:p>
-        </w:tc>
-        <w:tc>
-          <w:tcPr>
-            <w:tcW w:w="1583" w:type="dxa"/>
+            <w:r>
+              <w:rPr>
+                <w:noProof/>
+              </w:rPr>
+              <w:t>●</w:t>
+            </w:r>
+          </w:p>
+        </w:tc>
+        <w:tc>
+          <w:tcPr>
+            <w:tcW w:w="1659" w:type="dxa"/>
           </w:tcPr>
           <w:p>
             <w:pPr>
-              <w:jc w:val="both"/>
+              <w:jc w:val="center"/>
               <w:rPr>
                 <w:noProof/>
               </w:rPr>
             </w:pPr>
-          </w:p>
-        </w:tc>
-        <w:tc>
-          <w:tcPr>
-            <w:tcW w:w="1797" w:type="dxa"/>
+            <w:r>
+              <w:rPr>
+                <w:rFonts w:ascii="Segoe UI Symbol" w:hAnsi="Segoe UI Symbol" w:cs="Segoe UI Symbol"/>
+                <w:noProof/>
+              </w:rPr>
+              <w:t>★</w:t>
+            </w:r>
+          </w:p>
+        </w:tc>
+        <w:tc>
+          <w:tcPr>
+            <w:tcW w:w="1888" w:type="dxa"/>
           </w:tcPr>
           <w:p>
             <w:pPr>
-              <w:jc w:val="both"/>
+              <w:jc w:val="center"/>
               <w:rPr>
                 <w:noProof/>
               </w:rPr>
             </w:pPr>
-          </w:p>
-        </w:tc>
-        <w:tc>
-          <w:tcPr>
-            <w:tcW w:w="1350" w:type="dxa"/>
+            <w:r>
+              <w:rPr>
+                <w:rFonts w:ascii="Segoe UI Symbol" w:hAnsi="Segoe UI Symbol" w:cs="Segoe UI Symbol"/>
+                <w:noProof/>
+              </w:rPr>
+              <w:t>★</w:t>
+            </w:r>
+          </w:p>
+        </w:tc>
+        <w:tc>
+          <w:tcPr>
+            <w:tcW w:w="1409" w:type="dxa"/>
           </w:tcPr>
           <w:p>
             <w:pPr>
-              <w:jc w:val="both"/>
+              <w:jc w:val="center"/>
               <w:rPr>
                 <w:noProof/>
               </w:rPr>
             </w:pPr>
-          </w:p>
-        </w:tc>
-        <w:tc>
-          <w:tcPr>
-            <w:tcW w:w="949" w:type="dxa"/>
+            <w:r>
+              <w:rPr>
+                <w:rFonts w:ascii="Segoe UI Symbol" w:hAnsi="Segoe UI Symbol" w:cs="Segoe UI Symbol"/>
+                <w:noProof/>
+              </w:rPr>
+              <w:t>★</w:t>
+            </w:r>
+          </w:p>
+        </w:tc>
+        <w:tc>
+          <w:tcPr>
+            <w:tcW w:w="990" w:type="dxa"/>
           </w:tcPr>
           <w:p>
             <w:pPr>
-              <w:jc w:val="both"/>
+              <w:jc w:val="center"/>
               <w:rPr>
                 <w:noProof/>
               </w:rPr>
             </w:pPr>
-          </w:p>
-        </w:tc>
-        <w:tc>
-          <w:tcPr>
-            <w:tcW w:w="1405" w:type="dxa"/>
+            <w:r>
+              <w:rPr>
+                <w:noProof/>
+              </w:rPr>
+              <w:t>●</w:t>
+            </w:r>
+          </w:p>
+        </w:tc>
+        <w:tc>
+          <w:tcPr>
+            <w:tcW w:w="1468" w:type="dxa"/>
           </w:tcPr>
           <w:p>
             <w:pPr>
-              <w:jc w:val="both"/>
+              <w:jc w:val="center"/>
               <w:rPr>
                 <w:noProof/>
               </w:rPr>
             </w:pPr>
+            <w:r>
+              <w:rPr>
+                <w:rFonts w:ascii="Segoe UI Symbol" w:hAnsi="Segoe UI Symbol" w:cs="Segoe UI Symbol"/>
+                <w:noProof/>
+              </w:rPr>
+              <w:t>★</w:t>
+            </w:r>
           </w:p>
         </w:tc>
       </w:tr>
@@ -1344,7 +1455,15 @@
         </w:numPr>
       </w:pPr>
       <w:r>
-        <w:t xml:space="preserve"> WHEN : Inicia un bloque disparado por evento. </w:t>
+        <w:t xml:space="preserve"> </w:t>
+      </w:r>
+      <w:proofErr w:type="gramStart"/>
+      <w:r>
+        <w:t>WHEN :</w:t>
+      </w:r>
+      <w:proofErr w:type="gramEnd"/>
+      <w:r>
+        <w:t xml:space="preserve"> Inicia un bloque disparado por evento. </w:t>
       </w:r>
     </w:p>
     <w:p>
@@ -1356,7 +1475,15 @@
         </w:numPr>
       </w:pPr>
       <w:r>
-        <w:t xml:space="preserve"> IF / THEN / ELSE : Estructuras condicionales. </w:t>
+        <w:t xml:space="preserve"> IF / THEN / </w:t>
+      </w:r>
+      <w:proofErr w:type="gramStart"/>
+      <w:r>
+        <w:t>ELSE :</w:t>
+      </w:r>
+      <w:proofErr w:type="gramEnd"/>
+      <w:r>
+        <w:t xml:space="preserve"> Estructuras condicionales. </w:t>
       </w:r>
     </w:p>
     <w:p>
@@ -1368,7 +1495,15 @@
         </w:numPr>
       </w:pPr>
       <w:r>
-        <w:t xml:space="preserve"> DO : Delimitador de inicio de acción. </w:t>
+        <w:t xml:space="preserve"> </w:t>
+      </w:r>
+      <w:proofErr w:type="gramStart"/>
+      <w:r>
+        <w:t>DO :</w:t>
+      </w:r>
+      <w:proofErr w:type="gramEnd"/>
+      <w:r>
+        <w:t xml:space="preserve"> Delimitador de inicio de acción. </w:t>
       </w:r>
     </w:p>
     <w:p>
@@ -1380,7 +1515,15 @@
         </w:numPr>
       </w:pPr>
       <w:r>
-        <w:t xml:space="preserve"> END : Finalización o cierre de bloque de acción </w:t>
+        <w:t xml:space="preserve"> </w:t>
+      </w:r>
+      <w:proofErr w:type="gramStart"/>
+      <w:r>
+        <w:t>END :</w:t>
+      </w:r>
+      <w:proofErr w:type="gramEnd"/>
+      <w:r>
+        <w:t xml:space="preserve"> Finalización o cierre de bloque de acción </w:t>
       </w:r>
     </w:p>
     <w:p>
@@ -1395,7 +1538,15 @@
         </w:rPr>
       </w:pPr>
       <w:r>
-        <w:t xml:space="preserve"> EVERY : Define una tarea programada por tiempo. </w:t>
+        <w:t xml:space="preserve"> </w:t>
+      </w:r>
+      <w:proofErr w:type="gramStart"/>
+      <w:r>
+        <w:t>EVERY :</w:t>
+      </w:r>
+      <w:proofErr w:type="gramEnd"/>
+      <w:r>
+        <w:t xml:space="preserve"> Define una tarea programada por tiempo. </w:t>
       </w:r>
     </w:p>
     <w:p>
@@ -1461,7 +1612,6 @@
           <w:b/>
           <w:bCs/>
         </w:rPr>
-        <w:lastRenderedPageBreak/>
         <w:t xml:space="preserve">sensor_humedad </w:t>
       </w:r>
       <w:r>
@@ -1484,6 +1634,7 @@
           <w:b/>
           <w:bCs/>
         </w:rPr>
+        <w:lastRenderedPageBreak/>
         <w:t xml:space="preserve">sensor_luz </w:t>
       </w:r>
       <w:r>
@@ -1782,9 +1933,11 @@
             <w:tcW w:w="1665" w:type="dxa"/>
           </w:tcPr>
           <w:p>
+            <w:proofErr w:type="gramStart"/>
             <w:r>
               <w:t>.estado</w:t>
             </w:r>
+            <w:proofErr w:type="gramEnd"/>
           </w:p>
         </w:tc>
         <w:tc>
@@ -1833,9 +1986,11 @@
             <w:tcW w:w="1665" w:type="dxa"/>
           </w:tcPr>
           <w:p>
+            <w:proofErr w:type="gramStart"/>
             <w:r>
               <w:t>.brillo</w:t>
             </w:r>
+            <w:proofErr w:type="gramEnd"/>
           </w:p>
         </w:tc>
         <w:tc>
@@ -1884,9 +2039,11 @@
             <w:tcW w:w="1665" w:type="dxa"/>
           </w:tcPr>
           <w:p>
+            <w:proofErr w:type="gramStart"/>
             <w:r>
               <w:t>.color</w:t>
             </w:r>
+            <w:proofErr w:type="gramEnd"/>
           </w:p>
         </w:tc>
         <w:tc>
@@ -1905,8 +2062,13 @@
           </w:tcPr>
           <w:p>
             <w:proofErr w:type="spellStart"/>
-            <w:r>
-              <w:t>blanco,rojo,azul</w:t>
+            <w:proofErr w:type="gramStart"/>
+            <w:r>
+              <w:t>blanco,rojo</w:t>
+            </w:r>
+            <w:proofErr w:type="gramEnd"/>
+            <w:r>
+              <w:t>,azul</w:t>
             </w:r>
             <w:proofErr w:type="spellEnd"/>
           </w:p>
@@ -1945,9 +2107,11 @@
             <w:tcW w:w="1665" w:type="dxa"/>
           </w:tcPr>
           <w:p>
+            <w:proofErr w:type="gramStart"/>
             <w:r>
               <w:t>.estado</w:t>
             </w:r>
+            <w:proofErr w:type="gramEnd"/>
           </w:p>
         </w:tc>
         <w:tc>
@@ -1996,9 +2160,11 @@
             <w:tcW w:w="1665" w:type="dxa"/>
           </w:tcPr>
           <w:p>
+            <w:proofErr w:type="gramStart"/>
             <w:r>
               <w:t>.modo</w:t>
             </w:r>
+            <w:proofErr w:type="gramEnd"/>
           </w:p>
         </w:tc>
         <w:tc>
@@ -2016,8 +2182,13 @@
             <w:tcW w:w="2457" w:type="dxa"/>
           </w:tcPr>
           <w:p>
-            <w:r>
-              <w:t>FRIO,CALOR,VENT</w:t>
+            <w:proofErr w:type="gramStart"/>
+            <w:r>
+              <w:t>FRIO,CALOR</w:t>
+            </w:r>
+            <w:proofErr w:type="gramEnd"/>
+            <w:r>
+              <w:t>,VENT</w:t>
             </w:r>
           </w:p>
         </w:tc>
@@ -2047,12 +2218,17 @@
             <w:tcW w:w="1665" w:type="dxa"/>
           </w:tcPr>
           <w:p>
+            <w:proofErr w:type="gramStart"/>
             <w:r>
               <w:t>.</w:t>
             </w:r>
             <w:proofErr w:type="spellStart"/>
             <w:r>
-              <w:t>temp_obj</w:t>
+              <w:t>temp</w:t>
+            </w:r>
+            <w:proofErr w:type="gramEnd"/>
+            <w:r>
+              <w:t>_obj</w:t>
             </w:r>
             <w:proofErr w:type="spellEnd"/>
           </w:p>
@@ -2103,12 +2279,17 @@
             <w:tcW w:w="1665" w:type="dxa"/>
           </w:tcPr>
           <w:p>
+            <w:proofErr w:type="gramStart"/>
             <w:r>
               <w:t>.</w:t>
             </w:r>
             <w:proofErr w:type="spellStart"/>
             <w:r>
-              <w:t>temp_act</w:t>
+              <w:t>temp</w:t>
+            </w:r>
+            <w:proofErr w:type="gramEnd"/>
+            <w:r>
+              <w:t>_act</w:t>
             </w:r>
             <w:proofErr w:type="spellEnd"/>
           </w:p>
@@ -2167,9 +2348,11 @@
             <w:tcW w:w="1665" w:type="dxa"/>
           </w:tcPr>
           <w:p>
+            <w:proofErr w:type="gramStart"/>
             <w:r>
               <w:t>.posición</w:t>
             </w:r>
+            <w:proofErr w:type="gramEnd"/>
           </w:p>
         </w:tc>
         <w:tc>
@@ -2226,9 +2409,11 @@
             <w:tcW w:w="1665" w:type="dxa"/>
           </w:tcPr>
           <w:p>
+            <w:proofErr w:type="gramStart"/>
             <w:r>
               <w:t>.estado</w:t>
             </w:r>
+            <w:proofErr w:type="gramEnd"/>
           </w:p>
         </w:tc>
         <w:tc>
@@ -2285,9 +2470,11 @@
             <w:tcW w:w="1665" w:type="dxa"/>
           </w:tcPr>
           <w:p>
+            <w:proofErr w:type="gramStart"/>
             <w:r>
               <w:t>.hora</w:t>
             </w:r>
+            <w:proofErr w:type="gramEnd"/>
           </w:p>
         </w:tc>
         <w:tc>
@@ -2336,9 +2523,11 @@
             <w:tcW w:w="1665" w:type="dxa"/>
           </w:tcPr>
           <w:p>
+            <w:proofErr w:type="gramStart"/>
             <w:r>
               <w:t>.fecha</w:t>
             </w:r>
+            <w:proofErr w:type="gramEnd"/>
           </w:p>
         </w:tc>
         <w:tc>
@@ -2395,9 +2584,11 @@
             <w:tcW w:w="1665" w:type="dxa"/>
           </w:tcPr>
           <w:p>
+            <w:proofErr w:type="gramStart"/>
             <w:r>
               <w:t>.volumen</w:t>
             </w:r>
+            <w:proofErr w:type="gramEnd"/>
           </w:p>
         </w:tc>
         <w:tc>
@@ -2446,9 +2637,11 @@
             <w:tcW w:w="1665" w:type="dxa"/>
           </w:tcPr>
           <w:p>
+            <w:proofErr w:type="gramStart"/>
             <w:r>
               <w:t>.mute</w:t>
             </w:r>
+            <w:proofErr w:type="gramEnd"/>
           </w:p>
         </w:tc>
         <w:tc>
@@ -2497,9 +2690,11 @@
             <w:tcW w:w="1665" w:type="dxa"/>
           </w:tcPr>
           <w:p>
+            <w:proofErr w:type="gramStart"/>
             <w:r>
               <w:t>.mensaje</w:t>
             </w:r>
+            <w:proofErr w:type="gramEnd"/>
           </w:p>
         </w:tc>
         <w:tc>
@@ -2544,12 +2739,17 @@
             <w:tcW w:w="1665" w:type="dxa"/>
           </w:tcPr>
           <w:p>
+            <w:proofErr w:type="gramStart"/>
             <w:r>
               <w:t>.</w:t>
             </w:r>
             <w:proofErr w:type="spellStart"/>
             <w:r>
-              <w:t>email_notif</w:t>
+              <w:t>email</w:t>
+            </w:r>
+            <w:proofErr w:type="gramEnd"/>
+            <w:r>
+              <w:t>_notif</w:t>
             </w:r>
             <w:proofErr w:type="spellEnd"/>
           </w:p>
@@ -2604,9 +2804,11 @@
             <w:tcW w:w="1665" w:type="dxa"/>
           </w:tcPr>
           <w:p>
+            <w:proofErr w:type="gramStart"/>
             <w:r>
               <w:t>.estado</w:t>
             </w:r>
+            <w:proofErr w:type="gramEnd"/>
           </w:p>
         </w:tc>
         <w:tc>
@@ -2662,9 +2864,11 @@
             <w:tcW w:w="1665" w:type="dxa"/>
           </w:tcPr>
           <w:p>
+            <w:proofErr w:type="gramStart"/>
             <w:r>
               <w:t>.activada</w:t>
             </w:r>
+            <w:proofErr w:type="gramEnd"/>
           </w:p>
         </w:tc>
         <w:tc>
@@ -2732,7 +2936,15 @@
         <w:t>Comparación</w:t>
       </w:r>
       <w:r>
-        <w:t>: ==, !=, &gt;, &lt;, &gt;=, &lt;=</w:t>
+        <w:t>: ==</w:t>
+      </w:r>
+      <w:proofErr w:type="gramStart"/>
+      <w:r>
+        <w:t>, !</w:t>
+      </w:r>
+      <w:proofErr w:type="gramEnd"/>
+      <w:r>
+        <w:t>=, &gt;, &lt;, &gt;=, &lt;=</w:t>
       </w:r>
     </w:p>
     <w:p>
@@ -2861,7 +3073,15 @@
         <w:t>:</w:t>
       </w:r>
       <w:r>
-        <w:t xml:space="preserve">  dispositivo.atributo = valor </w:t>
+        <w:t xml:space="preserve">  </w:t>
+      </w:r>
+      <w:proofErr w:type="gramStart"/>
+      <w:r>
+        <w:t>dispositivo.atributo</w:t>
+      </w:r>
+      <w:proofErr w:type="gramEnd"/>
+      <w:r>
+        <w:t xml:space="preserve"> = valor </w:t>
       </w:r>
     </w:p>
     <w:p>
@@ -2869,7 +3089,16 @@
         <w:jc w:val="both"/>
       </w:pPr>
       <w:r>
-        <w:t>NT = {A, ACCIONES, BLOQUE_PRINCIPAL, BLOQUE_WHERE, BLOQUE_IF, BLOQUE_IF_ELSE, BLOQUE_EVERY, OPERADOR_LOGICO, OPERADOR_RELACIONAL,</w:t>
+        <w:t xml:space="preserve">NT = {A, </w:t>
+      </w:r>
+      <w:r>
+        <w:t>ACCION</w:t>
+      </w:r>
+      <w:r>
+        <w:t xml:space="preserve">, </w:t>
+      </w:r>
+      <w:r>
+        <w:t>ACCIONES, BLOQUE_PRINCIPAL, BLOQUE_WHERE, BLOQUE_IF, BLOQUE_IF_ELSE, BLOQUE_EVERY, OPERADOR_LOGICO, OPERADOR_RELACIONAL,</w:t>
       </w:r>
       <w:r>
         <w:rPr>
@@ -2978,18 +3207,52 @@
       </w:r>
       <w:proofErr w:type="spellEnd"/>
       <w:r>
-        <w:t xml:space="preserve">, activada, ==, !=, &gt;, &lt;, &gt;=, &lt;=, AND, OR, NOT, =, °, %, TRUE, FALSE, @, _, ., </w:t>
-      </w:r>
-      <w:r>
-        <w:t>[“0..9”]U[“</w:t>
+        <w:t>, activada, ==</w:t>
+      </w:r>
+      <w:proofErr w:type="gramStart"/>
+      <w:r>
+        <w:t>, !</w:t>
+      </w:r>
+      <w:proofErr w:type="gramEnd"/>
+      <w:r>
+        <w:t>=, &gt;, &lt;, &gt;=, &lt;=, AND, OR, NOT, =, °, %, TRUE, FALSE, @, _</w:t>
+      </w:r>
+      <w:proofErr w:type="gramStart"/>
+      <w:r>
+        <w:t>, .</w:t>
+      </w:r>
+      <w:proofErr w:type="gramEnd"/>
+      <w:r>
+        <w:t xml:space="preserve">, </w:t>
+      </w:r>
+      <w:r>
+        <w:t>[“</w:t>
+      </w:r>
+      <w:proofErr w:type="gramStart"/>
+      <w:r>
+        <w:t>0..</w:t>
+      </w:r>
+      <w:proofErr w:type="gramEnd"/>
+      <w:r>
+        <w:t>9”]U[“</w:t>
       </w:r>
       <w:proofErr w:type="spellStart"/>
+      <w:proofErr w:type="gramStart"/>
       <w:r>
         <w:t>a..z</w:t>
       </w:r>
       <w:proofErr w:type="spellEnd"/>
-      <w:r>
-        <w:t>”]U[“A..Z”]</w:t>
+      <w:proofErr w:type="gramEnd"/>
+      <w:r>
+        <w:t>”]U[“</w:t>
+      </w:r>
+      <w:proofErr w:type="gramStart"/>
+      <w:r>
+        <w:t>A..Z</w:t>
+      </w:r>
+      <w:proofErr w:type="gramEnd"/>
+      <w:r>
+        <w:t>”]</w:t>
       </w:r>
       <w:r>
         <w:t>}</w:t>
@@ -3027,14 +3290,37 @@
         <w:jc w:val="both"/>
       </w:pPr>
       <w:r>
+        <w:t xml:space="preserve">BLOQUE_PRINCIPAL </w:t>
+      </w:r>
+      <w:r>
+        <w:t>→</w:t>
+      </w:r>
+      <w:r>
+        <w:t xml:space="preserve"> BEGIN ACCIONES END</w:t>
+      </w:r>
+    </w:p>
+    <w:p>
+      <w:pPr>
+        <w:jc w:val="both"/>
+      </w:pPr>
+      <w:r>
         <w:lastRenderedPageBreak/>
-        <w:t xml:space="preserve">BLOQUE_PRINCIPAL </w:t>
-      </w:r>
-      <w:r>
-        <w:t>→</w:t>
-      </w:r>
-      <w:r>
-        <w:t xml:space="preserve"> BEGIN ACCIONES END</w:t>
+        <w:t>ACCIONES→</w:t>
+      </w:r>
+      <w:r>
+        <w:t xml:space="preserve"> </w:t>
+      </w:r>
+      <w:r>
+        <w:t>ACCION</w:t>
+      </w:r>
+      <w:r>
+        <w:rPr>
+          <w:rFonts w:ascii="Cambria Math" w:hAnsi="Cambria Math" w:cs="Cambria Math"/>
+        </w:rPr>
+        <w:t>∣</w:t>
+      </w:r>
+      <w:r>
+        <w:t>ACCION; ACCIONES</w:t>
       </w:r>
     </w:p>
     <w:p>
@@ -4311,7 +4597,6 @@
   <w:style w:type="character" w:default="1" w:styleId="Fuentedeprrafopredeter">
     <w:name w:val="Default Paragraph Font"/>
     <w:uiPriority w:val="1"/>
-    <w:semiHidden/>
     <w:unhideWhenUsed/>
   </w:style>
   <w:style w:type="table" w:default="1" w:styleId="Tablanormal">

</xml_diff>

<commit_message>
cambios a la documentación
</commit_message>
<xml_diff>
--- a/doc/Interprete Smart Home.docx
+++ b/doc/Interprete Smart Home.docx
@@ -368,7 +368,7 @@
       <w:pPr>
         <w:pStyle w:val="Ttulo"/>
         <w:rPr>
-          <w:rFonts w:ascii="Times New Roman" w:hAnsi="Times New Roman" w:cs="Times New Roman"/>
+          <w:rFonts w:ascii="Arial" w:hAnsi="Arial" w:cs="Arial"/>
           <w:noProof/>
           <w:sz w:val="24"/>
           <w:szCs w:val="24"/>
@@ -383,46 +383,171 @@
         </w:rPr>
         <w:t>Resistencia, Chaco.</w:t>
       </w:r>
-      <w:r>
-        <w:rPr>
-          <w:noProof/>
-          <w:u w:val="single"/>
-        </w:rPr>
-        <w:br w:type="page"/>
+    </w:p>
+    <w:p/>
+    <w:p/>
+    <w:p/>
+    <w:p/>
+    <w:p/>
+    <w:p/>
+    <w:p/>
+    <w:p/>
+    <w:p/>
+    <w:p>
+      <w:pPr>
+        <w:pStyle w:val="Ttulo"/>
+      </w:pPr>
+      <w:r>
+        <w:lastRenderedPageBreak/>
+        <w:t>Índice</w:t>
       </w:r>
     </w:p>
     <w:p>
       <w:pPr>
-        <w:rPr>
-          <w:noProof/>
-        </w:rPr>
-      </w:pPr>
+        <w:pStyle w:val="Prrafodelista"/>
+        <w:numPr>
+          <w:ilvl w:val="0"/>
+          <w:numId w:val="4"/>
+        </w:numPr>
+      </w:pPr>
+      <w:r>
+        <w:t>Introducción</w:t>
+      </w:r>
+      <w:r>
+        <w:tab/>
+      </w:r>
+      <w:r>
+        <w:tab/>
+      </w:r>
+      <w:r>
+        <w:tab/>
+      </w:r>
+      <w:r>
+        <w:tab/>
+      </w:r>
+      <w:r>
+        <w:tab/>
+      </w:r>
+      <w:r>
+        <w:tab/>
+      </w:r>
+      <w:r>
+        <w:tab/>
+      </w:r>
+      <w:r>
+        <w:tab/>
+      </w:r>
+      <w:r>
+        <w:tab/>
+      </w:r>
+      <w:r>
+        <w:rPr>
+          <w:b/>
+          <w:bCs/>
+        </w:rPr>
+        <w:t>3</w:t>
+      </w:r>
     </w:p>
     <w:p>
       <w:pPr>
-        <w:rPr>
-          <w:noProof/>
-        </w:rPr>
-      </w:pPr>
+        <w:pStyle w:val="Prrafodelista"/>
+        <w:numPr>
+          <w:ilvl w:val="1"/>
+          <w:numId w:val="4"/>
+        </w:numPr>
+      </w:pPr>
+      <w:r>
+        <w:t>Alianza</w:t>
+      </w:r>
+      <w:r>
+        <w:tab/>
+      </w:r>
+      <w:r>
+        <w:tab/>
+      </w:r>
+      <w:r>
+        <w:tab/>
+      </w:r>
+      <w:r>
+        <w:tab/>
+      </w:r>
+      <w:r>
+        <w:tab/>
+      </w:r>
+      <w:r>
+        <w:tab/>
+      </w:r>
+      <w:r>
+        <w:tab/>
+      </w:r>
+      <w:r>
+        <w:tab/>
+        <w:t>3</w:t>
+      </w:r>
     </w:p>
     <w:p>
       <w:pPr>
-        <w:rPr>
-          <w:noProof/>
-        </w:rPr>
-      </w:pPr>
-      <w:r>
-        <w:rPr>
-          <w:noProof/>
-        </w:rPr>
-        <w:t>Índice</w:t>
-      </w:r>
-      <w:r>
-        <w:rPr>
-          <w:noProof/>
-        </w:rPr>
-        <w:t>:</w:t>
-      </w:r>
+        <w:pStyle w:val="Prrafodelista"/>
+        <w:numPr>
+          <w:ilvl w:val="1"/>
+          <w:numId w:val="4"/>
+        </w:numPr>
+      </w:pPr>
+      <w:r>
+        <w:t>Matriz de habilidades.</w:t>
+      </w:r>
+      <w:r>
+        <w:tab/>
+      </w:r>
+      <w:r>
+        <w:tab/>
+      </w:r>
+      <w:r>
+        <w:tab/>
+      </w:r>
+      <w:r>
+        <w:tab/>
+      </w:r>
+      <w:r>
+        <w:tab/>
+      </w:r>
+      <w:r>
+        <w:tab/>
+        <w:t>3</w:t>
+      </w:r>
+      <w:r>
+        <w:tab/>
+      </w:r>
+    </w:p>
+    <w:p/>
+    <w:p/>
+    <w:p/>
+    <w:p/>
+    <w:p/>
+    <w:p/>
+    <w:p/>
+    <w:p/>
+    <w:p/>
+    <w:p/>
+    <w:p/>
+    <w:p/>
+    <w:p/>
+    <w:p/>
+    <w:p/>
+    <w:p/>
+    <w:p/>
+    <w:p/>
+    <w:p/>
+    <w:p/>
+    <w:p/>
+    <w:p/>
+    <w:p/>
+    <w:p>
+      <w:pPr>
+        <w:rPr>
+          <w:noProof/>
+        </w:rPr>
+      </w:pPr>
     </w:p>
     <w:p>
       <w:pPr>
@@ -430,12 +555,6 @@
           <w:noProof/>
         </w:rPr>
       </w:pPr>
-      <w:r>
-        <w:rPr>
-          <w:noProof/>
-        </w:rPr>
-        <w:br w:type="page"/>
-      </w:r>
     </w:p>
     <w:p>
       <w:pPr>
@@ -443,163 +562,170 @@
           <w:noProof/>
         </w:rPr>
       </w:pPr>
-      <w:r>
-        <w:rPr>
-          <w:noProof/>
-        </w:rPr>
-        <w:lastRenderedPageBreak/>
-        <w:t>Alianza.</w:t>
-      </w:r>
     </w:p>
     <w:p>
       <w:pPr>
-        <w:jc w:val="both"/>
-        <w:rPr>
-          <w:noProof/>
-        </w:rPr>
-      </w:pPr>
-      <w:r>
-        <w:rPr>
-          <w:noProof/>
-        </w:rPr>
-        <w:t>Somos los “Semanticos”, un grupo de estudiante</w:t>
-      </w:r>
-      <w:r>
-        <w:rPr>
-          <w:noProof/>
-        </w:rPr>
-        <w:t>s</w:t>
-      </w:r>
-      <w:r>
-        <w:rPr>
-          <w:noProof/>
-        </w:rPr>
-        <w:t xml:space="preserve"> de la carrera Ingeniera en Sistemas de Información perteneciente a la Universidad Tecnologica Nacional, en su </w:t>
-      </w:r>
-      <w:r>
-        <w:rPr>
-          <w:noProof/>
-        </w:rPr>
-        <w:t>r</w:t>
-      </w:r>
-      <w:r>
-        <w:rPr>
-          <w:noProof/>
-        </w:rPr>
-        <w:t>egional Resistencia. Nuestro objetivo es, no solamente aprobar la materia</w:t>
-      </w:r>
-      <w:r>
-        <w:rPr>
-          <w:noProof/>
-        </w:rPr>
-        <w:t xml:space="preserve"> (como objetivo grupal)</w:t>
-      </w:r>
-      <w:r>
-        <w:rPr>
-          <w:noProof/>
-        </w:rPr>
-        <w:t xml:space="preserve">, si no también entender la lógica y el funcionamiento detrás de un analizador Léxico-Sintactico. Como ingenieros, nos destaca el saber hasta el más </w:t>
-      </w:r>
-      <w:r>
-        <w:rPr>
-          <w:noProof/>
-        </w:rPr>
-        <w:t>minimo</w:t>
-      </w:r>
-      <w:r>
-        <w:rPr>
-          <w:noProof/>
-        </w:rPr>
-        <w:t xml:space="preserve"> detalle detrás de las herramientas que utilizamos a diario, </w:t>
-      </w:r>
-      <w:r>
-        <w:rPr>
-          <w:noProof/>
-        </w:rPr>
-        <w:t>así como</w:t>
-      </w:r>
-      <w:r>
-        <w:rPr>
-          <w:noProof/>
-        </w:rPr>
-        <w:t xml:space="preserve"> también la lógica y reglas por la cuales se rigen.</w:t>
-      </w:r>
-      <w:r>
-        <w:rPr>
-          <w:noProof/>
-        </w:rPr>
-        <w:t xml:space="preserve"> </w:t>
-      </w:r>
-      <w:r>
-        <w:rPr>
-          <w:noProof/>
-        </w:rPr>
-        <w:t xml:space="preserve">Vamos a trabajar por fuera de la facultad, ya que </w:t>
-      </w:r>
-      <w:r>
-        <w:rPr>
-          <w:noProof/>
-        </w:rPr>
-        <w:t>los integrantes de nuestro equipo tenemos distintas actividades que nos dificultan la presencialidad y coordinar un horario de trabajo</w:t>
-      </w:r>
-      <w:r>
-        <w:rPr>
-          <w:noProof/>
-        </w:rPr>
-        <w:t xml:space="preserve">. Nos apoyamos de Git Hub para la colaboración de codigo, un grupo de WhatsApp donde compartimos novedades y avances del proyecto, así como la plataforma </w:t>
-      </w:r>
-      <w:r>
-        <w:rPr>
-          <w:noProof/>
-        </w:rPr>
-        <w:t>D</w:t>
-      </w:r>
-      <w:r>
-        <w:rPr>
-          <w:noProof/>
-        </w:rPr>
-        <w:t>iscord para reunirnos.</w:t>
-      </w:r>
-      <w:r>
-        <w:rPr>
-          <w:noProof/>
-        </w:rPr>
-        <w:t xml:space="preserve"> </w:t>
-      </w:r>
-      <w:r>
-        <w:rPr>
-          <w:noProof/>
-        </w:rPr>
-        <w:t xml:space="preserve">Nos comprotemos a </w:t>
-      </w:r>
-      <w:r>
-        <w:rPr>
-          <w:noProof/>
-        </w:rPr>
-        <w:t>realizar las entregas en tiempo y forma</w:t>
-      </w:r>
-      <w:r>
-        <w:rPr>
-          <w:noProof/>
-        </w:rPr>
-        <w:t>, teniendo la mejor calidad y cumpliendo los estandares deseados tanto por</w:t>
-      </w:r>
-      <w:r>
-        <w:rPr>
-          <w:noProof/>
-        </w:rPr>
-        <w:t xml:space="preserve"> </w:t>
-      </w:r>
-      <w:r>
-        <w:rPr>
-          <w:noProof/>
-        </w:rPr>
-        <w:t>la catedra como para nosotros mismos.</w:t>
+        <w:pStyle w:val="Ttulo2"/>
+        <w:rPr>
+          <w:noProof/>
+        </w:rPr>
+      </w:pPr>
+      <w:r>
+        <w:rPr>
+          <w:noProof/>
+        </w:rPr>
+        <w:t>Alianza.</w:t>
       </w:r>
     </w:p>
     <w:p>
       <w:pPr>
         <w:jc w:val="both"/>
+        <w:rPr>
+          <w:noProof/>
+        </w:rPr>
+      </w:pPr>
+      <w:r>
+        <w:rPr>
+          <w:noProof/>
+        </w:rPr>
+        <w:t>Somos los “Semanticos”, un grupo de estudiante</w:t>
+      </w:r>
+      <w:r>
+        <w:rPr>
+          <w:noProof/>
+        </w:rPr>
+        <w:t>s</w:t>
+      </w:r>
+      <w:r>
+        <w:rPr>
+          <w:noProof/>
+        </w:rPr>
+        <w:t xml:space="preserve"> de la carrera Ingeniera en Sistemas de Información perteneciente a la Universidad Tecnologica Nacional, en su </w:t>
+      </w:r>
+      <w:r>
+        <w:rPr>
+          <w:noProof/>
+        </w:rPr>
+        <w:t>r</w:t>
+      </w:r>
+      <w:r>
+        <w:rPr>
+          <w:noProof/>
+        </w:rPr>
+        <w:t>egional Resistencia. Nuestro objetivo es, no solamente aprobar la materia</w:t>
+      </w:r>
+      <w:r>
+        <w:rPr>
+          <w:noProof/>
+        </w:rPr>
+        <w:t xml:space="preserve"> (como objetivo grupal)</w:t>
+      </w:r>
+      <w:r>
+        <w:rPr>
+          <w:noProof/>
+        </w:rPr>
+        <w:t xml:space="preserve">, si no también entender la lógica y el funcionamiento detrás de un analizador Léxico-Sintactico. Como ingenieros, nos destaca el saber hasta el más </w:t>
+      </w:r>
+      <w:r>
+        <w:rPr>
+          <w:noProof/>
+        </w:rPr>
+        <w:t>minimo</w:t>
+      </w:r>
+      <w:r>
+        <w:rPr>
+          <w:noProof/>
+        </w:rPr>
+        <w:t xml:space="preserve"> detalle detrás de las herramientas que utilizamos a diario, </w:t>
+      </w:r>
+      <w:r>
+        <w:rPr>
+          <w:noProof/>
+        </w:rPr>
+        <w:t>así como</w:t>
+      </w:r>
+      <w:r>
+        <w:rPr>
+          <w:noProof/>
+        </w:rPr>
+        <w:t xml:space="preserve"> también la lógica y reglas por la cuales se rigen.</w:t>
+      </w:r>
+      <w:r>
+        <w:rPr>
+          <w:noProof/>
+        </w:rPr>
+        <w:t xml:space="preserve"> </w:t>
+      </w:r>
+      <w:r>
+        <w:rPr>
+          <w:noProof/>
+        </w:rPr>
+        <w:t xml:space="preserve">Vamos a trabajar por fuera de la facultad, ya que </w:t>
+      </w:r>
+      <w:r>
+        <w:rPr>
+          <w:noProof/>
+        </w:rPr>
+        <w:t>los integrantes de nuestro equipo tenemos distintas actividades que nos dificultan la presencialidad y coordinar un horario de trabajo</w:t>
+      </w:r>
+      <w:r>
+        <w:rPr>
+          <w:noProof/>
+        </w:rPr>
+        <w:t xml:space="preserve">. Nos apoyamos de Git Hub para la colaboración de codigo, un grupo de WhatsApp donde compartimos novedades y avances del proyecto, así como la plataforma </w:t>
+      </w:r>
+      <w:r>
+        <w:rPr>
+          <w:noProof/>
+        </w:rPr>
+        <w:t>D</w:t>
+      </w:r>
+      <w:r>
+        <w:rPr>
+          <w:noProof/>
+        </w:rPr>
+        <w:t>iscord para reunirnos.</w:t>
+      </w:r>
+      <w:r>
+        <w:rPr>
+          <w:noProof/>
+        </w:rPr>
+        <w:t xml:space="preserve"> </w:t>
+      </w:r>
+      <w:r>
+        <w:rPr>
+          <w:noProof/>
+        </w:rPr>
+        <w:t xml:space="preserve">Nos comprotemos a </w:t>
+      </w:r>
+      <w:r>
+        <w:rPr>
+          <w:noProof/>
+        </w:rPr>
+        <w:t>realizar las entregas en tiempo y forma</w:t>
+      </w:r>
+      <w:r>
+        <w:rPr>
+          <w:noProof/>
+        </w:rPr>
+        <w:t>, teniendo la mejor calidad y cumpliendo los estandares deseados tanto por</w:t>
+      </w:r>
+      <w:r>
+        <w:rPr>
+          <w:noProof/>
+        </w:rPr>
+        <w:t xml:space="preserve"> </w:t>
+      </w:r>
+      <w:r>
+        <w:rPr>
+          <w:noProof/>
+        </w:rPr>
+        <w:t>la catedra como para nosotros mismos.</w:t>
+      </w:r>
+    </w:p>
+    <w:p>
+      <w:pPr>
+        <w:pStyle w:val="Ttulo2"/>
         <w:rPr>
           <w:noProof/>
         </w:rPr>
@@ -823,11 +949,18 @@
           </w:tcPr>
           <w:p>
             <w:pPr>
-              <w:jc w:val="both"/>
-              <w:rPr>
-                <w:noProof/>
-              </w:rPr>
-            </w:pPr>
+              <w:jc w:val="center"/>
+              <w:rPr>
+                <w:noProof/>
+              </w:rPr>
+            </w:pPr>
+            <w:r>
+              <w:rPr>
+                <w:rFonts w:ascii="Segoe UI Symbol" w:hAnsi="Segoe UI Symbol" w:cs="Segoe UI Symbol"/>
+                <w:noProof/>
+              </w:rPr>
+              <w:t>★</w:t>
+            </w:r>
           </w:p>
         </w:tc>
         <w:tc>
@@ -836,11 +969,18 @@
           </w:tcPr>
           <w:p>
             <w:pPr>
-              <w:jc w:val="both"/>
-              <w:rPr>
-                <w:noProof/>
-              </w:rPr>
-            </w:pPr>
+              <w:jc w:val="center"/>
+              <w:rPr>
+                <w:noProof/>
+              </w:rPr>
+            </w:pPr>
+            <w:r>
+              <w:rPr>
+                <w:rFonts w:ascii="Segoe UI Symbol" w:hAnsi="Segoe UI Symbol" w:cs="Segoe UI Symbol"/>
+                <w:noProof/>
+              </w:rPr>
+              <w:t>★</w:t>
+            </w:r>
           </w:p>
         </w:tc>
         <w:tc>
@@ -849,11 +989,17 @@
           </w:tcPr>
           <w:p>
             <w:pPr>
-              <w:jc w:val="both"/>
-              <w:rPr>
-                <w:noProof/>
-              </w:rPr>
-            </w:pPr>
+              <w:jc w:val="center"/>
+              <w:rPr>
+                <w:noProof/>
+              </w:rPr>
+            </w:pPr>
+            <w:r>
+              <w:rPr>
+                <w:noProof/>
+              </w:rPr>
+              <w:t>●</w:t>
+            </w:r>
           </w:p>
         </w:tc>
         <w:tc>
@@ -862,11 +1008,17 @@
           </w:tcPr>
           <w:p>
             <w:pPr>
-              <w:jc w:val="both"/>
-              <w:rPr>
-                <w:noProof/>
-              </w:rPr>
-            </w:pPr>
+              <w:jc w:val="center"/>
+              <w:rPr>
+                <w:noProof/>
+              </w:rPr>
+            </w:pPr>
+            <w:r>
+              <w:rPr>
+                <w:noProof/>
+              </w:rPr>
+              <w:t>●</w:t>
+            </w:r>
           </w:p>
         </w:tc>
         <w:tc>
@@ -875,7 +1027,7 @@
           </w:tcPr>
           <w:p>
             <w:pPr>
-              <w:jc w:val="both"/>
+              <w:jc w:val="center"/>
               <w:rPr>
                 <w:noProof/>
               </w:rPr>
@@ -888,11 +1040,18 @@
           </w:tcPr>
           <w:p>
             <w:pPr>
-              <w:jc w:val="both"/>
-              <w:rPr>
-                <w:noProof/>
-              </w:rPr>
-            </w:pPr>
+              <w:jc w:val="center"/>
+              <w:rPr>
+                <w:noProof/>
+              </w:rPr>
+            </w:pPr>
+            <w:r>
+              <w:rPr>
+                <w:rFonts w:ascii="Segoe UI Symbol" w:hAnsi="Segoe UI Symbol" w:cs="Segoe UI Symbol"/>
+                <w:noProof/>
+              </w:rPr>
+              <w:t>★</w:t>
+            </w:r>
           </w:p>
         </w:tc>
       </w:tr>
@@ -1213,6 +1372,13 @@
                 <w:noProof/>
               </w:rPr>
             </w:pPr>
+            <w:r>
+              <w:rPr>
+                <w:rFonts w:ascii="Segoe UI Symbol" w:hAnsi="Segoe UI Symbol" w:cs="Segoe UI Symbol"/>
+                <w:noProof/>
+              </w:rPr>
+              <w:t>★</w:t>
+            </w:r>
           </w:p>
         </w:tc>
         <w:tc>
@@ -1226,6 +1392,12 @@
                 <w:noProof/>
               </w:rPr>
             </w:pPr>
+            <w:r>
+              <w:rPr>
+                <w:noProof/>
+              </w:rPr>
+              <w:t>●</w:t>
+            </w:r>
           </w:p>
         </w:tc>
         <w:tc>
@@ -1239,6 +1411,12 @@
                 <w:noProof/>
               </w:rPr>
             </w:pPr>
+            <w:r>
+              <w:rPr>
+                <w:noProof/>
+              </w:rPr>
+              <w:t>●</w:t>
+            </w:r>
           </w:p>
         </w:tc>
         <w:tc>
@@ -1252,6 +1430,13 @@
                 <w:noProof/>
               </w:rPr>
             </w:pPr>
+            <w:r>
+              <w:rPr>
+                <w:rFonts w:ascii="Segoe UI Symbol" w:hAnsi="Segoe UI Symbol" w:cs="Segoe UI Symbol"/>
+                <w:noProof/>
+              </w:rPr>
+              <w:t>★</w:t>
+            </w:r>
           </w:p>
         </w:tc>
         <w:tc>
@@ -1278,6 +1463,12 @@
                 <w:noProof/>
               </w:rPr>
             </w:pPr>
+            <w:r>
+              <w:rPr>
+                <w:noProof/>
+              </w:rPr>
+              <w:t>●</w:t>
+            </w:r>
           </w:p>
         </w:tc>
       </w:tr>
@@ -1432,2038 +1623,11 @@
         </w:rPr>
       </w:pPr>
     </w:p>
-    <w:p>
-      <w:pPr>
-        <w:pStyle w:val="Ttulo2"/>
-        <w:rPr>
-          <w:lang w:val="es-ES"/>
-        </w:rPr>
-      </w:pPr>
-      <w:r>
-        <w:rPr>
-          <w:lang w:val="es-ES"/>
-        </w:rPr>
-        <w:t>Palabras Reservadas:</w:t>
-      </w:r>
-    </w:p>
-    <w:p>
-      <w:pPr>
-        <w:pStyle w:val="Prrafodelista"/>
-        <w:numPr>
-          <w:ilvl w:val="0"/>
-          <w:numId w:val="3"/>
-        </w:numPr>
-      </w:pPr>
-      <w:r>
-        <w:t xml:space="preserve"> </w:t>
-      </w:r>
-      <w:proofErr w:type="gramStart"/>
-      <w:r>
-        <w:t>WHEN :</w:t>
-      </w:r>
-      <w:proofErr w:type="gramEnd"/>
-      <w:r>
-        <w:t xml:space="preserve"> Inicia un bloque disparado por evento. </w:t>
-      </w:r>
-    </w:p>
-    <w:p>
-      <w:pPr>
-        <w:pStyle w:val="Prrafodelista"/>
-        <w:numPr>
-          <w:ilvl w:val="0"/>
-          <w:numId w:val="3"/>
-        </w:numPr>
-      </w:pPr>
-      <w:r>
-        <w:t xml:space="preserve"> IF / THEN / </w:t>
-      </w:r>
-      <w:proofErr w:type="gramStart"/>
-      <w:r>
-        <w:t>ELSE :</w:t>
-      </w:r>
-      <w:proofErr w:type="gramEnd"/>
-      <w:r>
-        <w:t xml:space="preserve"> Estructuras condicionales. </w:t>
-      </w:r>
-    </w:p>
-    <w:p>
-      <w:pPr>
-        <w:pStyle w:val="Prrafodelista"/>
-        <w:numPr>
-          <w:ilvl w:val="0"/>
-          <w:numId w:val="3"/>
-        </w:numPr>
-      </w:pPr>
-      <w:r>
-        <w:t xml:space="preserve"> </w:t>
-      </w:r>
-      <w:proofErr w:type="gramStart"/>
-      <w:r>
-        <w:t>DO :</w:t>
-      </w:r>
-      <w:proofErr w:type="gramEnd"/>
-      <w:r>
-        <w:t xml:space="preserve"> Delimitador de inicio de acción. </w:t>
-      </w:r>
-    </w:p>
-    <w:p>
-      <w:pPr>
-        <w:pStyle w:val="Prrafodelista"/>
-        <w:numPr>
-          <w:ilvl w:val="0"/>
-          <w:numId w:val="3"/>
-        </w:numPr>
-      </w:pPr>
-      <w:r>
-        <w:t xml:space="preserve"> </w:t>
-      </w:r>
-      <w:proofErr w:type="gramStart"/>
-      <w:r>
-        <w:t>END :</w:t>
-      </w:r>
-      <w:proofErr w:type="gramEnd"/>
-      <w:r>
-        <w:t xml:space="preserve"> Finalización o cierre de bloque de acción </w:t>
-      </w:r>
-    </w:p>
-    <w:p>
-      <w:pPr>
-        <w:pStyle w:val="Prrafodelista"/>
-        <w:numPr>
-          <w:ilvl w:val="0"/>
-          <w:numId w:val="3"/>
-        </w:numPr>
-        <w:rPr>
-          <w:lang w:val="es-ES"/>
-        </w:rPr>
-      </w:pPr>
-      <w:r>
-        <w:t xml:space="preserve"> </w:t>
-      </w:r>
-      <w:proofErr w:type="gramStart"/>
-      <w:r>
-        <w:t>EVERY :</w:t>
-      </w:r>
-      <w:proofErr w:type="gramEnd"/>
-      <w:r>
-        <w:t xml:space="preserve"> Define una tarea programada por tiempo. </w:t>
-      </w:r>
-    </w:p>
-    <w:p>
-      <w:pPr>
-        <w:pStyle w:val="Ttulo2"/>
-        <w:rPr>
-          <w:lang w:val="es-ES"/>
-        </w:rPr>
-      </w:pPr>
-      <w:r>
-        <w:rPr>
-          <w:lang w:val="es-ES"/>
-        </w:rPr>
-        <w:t>Identificadores de Sensores, Dispositivos y Atributos</w:t>
-      </w:r>
-      <w:r>
-        <w:rPr>
-          <w:lang w:val="es-ES"/>
-        </w:rPr>
-        <w:t>:</w:t>
-      </w:r>
-    </w:p>
-    <w:p>
-      <w:pPr>
-        <w:pStyle w:val="Ttulo4"/>
-      </w:pPr>
-      <w:r>
-        <w:rPr>
-          <w:b/>
-          <w:bCs/>
-        </w:rPr>
-        <w:t>Sensores</w:t>
-      </w:r>
-      <w:r>
-        <w:t xml:space="preserve"> (Dispositivos de Entrada) </w:t>
-      </w:r>
-    </w:p>
-    <w:p>
-      <w:r>
-        <w:rPr>
-          <w:b/>
-          <w:bCs/>
-        </w:rPr>
-        <w:t xml:space="preserve">sensor_temp </w:t>
-      </w:r>
-      <w:r>
-        <w:t xml:space="preserve">Temperatura </w:t>
-      </w:r>
-      <w:r>
-        <w:rPr>
-          <w:b/>
-          <w:bCs/>
-        </w:rPr>
-        <w:t>°C -10.0 a 50.0</w:t>
-      </w:r>
-      <w:r>
-        <w:t xml:space="preserve"> Temperatura dentro de la casa. </w:t>
-      </w:r>
-    </w:p>
-    <w:p>
-      <w:r>
-        <w:rPr>
-          <w:b/>
-          <w:bCs/>
-        </w:rPr>
-        <w:t xml:space="preserve">sensor_humedad </w:t>
-      </w:r>
-      <w:r>
-        <w:t xml:space="preserve">Humedad </w:t>
-      </w:r>
-      <w:r>
-        <w:rPr>
-          <w:b/>
-          <w:bCs/>
-        </w:rPr>
-        <w:t>% 0% a 100%</w:t>
-      </w:r>
-      <w:r>
-        <w:t xml:space="preserve"> Nivel de humedad ambiental. </w:t>
-      </w:r>
-    </w:p>
-    <w:p>
-      <w:r>
-        <w:rPr>
-          <w:b/>
-          <w:bCs/>
-        </w:rPr>
-        <w:lastRenderedPageBreak/>
-        <w:t xml:space="preserve">sensor_luz </w:t>
-      </w:r>
-      <w:r>
-        <w:t xml:space="preserve">Iluminancia lux </w:t>
-      </w:r>
-      <w:r>
-        <w:rPr>
-          <w:b/>
-          <w:bCs/>
-        </w:rPr>
-        <w:t>0 a 1000</w:t>
-      </w:r>
-      <w:r>
-        <w:t xml:space="preserve"> Nivel de luz. </w:t>
-      </w:r>
-    </w:p>
-    <w:p>
-      <w:r>
-        <w:rPr>
-          <w:b/>
-          <w:bCs/>
-        </w:rPr>
-        <w:t xml:space="preserve">sensor_movimiento </w:t>
-      </w:r>
-      <w:r>
-        <w:t xml:space="preserve">Presencia </w:t>
-      </w:r>
-      <w:r>
-        <w:rPr>
-          <w:b/>
-          <w:bCs/>
-        </w:rPr>
-        <w:t>BOOL TRUE/FALSE</w:t>
-      </w:r>
-      <w:r>
-        <w:t xml:space="preserve"> Detecta si hay alguien en la sala. </w:t>
-      </w:r>
-    </w:p>
-    <w:p>
-      <w:r>
-        <w:rPr>
-          <w:b/>
-          <w:bCs/>
-        </w:rPr>
-        <w:t xml:space="preserve">sensor_humo </w:t>
-      </w:r>
-      <w:r>
-        <w:t xml:space="preserve">Seguridad </w:t>
-      </w:r>
-      <w:r>
-        <w:rPr>
-          <w:b/>
-          <w:bCs/>
-        </w:rPr>
-        <w:t>BOOL TRUE/FALSE</w:t>
-      </w:r>
-      <w:r>
-        <w:t xml:space="preserve"> Detector de incendios</w:t>
-      </w:r>
-    </w:p>
-    <w:p>
-      <w:pPr>
-        <w:pStyle w:val="Ttulo4"/>
-      </w:pPr>
-      <w:r>
-        <w:rPr>
-          <w:b/>
-          <w:bCs/>
-        </w:rPr>
-        <w:t xml:space="preserve">Actuadores </w:t>
-      </w:r>
-      <w:r>
-        <w:t xml:space="preserve">(Dispositivos de Salida) </w:t>
-      </w:r>
-    </w:p>
-    <w:p>
-      <w:r>
-        <w:t>Dispositivos:</w:t>
-      </w:r>
-    </w:p>
-    <w:p>
-      <w:pPr>
-        <w:pStyle w:val="Prrafodelista"/>
-        <w:numPr>
-          <w:ilvl w:val="0"/>
-          <w:numId w:val="3"/>
-        </w:numPr>
-      </w:pPr>
-      <w:r>
-        <w:t>FOCO</w:t>
-      </w:r>
-    </w:p>
-    <w:p>
-      <w:pPr>
-        <w:pStyle w:val="Prrafodelista"/>
-        <w:numPr>
-          <w:ilvl w:val="0"/>
-          <w:numId w:val="3"/>
-        </w:numPr>
-      </w:pPr>
-      <w:r>
-        <w:t>AIRE</w:t>
-      </w:r>
-    </w:p>
-    <w:p>
-      <w:pPr>
-        <w:pStyle w:val="Prrafodelista"/>
-        <w:numPr>
-          <w:ilvl w:val="0"/>
-          <w:numId w:val="3"/>
-        </w:numPr>
-      </w:pPr>
-      <w:r>
-        <w:t>PERSIANA</w:t>
-      </w:r>
-    </w:p>
-    <w:p>
-      <w:pPr>
-        <w:pStyle w:val="Prrafodelista"/>
-        <w:numPr>
-          <w:ilvl w:val="0"/>
-          <w:numId w:val="3"/>
-        </w:numPr>
-      </w:pPr>
-      <w:r>
-        <w:t>CERRADURA</w:t>
-      </w:r>
-    </w:p>
-    <w:p>
-      <w:pPr>
-        <w:pStyle w:val="Prrafodelista"/>
-        <w:numPr>
-          <w:ilvl w:val="0"/>
-          <w:numId w:val="3"/>
-        </w:numPr>
-      </w:pPr>
-      <w:r>
-        <w:t>RELOJS</w:t>
-      </w:r>
-    </w:p>
-    <w:p>
-      <w:pPr>
-        <w:pStyle w:val="Prrafodelista"/>
-        <w:numPr>
-          <w:ilvl w:val="0"/>
-          <w:numId w:val="3"/>
-        </w:numPr>
-      </w:pPr>
-      <w:r>
-        <w:t>ALARMA</w:t>
-      </w:r>
-    </w:p>
-    <w:p>
-      <w:pPr>
-        <w:pStyle w:val="Prrafodelista"/>
-        <w:numPr>
-          <w:ilvl w:val="0"/>
-          <w:numId w:val="3"/>
-        </w:numPr>
-      </w:pPr>
-      <w:r>
-        <w:t>ALTAVOZ</w:t>
-      </w:r>
-    </w:p>
-    <w:tbl>
-      <w:tblPr>
-        <w:tblStyle w:val="Tablaconcuadrcula"/>
-        <w:tblW w:w="9821" w:type="dxa"/>
-        <w:tblInd w:w="-491" w:type="dxa"/>
-        <w:tblLook w:val="04A0" w:firstRow="1" w:lastRow="0" w:firstColumn="1" w:lastColumn="0" w:noHBand="0" w:noVBand="1"/>
-      </w:tblPr>
-      <w:tblGrid>
-        <w:gridCol w:w="1744"/>
-        <w:gridCol w:w="1665"/>
-        <w:gridCol w:w="1632"/>
-        <w:gridCol w:w="2457"/>
-        <w:gridCol w:w="2323"/>
-      </w:tblGrid>
-      <w:tr>
-        <w:trPr>
-          <w:trHeight w:val="985"/>
-        </w:trPr>
-        <w:tc>
-          <w:tcPr>
-            <w:tcW w:w="1744" w:type="dxa"/>
-          </w:tcPr>
-          <w:p>
-            <w:pPr>
-              <w:rPr>
-                <w:highlight w:val="yellow"/>
-              </w:rPr>
-            </w:pPr>
-            <w:r>
-              <w:rPr>
-                <w:b/>
-                <w:bCs/>
-                <w:highlight w:val="yellow"/>
-              </w:rPr>
-              <w:t>Dispositivo</w:t>
-            </w:r>
-          </w:p>
-        </w:tc>
-        <w:tc>
-          <w:tcPr>
-            <w:tcW w:w="1665" w:type="dxa"/>
-          </w:tcPr>
-          <w:p>
-            <w:pPr>
-              <w:rPr>
-                <w:highlight w:val="yellow"/>
-              </w:rPr>
-            </w:pPr>
-            <w:r>
-              <w:rPr>
-                <w:highlight w:val="yellow"/>
-              </w:rPr>
-              <w:t>Atributo</w:t>
-            </w:r>
-          </w:p>
-        </w:tc>
-        <w:tc>
-          <w:tcPr>
-            <w:tcW w:w="1632" w:type="dxa"/>
-          </w:tcPr>
-          <w:p>
-            <w:pPr>
-              <w:rPr>
-                <w:highlight w:val="yellow"/>
-              </w:rPr>
-            </w:pPr>
-            <w:r>
-              <w:rPr>
-                <w:highlight w:val="yellow"/>
-              </w:rPr>
-              <w:t>Tipo de Dato</w:t>
-            </w:r>
-          </w:p>
-        </w:tc>
-        <w:tc>
-          <w:tcPr>
-            <w:tcW w:w="2457" w:type="dxa"/>
-          </w:tcPr>
-          <w:p>
-            <w:pPr>
-              <w:rPr>
-                <w:highlight w:val="yellow"/>
-              </w:rPr>
-            </w:pPr>
-            <w:r>
-              <w:rPr>
-                <w:highlight w:val="yellow"/>
-              </w:rPr>
-              <w:t>Rango / Valores</w:t>
-            </w:r>
-          </w:p>
-        </w:tc>
-        <w:tc>
-          <w:tcPr>
-            <w:tcW w:w="2323" w:type="dxa"/>
-          </w:tcPr>
-          <w:p>
-            <w:pPr>
-              <w:rPr>
-                <w:highlight w:val="yellow"/>
-              </w:rPr>
-            </w:pPr>
-            <w:r>
-              <w:rPr>
-                <w:highlight w:val="yellow"/>
-              </w:rPr>
-              <w:t>Permisos</w:t>
-            </w:r>
-          </w:p>
-        </w:tc>
-      </w:tr>
-      <w:tr>
-        <w:trPr>
-          <w:trHeight w:val="476"/>
-        </w:trPr>
-        <w:tc>
-          <w:tcPr>
-            <w:tcW w:w="1744" w:type="dxa"/>
-          </w:tcPr>
-          <w:p>
-            <w:r>
-              <w:rPr>
-                <w:b/>
-                <w:bCs/>
-              </w:rPr>
-              <w:t>foco_</w:t>
-            </w:r>
-          </w:p>
-        </w:tc>
-        <w:tc>
-          <w:tcPr>
-            <w:tcW w:w="1665" w:type="dxa"/>
-          </w:tcPr>
-          <w:p>
-            <w:proofErr w:type="gramStart"/>
-            <w:r>
-              <w:t>.estado</w:t>
-            </w:r>
-            <w:proofErr w:type="gramEnd"/>
-          </w:p>
-        </w:tc>
-        <w:tc>
-          <w:tcPr>
-            <w:tcW w:w="1632" w:type="dxa"/>
-          </w:tcPr>
-          <w:p>
-            <w:r>
-              <w:t>BOOL</w:t>
-            </w:r>
-          </w:p>
-        </w:tc>
-        <w:tc>
-          <w:tcPr>
-            <w:tcW w:w="2457" w:type="dxa"/>
-          </w:tcPr>
-          <w:p>
-            <w:r>
-              <w:t>ON, OFF</w:t>
-            </w:r>
-          </w:p>
-        </w:tc>
-        <w:tc>
-          <w:tcPr>
-            <w:tcW w:w="2323" w:type="dxa"/>
-          </w:tcPr>
-          <w:p>
-            <w:r>
-              <w:t>Lectura/Escritura</w:t>
-            </w:r>
-          </w:p>
-        </w:tc>
-      </w:tr>
-      <w:tr>
-        <w:trPr>
-          <w:trHeight w:val="476"/>
-        </w:trPr>
-        <w:tc>
-          <w:tcPr>
-            <w:tcW w:w="1744" w:type="dxa"/>
-          </w:tcPr>
-          <w:p/>
-        </w:tc>
-        <w:tc>
-          <w:tcPr>
-            <w:tcW w:w="1665" w:type="dxa"/>
-          </w:tcPr>
-          <w:p>
-            <w:proofErr w:type="gramStart"/>
-            <w:r>
-              <w:t>.brillo</w:t>
-            </w:r>
-            <w:proofErr w:type="gramEnd"/>
-          </w:p>
-        </w:tc>
-        <w:tc>
-          <w:tcPr>
-            <w:tcW w:w="1632" w:type="dxa"/>
-          </w:tcPr>
-          <w:p>
-            <w:r>
-              <w:t>PERCENT</w:t>
-            </w:r>
-          </w:p>
-        </w:tc>
-        <w:tc>
-          <w:tcPr>
-            <w:tcW w:w="2457" w:type="dxa"/>
-          </w:tcPr>
-          <w:p>
-            <w:r>
-              <w:t>0% a 100%</w:t>
-            </w:r>
-          </w:p>
-        </w:tc>
-        <w:tc>
-          <w:tcPr>
-            <w:tcW w:w="2323" w:type="dxa"/>
-          </w:tcPr>
-          <w:p>
-            <w:r>
-              <w:t>Lectura/Escritura</w:t>
-            </w:r>
-          </w:p>
-        </w:tc>
-      </w:tr>
-      <w:tr>
-        <w:trPr>
-          <w:trHeight w:val="476"/>
-        </w:trPr>
-        <w:tc>
-          <w:tcPr>
-            <w:tcW w:w="1744" w:type="dxa"/>
-          </w:tcPr>
-          <w:p/>
-        </w:tc>
-        <w:tc>
-          <w:tcPr>
-            <w:tcW w:w="1665" w:type="dxa"/>
-          </w:tcPr>
-          <w:p>
-            <w:proofErr w:type="gramStart"/>
-            <w:r>
-              <w:t>.color</w:t>
-            </w:r>
-            <w:proofErr w:type="gramEnd"/>
-          </w:p>
-        </w:tc>
-        <w:tc>
-          <w:tcPr>
-            <w:tcW w:w="1632" w:type="dxa"/>
-          </w:tcPr>
-          <w:p>
-            <w:r>
-              <w:t>NOMBRE</w:t>
-            </w:r>
-          </w:p>
-        </w:tc>
-        <w:tc>
-          <w:tcPr>
-            <w:tcW w:w="2457" w:type="dxa"/>
-          </w:tcPr>
-          <w:p>
-            <w:proofErr w:type="spellStart"/>
-            <w:proofErr w:type="gramStart"/>
-            <w:r>
-              <w:t>blanco,rojo</w:t>
-            </w:r>
-            <w:proofErr w:type="gramEnd"/>
-            <w:r>
-              <w:t>,azul</w:t>
-            </w:r>
-            <w:proofErr w:type="spellEnd"/>
-          </w:p>
-        </w:tc>
-        <w:tc>
-          <w:tcPr>
-            <w:tcW w:w="2323" w:type="dxa"/>
-          </w:tcPr>
-          <w:p>
-            <w:r>
-              <w:t>Lectura/Escritura</w:t>
-            </w:r>
-          </w:p>
-        </w:tc>
-      </w:tr>
-      <w:tr>
-        <w:trPr>
-          <w:trHeight w:val="504"/>
-        </w:trPr>
-        <w:tc>
-          <w:tcPr>
-            <w:tcW w:w="1744" w:type="dxa"/>
-          </w:tcPr>
-          <w:p>
-            <w:r>
-              <w:rPr>
-                <w:b/>
-                <w:bCs/>
-              </w:rPr>
-              <w:t>aire_</w:t>
-            </w:r>
-          </w:p>
-        </w:tc>
-        <w:tc>
-          <w:tcPr>
-            <w:tcW w:w="1665" w:type="dxa"/>
-          </w:tcPr>
-          <w:p>
-            <w:proofErr w:type="gramStart"/>
-            <w:r>
-              <w:t>.estado</w:t>
-            </w:r>
-            <w:proofErr w:type="gramEnd"/>
-          </w:p>
-        </w:tc>
-        <w:tc>
-          <w:tcPr>
-            <w:tcW w:w="1632" w:type="dxa"/>
-          </w:tcPr>
-          <w:p>
-            <w:r>
-              <w:t>BOOL</w:t>
-            </w:r>
-          </w:p>
-        </w:tc>
-        <w:tc>
-          <w:tcPr>
-            <w:tcW w:w="2457" w:type="dxa"/>
-          </w:tcPr>
-          <w:p>
-            <w:r>
-              <w:t>ON, OFF</w:t>
-            </w:r>
-          </w:p>
-        </w:tc>
-        <w:tc>
-          <w:tcPr>
-            <w:tcW w:w="2323" w:type="dxa"/>
-          </w:tcPr>
-          <w:p>
-            <w:r>
-              <w:t>Lectura/Escritura</w:t>
-            </w:r>
-          </w:p>
-        </w:tc>
-      </w:tr>
-      <w:tr>
-        <w:trPr>
-          <w:trHeight w:val="476"/>
-        </w:trPr>
-        <w:tc>
-          <w:tcPr>
-            <w:tcW w:w="1744" w:type="dxa"/>
-          </w:tcPr>
-          <w:p/>
-        </w:tc>
-        <w:tc>
-          <w:tcPr>
-            <w:tcW w:w="1665" w:type="dxa"/>
-          </w:tcPr>
-          <w:p>
-            <w:proofErr w:type="gramStart"/>
-            <w:r>
-              <w:t>.modo</w:t>
-            </w:r>
-            <w:proofErr w:type="gramEnd"/>
-          </w:p>
-        </w:tc>
-        <w:tc>
-          <w:tcPr>
-            <w:tcW w:w="1632" w:type="dxa"/>
-          </w:tcPr>
-          <w:p>
-            <w:r>
-              <w:t xml:space="preserve">DISCRETO </w:t>
-            </w:r>
-          </w:p>
-        </w:tc>
-        <w:tc>
-          <w:tcPr>
-            <w:tcW w:w="2457" w:type="dxa"/>
-          </w:tcPr>
-          <w:p>
-            <w:proofErr w:type="gramStart"/>
-            <w:r>
-              <w:t>FRIO,CALOR</w:t>
-            </w:r>
-            <w:proofErr w:type="gramEnd"/>
-            <w:r>
-              <w:t>,VENT</w:t>
-            </w:r>
-          </w:p>
-        </w:tc>
-        <w:tc>
-          <w:tcPr>
-            <w:tcW w:w="2323" w:type="dxa"/>
-          </w:tcPr>
-          <w:p>
-            <w:r>
-              <w:t>Lectura/Escritura</w:t>
-            </w:r>
-          </w:p>
-        </w:tc>
-      </w:tr>
-      <w:tr>
-        <w:trPr>
-          <w:trHeight w:val="476"/>
-        </w:trPr>
-        <w:tc>
-          <w:tcPr>
-            <w:tcW w:w="1744" w:type="dxa"/>
-          </w:tcPr>
-          <w:p/>
-        </w:tc>
-        <w:tc>
-          <w:tcPr>
-            <w:tcW w:w="1665" w:type="dxa"/>
-          </w:tcPr>
-          <w:p>
-            <w:proofErr w:type="gramStart"/>
-            <w:r>
-              <w:t>.</w:t>
-            </w:r>
-            <w:proofErr w:type="spellStart"/>
-            <w:r>
-              <w:t>temp</w:t>
-            </w:r>
-            <w:proofErr w:type="gramEnd"/>
-            <w:r>
-              <w:t>_obj</w:t>
-            </w:r>
-            <w:proofErr w:type="spellEnd"/>
-          </w:p>
-        </w:tc>
-        <w:tc>
-          <w:tcPr>
-            <w:tcW w:w="1632" w:type="dxa"/>
-          </w:tcPr>
-          <w:p>
-            <w:r>
-              <w:t>TEMP</w:t>
-            </w:r>
-          </w:p>
-        </w:tc>
-        <w:tc>
-          <w:tcPr>
-            <w:tcW w:w="2457" w:type="dxa"/>
-          </w:tcPr>
-          <w:p>
-            <w:r>
-              <w:t>16°C a 30°C</w:t>
-            </w:r>
-          </w:p>
-        </w:tc>
-        <w:tc>
-          <w:tcPr>
-            <w:tcW w:w="2323" w:type="dxa"/>
-          </w:tcPr>
-          <w:p>
-            <w:r>
-              <w:t>Lectura/Escritura</w:t>
-            </w:r>
-          </w:p>
-        </w:tc>
-      </w:tr>
-      <w:tr>
-        <w:trPr>
-          <w:trHeight w:val="476"/>
-        </w:trPr>
-        <w:tc>
-          <w:tcPr>
-            <w:tcW w:w="1744" w:type="dxa"/>
-          </w:tcPr>
-          <w:p/>
-        </w:tc>
-        <w:tc>
-          <w:tcPr>
-            <w:tcW w:w="1665" w:type="dxa"/>
-          </w:tcPr>
-          <w:p>
-            <w:proofErr w:type="gramStart"/>
-            <w:r>
-              <w:t>.</w:t>
-            </w:r>
-            <w:proofErr w:type="spellStart"/>
-            <w:r>
-              <w:t>temp</w:t>
-            </w:r>
-            <w:proofErr w:type="gramEnd"/>
-            <w:r>
-              <w:t>_act</w:t>
-            </w:r>
-            <w:proofErr w:type="spellEnd"/>
-          </w:p>
-        </w:tc>
-        <w:tc>
-          <w:tcPr>
-            <w:tcW w:w="1632" w:type="dxa"/>
-          </w:tcPr>
-          <w:p>
-            <w:r>
-              <w:t>TEMP</w:t>
-            </w:r>
-          </w:p>
-        </w:tc>
-        <w:tc>
-          <w:tcPr>
-            <w:tcW w:w="2457" w:type="dxa"/>
-          </w:tcPr>
-          <w:p>
-            <w:r>
-              <w:t>-10°C a 50°C</w:t>
-            </w:r>
-          </w:p>
-        </w:tc>
-        <w:tc>
-          <w:tcPr>
-            <w:tcW w:w="2323" w:type="dxa"/>
-          </w:tcPr>
-          <w:p>
-            <w:r>
-              <w:t>Solo Lectura</w:t>
-            </w:r>
-          </w:p>
-        </w:tc>
-      </w:tr>
-      <w:tr>
-        <w:trPr>
-          <w:trHeight w:val="476"/>
-        </w:trPr>
-        <w:tc>
-          <w:tcPr>
-            <w:tcW w:w="1744" w:type="dxa"/>
-          </w:tcPr>
-          <w:p>
-            <w:r>
-              <w:rPr>
-                <w:b/>
-                <w:bCs/>
-              </w:rPr>
-              <w:t>persiana_</w:t>
-            </w:r>
-          </w:p>
-        </w:tc>
-        <w:tc>
-          <w:tcPr>
-            <w:tcW w:w="1665" w:type="dxa"/>
-          </w:tcPr>
-          <w:p>
-            <w:proofErr w:type="gramStart"/>
-            <w:r>
-              <w:t>.posición</w:t>
-            </w:r>
-            <w:proofErr w:type="gramEnd"/>
-          </w:p>
-        </w:tc>
-        <w:tc>
-          <w:tcPr>
-            <w:tcW w:w="1632" w:type="dxa"/>
-          </w:tcPr>
-          <w:p>
-            <w:r>
-              <w:t>PERCENT</w:t>
-            </w:r>
-          </w:p>
-        </w:tc>
-        <w:tc>
-          <w:tcPr>
-            <w:tcW w:w="2457" w:type="dxa"/>
-          </w:tcPr>
-          <w:p>
-            <w:r>
-              <w:t>0% a 100%</w:t>
-            </w:r>
-          </w:p>
-        </w:tc>
-        <w:tc>
-          <w:tcPr>
-            <w:tcW w:w="2323" w:type="dxa"/>
-          </w:tcPr>
-          <w:p>
-            <w:r>
-              <w:t>Lectura/Escritura</w:t>
-            </w:r>
-          </w:p>
-        </w:tc>
-      </w:tr>
-      <w:tr>
-        <w:trPr>
-          <w:trHeight w:val="504"/>
-        </w:trPr>
-        <w:tc>
-          <w:tcPr>
-            <w:tcW w:w="1744" w:type="dxa"/>
-          </w:tcPr>
-          <w:p>
-            <w:r>
-              <w:rPr>
-                <w:b/>
-                <w:bCs/>
-              </w:rPr>
-              <w:t>cerradura_</w:t>
-            </w:r>
-          </w:p>
-        </w:tc>
-        <w:tc>
-          <w:tcPr>
-            <w:tcW w:w="1665" w:type="dxa"/>
-          </w:tcPr>
-          <w:p>
-            <w:proofErr w:type="gramStart"/>
-            <w:r>
-              <w:t>.estado</w:t>
-            </w:r>
-            <w:proofErr w:type="gramEnd"/>
-          </w:p>
-        </w:tc>
-        <w:tc>
-          <w:tcPr>
-            <w:tcW w:w="1632" w:type="dxa"/>
-          </w:tcPr>
-          <w:p>
-            <w:r>
-              <w:t>BOOL</w:t>
-            </w:r>
-          </w:p>
-        </w:tc>
-        <w:tc>
-          <w:tcPr>
-            <w:tcW w:w="2457" w:type="dxa"/>
-          </w:tcPr>
-          <w:p>
-            <w:r>
-              <w:t>ON, OFF</w:t>
-            </w:r>
-          </w:p>
-        </w:tc>
-        <w:tc>
-          <w:tcPr>
-            <w:tcW w:w="2323" w:type="dxa"/>
-          </w:tcPr>
-          <w:p>
-            <w:r>
-              <w:t>Lectura/Escritura</w:t>
-            </w:r>
-          </w:p>
-        </w:tc>
-      </w:tr>
-      <w:tr>
-        <w:trPr>
-          <w:trHeight w:val="476"/>
-        </w:trPr>
-        <w:tc>
-          <w:tcPr>
-            <w:tcW w:w="1744" w:type="dxa"/>
-          </w:tcPr>
-          <w:p>
-            <w:r>
-              <w:rPr>
-                <w:b/>
-                <w:bCs/>
-              </w:rPr>
-              <w:t>reloj_</w:t>
-            </w:r>
-          </w:p>
-        </w:tc>
-        <w:tc>
-          <w:tcPr>
-            <w:tcW w:w="1665" w:type="dxa"/>
-          </w:tcPr>
-          <w:p>
-            <w:proofErr w:type="gramStart"/>
-            <w:r>
-              <w:t>.hora</w:t>
-            </w:r>
-            <w:proofErr w:type="gramEnd"/>
-          </w:p>
-        </w:tc>
-        <w:tc>
-          <w:tcPr>
-            <w:tcW w:w="1632" w:type="dxa"/>
-          </w:tcPr>
-          <w:p>
-            <w:r>
-              <w:t>TIME</w:t>
-            </w:r>
-          </w:p>
-        </w:tc>
-        <w:tc>
-          <w:tcPr>
-            <w:tcW w:w="2457" w:type="dxa"/>
-          </w:tcPr>
-          <w:p>
-            <w:r>
-              <w:t>00:00 a 23:59</w:t>
-            </w:r>
-          </w:p>
-        </w:tc>
-        <w:tc>
-          <w:tcPr>
-            <w:tcW w:w="2323" w:type="dxa"/>
-          </w:tcPr>
-          <w:p>
-            <w:r>
-              <w:t>Solo Lectura</w:t>
-            </w:r>
-          </w:p>
-        </w:tc>
-      </w:tr>
-      <w:tr>
-        <w:trPr>
-          <w:trHeight w:val="960"/>
-        </w:trPr>
-        <w:tc>
-          <w:tcPr>
-            <w:tcW w:w="1744" w:type="dxa"/>
-          </w:tcPr>
-          <w:p/>
-        </w:tc>
-        <w:tc>
-          <w:tcPr>
-            <w:tcW w:w="1665" w:type="dxa"/>
-          </w:tcPr>
-          <w:p>
-            <w:proofErr w:type="gramStart"/>
-            <w:r>
-              <w:t>.fecha</w:t>
-            </w:r>
-            <w:proofErr w:type="gramEnd"/>
-          </w:p>
-        </w:tc>
-        <w:tc>
-          <w:tcPr>
-            <w:tcW w:w="1632" w:type="dxa"/>
-          </w:tcPr>
-          <w:p>
-            <w:r>
-              <w:t>DATE</w:t>
-            </w:r>
-          </w:p>
-        </w:tc>
-        <w:tc>
-          <w:tcPr>
-            <w:tcW w:w="2457" w:type="dxa"/>
-          </w:tcPr>
-          <w:p>
-            <w:r>
-              <w:t>01/01/2000 a 31/12/2099</w:t>
-            </w:r>
-          </w:p>
-        </w:tc>
-        <w:tc>
-          <w:tcPr>
-            <w:tcW w:w="2323" w:type="dxa"/>
-          </w:tcPr>
-          <w:p>
-            <w:r>
-              <w:t>Solo Lectura</w:t>
-            </w:r>
-          </w:p>
-        </w:tc>
-      </w:tr>
-      <w:tr>
-        <w:trPr>
-          <w:trHeight w:val="504"/>
-        </w:trPr>
-        <w:tc>
-          <w:tcPr>
-            <w:tcW w:w="1744" w:type="dxa"/>
-          </w:tcPr>
-          <w:p>
-            <w:r>
-              <w:rPr>
-                <w:b/>
-                <w:bCs/>
-              </w:rPr>
-              <w:t xml:space="preserve">altavoz_ </w:t>
-            </w:r>
-          </w:p>
-        </w:tc>
-        <w:tc>
-          <w:tcPr>
-            <w:tcW w:w="1665" w:type="dxa"/>
-          </w:tcPr>
-          <w:p>
-            <w:proofErr w:type="gramStart"/>
-            <w:r>
-              <w:t>.volumen</w:t>
-            </w:r>
-            <w:proofErr w:type="gramEnd"/>
-          </w:p>
-        </w:tc>
-        <w:tc>
-          <w:tcPr>
-            <w:tcW w:w="1632" w:type="dxa"/>
-          </w:tcPr>
-          <w:p>
-            <w:r>
-              <w:t>PERCENT</w:t>
-            </w:r>
-          </w:p>
-        </w:tc>
-        <w:tc>
-          <w:tcPr>
-            <w:tcW w:w="2457" w:type="dxa"/>
-          </w:tcPr>
-          <w:p>
-            <w:r>
-              <w:t>0% a 100%</w:t>
-            </w:r>
-          </w:p>
-        </w:tc>
-        <w:tc>
-          <w:tcPr>
-            <w:tcW w:w="2323" w:type="dxa"/>
-          </w:tcPr>
-          <w:p>
-            <w:r>
-              <w:t>Lectura/Escritura</w:t>
-            </w:r>
-          </w:p>
-        </w:tc>
-      </w:tr>
-      <w:tr>
-        <w:trPr>
-          <w:trHeight w:val="476"/>
-        </w:trPr>
-        <w:tc>
-          <w:tcPr>
-            <w:tcW w:w="1744" w:type="dxa"/>
-          </w:tcPr>
-          <w:p/>
-        </w:tc>
-        <w:tc>
-          <w:tcPr>
-            <w:tcW w:w="1665" w:type="dxa"/>
-          </w:tcPr>
-          <w:p>
-            <w:proofErr w:type="gramStart"/>
-            <w:r>
-              <w:t>.mute</w:t>
-            </w:r>
-            <w:proofErr w:type="gramEnd"/>
-          </w:p>
-        </w:tc>
-        <w:tc>
-          <w:tcPr>
-            <w:tcW w:w="1632" w:type="dxa"/>
-          </w:tcPr>
-          <w:p>
-            <w:r>
-              <w:t>BOOL</w:t>
-            </w:r>
-          </w:p>
-        </w:tc>
-        <w:tc>
-          <w:tcPr>
-            <w:tcW w:w="2457" w:type="dxa"/>
-          </w:tcPr>
-          <w:p>
-            <w:r>
-              <w:t>ON, OFF</w:t>
-            </w:r>
-          </w:p>
-        </w:tc>
-        <w:tc>
-          <w:tcPr>
-            <w:tcW w:w="2323" w:type="dxa"/>
-          </w:tcPr>
-          <w:p>
-            <w:r>
-              <w:t>Lectura/Escritura</w:t>
-            </w:r>
-          </w:p>
-        </w:tc>
-      </w:tr>
-      <w:tr>
-        <w:trPr>
-          <w:trHeight w:val="476"/>
-        </w:trPr>
-        <w:tc>
-          <w:tcPr>
-            <w:tcW w:w="1744" w:type="dxa"/>
-          </w:tcPr>
-          <w:p/>
-        </w:tc>
-        <w:tc>
-          <w:tcPr>
-            <w:tcW w:w="1665" w:type="dxa"/>
-          </w:tcPr>
-          <w:p>
-            <w:proofErr w:type="gramStart"/>
-            <w:r>
-              <w:t>.mensaje</w:t>
-            </w:r>
-            <w:proofErr w:type="gramEnd"/>
-          </w:p>
-        </w:tc>
-        <w:tc>
-          <w:tcPr>
-            <w:tcW w:w="1632" w:type="dxa"/>
-          </w:tcPr>
-          <w:p>
-            <w:r>
-              <w:t>texto</w:t>
-            </w:r>
-          </w:p>
-        </w:tc>
-        <w:tc>
-          <w:tcPr>
-            <w:tcW w:w="2457" w:type="dxa"/>
-          </w:tcPr>
-          <w:p/>
-        </w:tc>
-        <w:tc>
-          <w:tcPr>
-            <w:tcW w:w="2323" w:type="dxa"/>
-          </w:tcPr>
-          <w:p>
-            <w:r>
-              <w:t>Lectura/Escritura</w:t>
-            </w:r>
-          </w:p>
-        </w:tc>
-      </w:tr>
-      <w:tr>
-        <w:trPr>
-          <w:trHeight w:val="476"/>
-        </w:trPr>
-        <w:tc>
-          <w:tcPr>
-            <w:tcW w:w="1744" w:type="dxa"/>
-          </w:tcPr>
-          <w:p/>
-        </w:tc>
-        <w:tc>
-          <w:tcPr>
-            <w:tcW w:w="1665" w:type="dxa"/>
-          </w:tcPr>
-          <w:p>
-            <w:proofErr w:type="gramStart"/>
-            <w:r>
-              <w:t>.</w:t>
-            </w:r>
-            <w:proofErr w:type="spellStart"/>
-            <w:r>
-              <w:t>email</w:t>
-            </w:r>
-            <w:proofErr w:type="gramEnd"/>
-            <w:r>
-              <w:t>_notif</w:t>
-            </w:r>
-            <w:proofErr w:type="spellEnd"/>
-          </w:p>
-        </w:tc>
-        <w:tc>
-          <w:tcPr>
-            <w:tcW w:w="1632" w:type="dxa"/>
-          </w:tcPr>
-          <w:p>
-            <w:r>
-              <w:t>email</w:t>
-            </w:r>
-          </w:p>
-        </w:tc>
-        <w:tc>
-          <w:tcPr>
-            <w:tcW w:w="2457" w:type="dxa"/>
-          </w:tcPr>
-          <w:p/>
-        </w:tc>
-        <w:tc>
-          <w:tcPr>
-            <w:tcW w:w="2323" w:type="dxa"/>
-          </w:tcPr>
-          <w:p>
-            <w:r>
-              <w:t>Lectura/Escritura</w:t>
-            </w:r>
-          </w:p>
-        </w:tc>
-      </w:tr>
-      <w:tr>
-        <w:trPr>
-          <w:trHeight w:val="476"/>
-        </w:trPr>
-        <w:tc>
-          <w:tcPr>
-            <w:tcW w:w="1744" w:type="dxa"/>
-          </w:tcPr>
-          <w:p>
-            <w:r>
-              <w:rPr>
-                <w:b/>
-                <w:bCs/>
-              </w:rPr>
-              <w:t>alarma_</w:t>
-            </w:r>
-          </w:p>
-        </w:tc>
-        <w:tc>
-          <w:tcPr>
-            <w:tcW w:w="1665" w:type="dxa"/>
-          </w:tcPr>
-          <w:p>
-            <w:proofErr w:type="gramStart"/>
-            <w:r>
-              <w:t>.estado</w:t>
-            </w:r>
-            <w:proofErr w:type="gramEnd"/>
-          </w:p>
-        </w:tc>
-        <w:tc>
-          <w:tcPr>
-            <w:tcW w:w="1632" w:type="dxa"/>
-          </w:tcPr>
-          <w:p>
-            <w:r>
-              <w:t>BOOL</w:t>
-            </w:r>
-          </w:p>
-        </w:tc>
-        <w:tc>
-          <w:tcPr>
-            <w:tcW w:w="2457" w:type="dxa"/>
-          </w:tcPr>
-          <w:p>
-            <w:r>
-              <w:t>ON, OFF</w:t>
-            </w:r>
-          </w:p>
-        </w:tc>
-        <w:tc>
-          <w:tcPr>
-            <w:tcW w:w="2323" w:type="dxa"/>
-          </w:tcPr>
-          <w:p>
-            <w:r>
-              <w:t>Lectura/Escritura</w:t>
-            </w:r>
-          </w:p>
-        </w:tc>
-      </w:tr>
-      <w:tr>
-        <w:trPr>
-          <w:trHeight w:val="476"/>
-        </w:trPr>
-        <w:tc>
-          <w:tcPr>
-            <w:tcW w:w="1744" w:type="dxa"/>
-          </w:tcPr>
-          <w:p>
-            <w:pPr>
-              <w:rPr>
-                <w:b/>
-                <w:bCs/>
-              </w:rPr>
-            </w:pPr>
-          </w:p>
-        </w:tc>
-        <w:tc>
-          <w:tcPr>
-            <w:tcW w:w="1665" w:type="dxa"/>
-          </w:tcPr>
-          <w:p>
-            <w:proofErr w:type="gramStart"/>
-            <w:r>
-              <w:t>.activada</w:t>
-            </w:r>
-            <w:proofErr w:type="gramEnd"/>
-          </w:p>
-        </w:tc>
-        <w:tc>
-          <w:tcPr>
-            <w:tcW w:w="1632" w:type="dxa"/>
-          </w:tcPr>
-          <w:p>
-            <w:r>
-              <w:t xml:space="preserve">BOOL </w:t>
-            </w:r>
-          </w:p>
-        </w:tc>
-        <w:tc>
-          <w:tcPr>
-            <w:tcW w:w="2457" w:type="dxa"/>
-          </w:tcPr>
-          <w:p>
-            <w:r>
-              <w:t>ON, OFF</w:t>
-            </w:r>
-          </w:p>
-        </w:tc>
-        <w:tc>
-          <w:tcPr>
-            <w:tcW w:w="2323" w:type="dxa"/>
-          </w:tcPr>
-          <w:p>
-            <w:r>
-              <w:t>Lectura/Escritura</w:t>
-            </w:r>
-          </w:p>
-        </w:tc>
-      </w:tr>
-    </w:tbl>
     <w:p/>
     <w:p>
       <w:pPr>
-        <w:pStyle w:val="Ttulo4"/>
-        <w:rPr>
-          <w:b/>
-          <w:bCs/>
-        </w:rPr>
-      </w:pPr>
-      <w:r>
-        <w:rPr>
-          <w:b/>
-          <w:bCs/>
-        </w:rPr>
-        <w:t>Operadores y Delimitadores:</w:t>
-      </w:r>
-    </w:p>
-    <w:p>
-      <w:pPr>
-        <w:pStyle w:val="Prrafodelista"/>
-        <w:numPr>
-          <w:ilvl w:val="0"/>
-          <w:numId w:val="3"/>
-        </w:numPr>
-      </w:pPr>
-      <w:r>
-        <w:rPr>
-          <w:b/>
-          <w:bCs/>
-        </w:rPr>
-        <w:t>Comparación</w:t>
-      </w:r>
-      <w:r>
-        <w:t>: ==</w:t>
-      </w:r>
-      <w:proofErr w:type="gramStart"/>
-      <w:r>
-        <w:t>, !</w:t>
-      </w:r>
-      <w:proofErr w:type="gramEnd"/>
-      <w:r>
-        <w:t>=, &gt;, &lt;, &gt;=, &lt;=</w:t>
-      </w:r>
-    </w:p>
-    <w:p>
-      <w:pPr>
-        <w:pStyle w:val="Prrafodelista"/>
-        <w:numPr>
-          <w:ilvl w:val="0"/>
-          <w:numId w:val="3"/>
-        </w:numPr>
-      </w:pPr>
-      <w:proofErr w:type="spellStart"/>
-      <w:r>
-        <w:rPr>
-          <w:b/>
-          <w:bCs/>
-        </w:rPr>
-        <w:t>Logicos</w:t>
-      </w:r>
-      <w:proofErr w:type="spellEnd"/>
-      <w:r>
-        <w:t>:</w:t>
-      </w:r>
-      <w:r>
-        <w:t xml:space="preserve"> AND, OR, NOT</w:t>
-      </w:r>
-    </w:p>
-    <w:p>
-      <w:pPr>
-        <w:pStyle w:val="Prrafodelista"/>
-        <w:numPr>
-          <w:ilvl w:val="0"/>
-          <w:numId w:val="3"/>
-        </w:numPr>
-      </w:pPr>
-      <w:r>
-        <w:rPr>
-          <w:b/>
-          <w:bCs/>
-        </w:rPr>
-        <w:t>Asignación</w:t>
-      </w:r>
-      <w:r>
-        <w:t>:</w:t>
-      </w:r>
-      <w:r>
-        <w:t xml:space="preserve"> =</w:t>
-      </w:r>
-    </w:p>
-    <w:p>
-      <w:pPr>
-        <w:pStyle w:val="Prrafodelista"/>
-        <w:numPr>
-          <w:ilvl w:val="0"/>
-          <w:numId w:val="3"/>
-        </w:numPr>
-      </w:pPr>
-      <w:r>
-        <w:rPr>
-          <w:b/>
-          <w:bCs/>
-        </w:rPr>
-        <w:t>Puntuación</w:t>
-      </w:r>
-      <w:r>
-        <w:t>:</w:t>
-      </w:r>
-      <w:r>
-        <w:t xml:space="preserve"> “.” Para los atributos</w:t>
-      </w:r>
-    </w:p>
-    <w:p>
-      <w:r>
-        <w:t xml:space="preserve">● Los bloques de control deben respetar su formato </w:t>
-      </w:r>
-    </w:p>
-    <w:p>
-      <w:pPr>
-        <w:ind w:firstLine="708"/>
-      </w:pPr>
-      <w:r>
-        <w:t xml:space="preserve">○ WHEN &lt;condición&gt; DO &lt;acción&gt; END </w:t>
-      </w:r>
-    </w:p>
-    <w:p>
-      <w:pPr>
-        <w:ind w:left="708"/>
-      </w:pPr>
-      <w:r>
-        <w:t xml:space="preserve">○ EVERY &lt;tiempo&gt; DO &lt;acción&gt; END </w:t>
-      </w:r>
-    </w:p>
-    <w:p>
-      <w:pPr>
-        <w:ind w:left="708"/>
-      </w:pPr>
-      <w:r>
-        <w:t xml:space="preserve">○ &lt;acción&gt; puede ser una asignación o un condicional. </w:t>
-      </w:r>
-    </w:p>
-    <w:p>
-      <w:r>
-        <w:t xml:space="preserve">● Condicional ○ IF &lt;condición&gt; THEN &lt;acción&gt; ELSE &lt;acción&gt; </w:t>
-      </w:r>
-    </w:p>
-    <w:p>
-      <w:pPr>
-        <w:ind w:left="708"/>
-      </w:pPr>
-      <w:r>
-        <w:t xml:space="preserve">○ &lt;condición&gt; debe dar un resultado TRUE o FALSE, puede ser un booleano, una comparación, una negación (NOT) o varias condiciones agregadas con AND u OR. </w:t>
-      </w:r>
-    </w:p>
-    <w:p>
-      <w:pPr>
-        <w:ind w:left="708"/>
-      </w:pPr>
-      <w:r>
-        <w:t xml:space="preserve">○ &lt;acción&gt; puede ser una asignación o un condicional. </w:t>
-      </w:r>
-    </w:p>
-    <w:p>
-      <w:r>
-        <w:t>● Asignación</w:t>
-      </w:r>
-      <w:r>
-        <w:t>:</w:t>
-      </w:r>
-      <w:r>
-        <w:t xml:space="preserve">  </w:t>
-      </w:r>
-      <w:proofErr w:type="gramStart"/>
-      <w:r>
-        <w:t>dispositivo.atributo</w:t>
-      </w:r>
-      <w:proofErr w:type="gramEnd"/>
-      <w:r>
-        <w:t xml:space="preserve"> = valor </w:t>
-      </w:r>
-    </w:p>
-    <w:p>
-      <w:pPr>
         <w:jc w:val="both"/>
       </w:pPr>
-      <w:r>
-        <w:t xml:space="preserve">NT = {A, </w:t>
-      </w:r>
-      <w:r>
-        <w:t>ACCION</w:t>
-      </w:r>
-      <w:r>
-        <w:t xml:space="preserve">, </w:t>
-      </w:r>
-      <w:r>
-        <w:t>ACCIONES, BLOQUE_PRINCIPAL, BLOQUE_WHERE, BLOQUE_IF, BLOQUE_IF_ELSE, BLOQUE_EVERY, OPERADOR_LOGICO, OPERADOR_RELACIONAL,</w:t>
-      </w:r>
-      <w:r>
-        <w:rPr>
-          <w:rFonts w:ascii="Arial" w:hAnsi="Arial" w:cs="Arial"/>
-          <w:color w:val="36393F"/>
-        </w:rPr>
-        <w:t xml:space="preserve"> </w:t>
-      </w:r>
-      <w:r>
-        <w:t>EXPRESIONES</w:t>
-      </w:r>
-      <w:r>
-        <w:t xml:space="preserve">, NUMEROS, CADENAS, </w:t>
-      </w:r>
-      <w:r>
-        <w:t>ABRIR_PAR, CERRAR_PAR</w:t>
-      </w:r>
-      <w:r>
-        <w:t xml:space="preserve">, </w:t>
-      </w:r>
-      <w:r>
-        <w:t>COMILLAS</w:t>
-      </w:r>
-      <w:r>
-        <w:t>,</w:t>
-      </w:r>
-      <w:r>
-        <w:rPr>
-          <w:rFonts w:ascii="Arial" w:hAnsi="Arial" w:cs="Arial"/>
-          <w:color w:val="36393F"/>
-        </w:rPr>
-        <w:t xml:space="preserve"> </w:t>
-      </w:r>
-      <w:r>
-        <w:t>ASIGNACION</w:t>
-      </w:r>
-      <w:r>
-        <w:t>}</w:t>
-      </w:r>
-    </w:p>
-    <w:p>
-      <w:pPr>
-        <w:jc w:val="both"/>
-      </w:pPr>
-      <w:r>
-        <w:t xml:space="preserve">T = {BEGIN, WHEN, IF, THEN, ELSE, EVERY, DO, END, </w:t>
-      </w:r>
-      <w:r>
-        <w:t>sensor_temp</w:t>
-      </w:r>
-      <w:r>
-        <w:t xml:space="preserve">, </w:t>
-      </w:r>
-      <w:r>
-        <w:t>sensor_</w:t>
-      </w:r>
-      <w:r>
-        <w:t xml:space="preserve">humedad, </w:t>
-      </w:r>
-      <w:r>
-        <w:t>sensor_</w:t>
-      </w:r>
-      <w:r>
-        <w:t xml:space="preserve">humo, </w:t>
-      </w:r>
-      <w:r>
-        <w:t>sensor_</w:t>
-      </w:r>
-      <w:r>
-        <w:t xml:space="preserve">luz, </w:t>
-      </w:r>
-      <w:r>
-        <w:t>sensor_</w:t>
-      </w:r>
-      <w:r>
-        <w:t>movimiento</w:t>
-      </w:r>
-      <w:r>
-        <w:t xml:space="preserve">, </w:t>
-      </w:r>
-      <w:r>
-        <w:t>foco, aire, persiana, cerradura, reloj, altavoz, foco</w:t>
-      </w:r>
-      <w:r>
-        <w:t xml:space="preserve">, estado, brillo, color, modo, </w:t>
-      </w:r>
-      <w:proofErr w:type="spellStart"/>
-      <w:r>
-        <w:t>temp_obj</w:t>
-      </w:r>
-      <w:proofErr w:type="spellEnd"/>
-      <w:r>
-        <w:t xml:space="preserve">, </w:t>
-      </w:r>
-      <w:proofErr w:type="spellStart"/>
-      <w:r>
-        <w:t>temp_act</w:t>
-      </w:r>
-      <w:proofErr w:type="spellEnd"/>
-      <w:r>
-        <w:t xml:space="preserve">, posición, hora, fecha, volumen, mute, mensaje, </w:t>
-      </w:r>
-      <w:proofErr w:type="spellStart"/>
-      <w:r>
-        <w:t>emailnotif</w:t>
-      </w:r>
-      <w:proofErr w:type="spellEnd"/>
-      <w:r>
-        <w:t>, activada, ==</w:t>
-      </w:r>
-      <w:proofErr w:type="gramStart"/>
-      <w:r>
-        <w:t>, !</w:t>
-      </w:r>
-      <w:proofErr w:type="gramEnd"/>
-      <w:r>
-        <w:t>=, &gt;, &lt;, &gt;=, &lt;=, AND, OR, NOT, =, °, %, TRUE, FALSE, @, _</w:t>
-      </w:r>
-      <w:proofErr w:type="gramStart"/>
-      <w:r>
-        <w:t>, .</w:t>
-      </w:r>
-      <w:proofErr w:type="gramEnd"/>
-      <w:r>
-        <w:t xml:space="preserve">, </w:t>
-      </w:r>
-      <w:r>
-        <w:t>[“</w:t>
-      </w:r>
-      <w:proofErr w:type="gramStart"/>
-      <w:r>
-        <w:t>0..</w:t>
-      </w:r>
-      <w:proofErr w:type="gramEnd"/>
-      <w:r>
-        <w:t>9”]U[“</w:t>
-      </w:r>
-      <w:proofErr w:type="spellStart"/>
-      <w:proofErr w:type="gramStart"/>
-      <w:r>
-        <w:t>a..z</w:t>
-      </w:r>
-      <w:proofErr w:type="spellEnd"/>
-      <w:proofErr w:type="gramEnd"/>
-      <w:r>
-        <w:t>”]U[“</w:t>
-      </w:r>
-      <w:proofErr w:type="gramStart"/>
-      <w:r>
-        <w:t>A..Z</w:t>
-      </w:r>
-      <w:proofErr w:type="gramEnd"/>
-      <w:r>
-        <w:t>”]</w:t>
-      </w:r>
-      <w:r>
-        <w:t>}</w:t>
-      </w:r>
-    </w:p>
-    <w:p>
-      <w:pPr>
-        <w:jc w:val="both"/>
-      </w:pPr>
-      <w:r>
-        <w:t>Gramática</w:t>
-      </w:r>
-    </w:p>
-    <w:p>
-      <w:pPr>
-        <w:jc w:val="both"/>
-      </w:pPr>
-      <w:r>
-        <w:t>Σ → A</w:t>
-      </w:r>
-    </w:p>
-    <w:p>
-      <w:pPr>
-        <w:jc w:val="both"/>
-      </w:pPr>
-      <w:r>
-        <w:t xml:space="preserve">A → </w:t>
-      </w:r>
-      <w:r>
-        <w:t>BLOQUE_PRINCIPAL</w:t>
-      </w:r>
-    </w:p>
-    <w:p>
-      <w:pPr>
-        <w:jc w:val="both"/>
-      </w:pPr>
-      <w:r>
-        <w:t xml:space="preserve">BLOQUE_PRINCIPAL </w:t>
-      </w:r>
-      <w:r>
-        <w:t>→</w:t>
-      </w:r>
-      <w:r>
-        <w:t xml:space="preserve"> BEGIN ACCIONES END</w:t>
-      </w:r>
-    </w:p>
-    <w:p>
-      <w:pPr>
-        <w:jc w:val="both"/>
-      </w:pPr>
-      <w:r>
-        <w:lastRenderedPageBreak/>
-        <w:t>ACCIONES→</w:t>
-      </w:r>
-      <w:r>
-        <w:t xml:space="preserve"> </w:t>
-      </w:r>
-      <w:r>
-        <w:t>ACCION</w:t>
-      </w:r>
-      <w:r>
-        <w:rPr>
-          <w:rFonts w:ascii="Cambria Math" w:hAnsi="Cambria Math" w:cs="Cambria Math"/>
-        </w:rPr>
-        <w:t>∣</w:t>
-      </w:r>
-      <w:r>
-        <w:t>ACCION; ACCIONES</w:t>
-      </w:r>
-    </w:p>
-    <w:p>
-      <w:pPr>
-        <w:jc w:val="both"/>
-      </w:pPr>
-      <w:r>
-        <w:t xml:space="preserve">ACCIONES </w:t>
-      </w:r>
-      <w:r>
-        <w:t>→</w:t>
-      </w:r>
-      <w:r>
-        <w:t xml:space="preserve"> BLOQUE_WHEN</w:t>
-      </w:r>
-    </w:p>
-    <w:p>
-      <w:pPr>
-        <w:jc w:val="both"/>
-      </w:pPr>
-      <w:r>
-        <w:t xml:space="preserve">ACCIONES </w:t>
-      </w:r>
-      <w:r>
-        <w:t>→</w:t>
-      </w:r>
-      <w:r>
-        <w:t xml:space="preserve"> BLOQUE_IF</w:t>
-      </w:r>
-    </w:p>
-    <w:p>
-      <w:pPr>
-        <w:jc w:val="both"/>
-      </w:pPr>
-      <w:r>
-        <w:t xml:space="preserve">ACCIONES </w:t>
-      </w:r>
-      <w:r>
-        <w:t>→</w:t>
-      </w:r>
-      <w:r>
-        <w:t xml:space="preserve"> BLOQUE_IF_ELSE</w:t>
-      </w:r>
-    </w:p>
-    <w:p>
-      <w:pPr>
-        <w:jc w:val="both"/>
-      </w:pPr>
-      <w:r>
-        <w:t xml:space="preserve">ACCIONES </w:t>
-      </w:r>
-      <w:r>
-        <w:t>→</w:t>
-      </w:r>
-      <w:r>
-        <w:t xml:space="preserve"> BLOQUE_EVERY</w:t>
-      </w:r>
-    </w:p>
-    <w:p>
-      <w:pPr>
-        <w:jc w:val="both"/>
-      </w:pPr>
-      <w:r>
-        <w:t xml:space="preserve">BLOQUE_WHEN </w:t>
-      </w:r>
-      <w:r>
-        <w:t>→</w:t>
-      </w:r>
-      <w:r>
-        <w:t xml:space="preserve"> WHEN </w:t>
-      </w:r>
-      <w:r>
-        <w:t>EXPRESIONES</w:t>
-      </w:r>
-      <w:r>
-        <w:t xml:space="preserve"> DO ACCIONES END</w:t>
-      </w:r>
-    </w:p>
-    <w:p>
-      <w:pPr>
-        <w:jc w:val="both"/>
-      </w:pPr>
-      <w:r>
-        <w:t>BLOQUE_</w:t>
-      </w:r>
-      <w:r>
-        <w:t xml:space="preserve"> </w:t>
-      </w:r>
-      <w:r>
-        <w:t>IF</w:t>
-      </w:r>
-      <w:r>
-        <w:t xml:space="preserve"> →</w:t>
-      </w:r>
-      <w:r>
-        <w:t xml:space="preserve"> IF</w:t>
-      </w:r>
-      <w:r>
-        <w:t xml:space="preserve"> EXPRESIONES</w:t>
-      </w:r>
-      <w:r>
-        <w:t xml:space="preserve"> THEN ACCIONES END</w:t>
-      </w:r>
-    </w:p>
-    <w:p>
-      <w:pPr>
-        <w:jc w:val="both"/>
-      </w:pPr>
-      <w:r>
-        <w:t xml:space="preserve">BLOQUE_IF_ELSE </w:t>
-      </w:r>
-      <w:r>
-        <w:t>→</w:t>
-      </w:r>
-      <w:r>
-        <w:t xml:space="preserve"> IF</w:t>
-      </w:r>
-      <w:r>
-        <w:t xml:space="preserve"> EXPRESIONES</w:t>
-      </w:r>
-      <w:r>
-        <w:t xml:space="preserve"> THEN ACCIONES ELSE ACCIONES END</w:t>
-      </w:r>
-    </w:p>
-    <w:p>
-      <w:pPr>
-        <w:jc w:val="both"/>
-      </w:pPr>
-      <w:r>
-        <w:t>BLOQUE_EVERY</w:t>
-      </w:r>
-      <w:r>
-        <w:t xml:space="preserve"> →</w:t>
-      </w:r>
-      <w:r>
-        <w:t xml:space="preserve"> EVERY</w:t>
-      </w:r>
-      <w:r>
-        <w:t xml:space="preserve"> EXPRESIONES</w:t>
-      </w:r>
-      <w:r>
-        <w:t xml:space="preserve"> DO ACCIONES END</w:t>
-      </w:r>
     </w:p>
     <w:p>
       <w:pPr>
@@ -3873,6 +2037,95 @@
     </w:lvl>
   </w:abstractNum>
   <w:abstractNum w:abstractNumId="2" w15:restartNumberingAfterBreak="0">
+    <w:nsid w:val="507018E4"/>
+    <w:multiLevelType w:val="hybridMultilevel"/>
+    <w:tmpl w:val="66065AC0"/>
+    <w:lvl w:ilvl="0" w:tplc="2C0A000F">
+      <w:start w:val="1"/>
+      <w:numFmt w:val="decimal"/>
+      <w:lvlText w:val="%1."/>
+      <w:lvlJc w:val="left"/>
+      <w:pPr>
+        <w:ind w:left="720" w:hanging="360"/>
+      </w:pPr>
+      <w:rPr>
+        <w:rFonts w:hint="default"/>
+      </w:rPr>
+    </w:lvl>
+    <w:lvl w:ilvl="1" w:tplc="2C0A0019">
+      <w:start w:val="1"/>
+      <w:numFmt w:val="lowerLetter"/>
+      <w:lvlText w:val="%2."/>
+      <w:lvlJc w:val="left"/>
+      <w:pPr>
+        <w:ind w:left="1440" w:hanging="360"/>
+      </w:pPr>
+    </w:lvl>
+    <w:lvl w:ilvl="2" w:tplc="2C0A001B" w:tentative="1">
+      <w:start w:val="1"/>
+      <w:numFmt w:val="lowerRoman"/>
+      <w:lvlText w:val="%3."/>
+      <w:lvlJc w:val="right"/>
+      <w:pPr>
+        <w:ind w:left="2160" w:hanging="180"/>
+      </w:pPr>
+    </w:lvl>
+    <w:lvl w:ilvl="3" w:tplc="2C0A000F" w:tentative="1">
+      <w:start w:val="1"/>
+      <w:numFmt w:val="decimal"/>
+      <w:lvlText w:val="%4."/>
+      <w:lvlJc w:val="left"/>
+      <w:pPr>
+        <w:ind w:left="2880" w:hanging="360"/>
+      </w:pPr>
+    </w:lvl>
+    <w:lvl w:ilvl="4" w:tplc="2C0A0019" w:tentative="1">
+      <w:start w:val="1"/>
+      <w:numFmt w:val="lowerLetter"/>
+      <w:lvlText w:val="%5."/>
+      <w:lvlJc w:val="left"/>
+      <w:pPr>
+        <w:ind w:left="3600" w:hanging="360"/>
+      </w:pPr>
+    </w:lvl>
+    <w:lvl w:ilvl="5" w:tplc="2C0A001B" w:tentative="1">
+      <w:start w:val="1"/>
+      <w:numFmt w:val="lowerRoman"/>
+      <w:lvlText w:val="%6."/>
+      <w:lvlJc w:val="right"/>
+      <w:pPr>
+        <w:ind w:left="4320" w:hanging="180"/>
+      </w:pPr>
+    </w:lvl>
+    <w:lvl w:ilvl="6" w:tplc="2C0A000F" w:tentative="1">
+      <w:start w:val="1"/>
+      <w:numFmt w:val="decimal"/>
+      <w:lvlText w:val="%7."/>
+      <w:lvlJc w:val="left"/>
+      <w:pPr>
+        <w:ind w:left="5040" w:hanging="360"/>
+      </w:pPr>
+    </w:lvl>
+    <w:lvl w:ilvl="7" w:tplc="2C0A0019" w:tentative="1">
+      <w:start w:val="1"/>
+      <w:numFmt w:val="lowerLetter"/>
+      <w:lvlText w:val="%8."/>
+      <w:lvlJc w:val="left"/>
+      <w:pPr>
+        <w:ind w:left="5760" w:hanging="360"/>
+      </w:pPr>
+    </w:lvl>
+    <w:lvl w:ilvl="8" w:tplc="2C0A001B" w:tentative="1">
+      <w:start w:val="1"/>
+      <w:numFmt w:val="lowerRoman"/>
+      <w:lvlText w:val="%9."/>
+      <w:lvlJc w:val="right"/>
+      <w:pPr>
+        <w:ind w:left="6480" w:hanging="180"/>
+      </w:pPr>
+    </w:lvl>
+  </w:abstractNum>
+  <w:abstractNum w:abstractNumId="3" w15:restartNumberingAfterBreak="0">
     <w:nsid w:val="6A3C42C9"/>
     <w:multiLevelType w:val="hybridMultilevel"/>
     <w:tmpl w:val="6032CEFA"/>
@@ -3991,6 +2244,9 @@
     <w:abstractNumId w:val="0"/>
   </w:num>
   <w:num w:numId="3" w16cid:durableId="98641739">
+    <w:abstractNumId w:val="3"/>
+  </w:num>
+  <w:num w:numId="4" w16cid:durableId="2080009928">
     <w:abstractNumId w:val="2"/>
   </w:num>
 </w:numbering>
@@ -4597,6 +2853,7 @@
   <w:style w:type="character" w:default="1" w:styleId="Fuentedeprrafopredeter">
     <w:name w:val="Default Paragraph Font"/>
     <w:uiPriority w:val="1"/>
+    <w:semiHidden/>
     <w:unhideWhenUsed/>
   </w:style>
   <w:style w:type="table" w:default="1" w:styleId="Tablanormal">

</xml_diff>